<commit_message>
feat: migraciones (D-77), plazos configurables en el panel y la suscripcion (D-78, CONTRATO §18), renumeracion por rama (D-79) y terminos de tres documentos
Incluye npm run migrar, las migraciones en el reseteo de pruebas y en el hook (que ahora prueba de verdad el esquema del indice), las baterias D-78 y D-79, y la propuesta de fecha que responde 422 para una prueba que termino sin pago.
</commit_message>
<xml_diff>
--- a/docs/07 - Alcance despues del MVP.docx
+++ b/docs/07 - Alcance despues del MVP.docx
@@ -285,7 +285,7 @@
                 <w:sz w:val="18"/>
                 <w:szCs w:val="18"/>
               </w:rPr>
-              <w:t xml:space="preserve">Módulo 0 construido y probado; pendiente de integrar en la API</w:t>
+              <w:t xml:space="preserve">Módulo 0 construido y probado, pendiente de integrar en la API. Módulo 1 (programación) con requisitos en definición</w:t>
             </w:r>
           </w:p>
         </w:tc>
@@ -874,7 +874,7 @@
                 <w:sz w:val="18"/>
                 <w:szCs w:val="18"/>
               </w:rPr>
-              <w:t xml:space="preserve">Sale del 03 como exclusión; entra como módulo 1.</w:t>
+              <w:t xml:space="preserve">Sale del 03 como exclusión; entra como módulo 1 (capítulo 6).</w:t>
             </w:r>
           </w:p>
         </w:tc>
@@ -5870,6 +5870,4361 @@
           <w:szCs w:val="21"/>
         </w:rPr>
         <w:t xml:space="preserve">Publicar la versión de los términos que ya tiene escrito el plazo de reactivación.</w:t>
+      </w:r>
+    </w:p>
+    <w:p>
+      <w:r>
+        <w:br w:type="page"/>
+      </w:r>
+    </w:p>
+    <w:p>
+      <w:pPr>
+        <w:pStyle w:val="Heading1"/>
+        <w:spacing w:after="160" w:before="360"/>
+      </w:pPr>
+      <w:r>
+        <w:rPr>
+          <w:rFonts w:ascii="Calibri" w:cs="Calibri" w:eastAsia="Calibri" w:hAnsi="Calibri"/>
+          <w:b/>
+          <w:bCs/>
+          <w:color w:val="13496B"/>
+          <w:sz w:val="30"/>
+          <w:szCs w:val="30"/>
+        </w:rPr>
+        <w:t xml:space="preserve">6. Módulo 1: programación de obra</w:t>
+      </w:r>
+    </w:p>
+    <w:p>
+      <w:pPr>
+        <w:spacing w:after="140" w:line="288"/>
+      </w:pPr>
+      <w:r>
+        <w:rPr>
+          <w:rFonts w:ascii="Calibri" w:cs="Calibri" w:eastAsia="Calibri" w:hAnsi="Calibri"/>
+          <w:b/>
+          <w:bCs/>
+          <w:color w:val="1F2933"/>
+          <w:sz w:val="21"/>
+          <w:szCs w:val="21"/>
+        </w:rPr>
+        <w:t xml:space="preserve">Estado: requisitos en definición (14 de octubre de 2026).</w:t>
+      </w:r>
+      <w:r>
+        <w:rPr>
+          <w:rFonts w:ascii="Calibri" w:cs="Calibri" w:eastAsia="Calibri" w:hAnsi="Calibri"/>
+          <w:color w:val="1F2933"/>
+          <w:sz w:val="21"/>
+          <w:szCs w:val="21"/>
+        </w:rPr>
+        <w:t xml:space="preserve"> Todo lo que sigue salió de preguntas y respuestas con el dueño del producto; lo que todavía no tiene respuesta está marcado como pendiente en la sección 6.9 y no se construye hasta tenerla.</w:t>
+      </w:r>
+    </w:p>
+    <w:p>
+      <w:pPr>
+        <w:spacing w:after="140" w:line="288"/>
+      </w:pPr>
+      <w:r>
+        <w:rPr>
+          <w:rFonts w:ascii="Calibri" w:cs="Calibri" w:eastAsia="Calibri" w:hAnsi="Calibri"/>
+          <w:b/>
+          <w:bCs/>
+          <w:color w:val="1F2933"/>
+          <w:sz w:val="21"/>
+          <w:szCs w:val="21"/>
+        </w:rPr>
+        <w:t xml:space="preserve">Objetivo:</w:t>
+      </w:r>
+      <w:r>
+        <w:rPr>
+          <w:rFonts w:ascii="Calibri" w:cs="Calibri" w:eastAsia="Calibri" w:hAnsi="Calibri"/>
+          <w:color w:val="1F2933"/>
+          <w:sz w:val="21"/>
+          <w:szCs w:val="21"/>
+        </w:rPr>
+        <w:t xml:space="preserve"> saber cuánto va a durar una obra concreta y cómo se reparte su costo en el tiempo. El promedio de duración entre obras no es objetivo de este módulo: necesita fechas reales, que llegan con el control de proyectos.</w:t>
+      </w:r>
+    </w:p>
+    <w:tbl>
+      <w:tblPr>
+        <w:tblW w:type="dxa" w:w="9360"/>
+        <w:tblBorders>
+          <w:top w:val="none" w:color="FFFFFF" w:sz="0"/>
+          <w:left w:val="single" w:color="B07A22" w:sz="18"/>
+          <w:bottom w:val="none" w:color="FFFFFF" w:sz="0"/>
+          <w:right w:val="none" w:color="FFFFFF" w:sz="0"/>
+          <w:insideH w:val="none" w:color="FFFFFF" w:sz="0"/>
+          <w:insideV w:val="none" w:color="FFFFFF" w:sz="0"/>
+        </w:tblBorders>
+      </w:tblPr>
+      <w:tblGrid>
+        <w:gridCol w:w="9360"/>
+      </w:tblGrid>
+      <w:tr>
+        <w:trPr>
+          <w:cantSplit/>
+        </w:trPr>
+        <w:tc>
+          <w:tcPr>
+            <w:tcW w:type="dxa" w:w="9360"/>
+            <w:shd w:fill="FBF5E9" w:color="auto" w:val="clear"/>
+            <w:tcMar>
+              <w:top w:type="dxa" w:w="140"/>
+              <w:left w:type="dxa" w:w="200"/>
+              <w:bottom w:type="dxa" w:w="140"/>
+              <w:right w:type="dxa" w:w="200"/>
+            </w:tcMar>
+          </w:tcPr>
+          <w:p>
+            <w:pPr>
+              <w:spacing w:after="80"/>
+            </w:pPr>
+            <w:r>
+              <w:rPr>
+                <w:rFonts w:ascii="Calibri" w:cs="Calibri" w:eastAsia="Calibri" w:hAnsi="Calibri"/>
+                <w:b/>
+                <w:bCs/>
+                <w:color w:val="B07A22"/>
+                <w:sz w:val="17"/>
+                <w:szCs w:val="17"/>
+              </w:rPr>
+              <w:t xml:space="preserve">LO QUE EL MÓDULO NO HACE</w:t>
+            </w:r>
+          </w:p>
+          <w:p>
+            <w:pPr>
+              <w:spacing w:after="80" w:line="276"/>
+            </w:pPr>
+            <w:r>
+              <w:rPr>
+                <w:rFonts w:ascii="Calibri" w:cs="Calibri" w:eastAsia="Calibri" w:hAnsi="Calibri"/>
+                <w:color w:val="1F2933"/>
+                <w:sz w:val="20"/>
+                <w:szCs w:val="20"/>
+              </w:rPr>
+              <w:t xml:space="preserve">No modifica el presupuesto. Lee cantidades, rendimientos y costos y nunca escribe en ellos: si la obra se alarga y la administración debería subir, lo avisa, y el ingeniero decide.</w:t>
+            </w:r>
+          </w:p>
+          <w:p>
+            <w:pPr>
+              <w:spacing w:after="80" w:line="276"/>
+            </w:pPr>
+            <w:r>
+              <w:rPr>
+                <w:rFonts w:ascii="Calibri" w:cs="Calibri" w:eastAsia="Calibri" w:hAnsi="Calibri"/>
+                <w:color w:val="1F2933"/>
+                <w:sz w:val="20"/>
+                <w:szCs w:val="20"/>
+              </w:rPr>
+              <w:t xml:space="preserve">No registra avance real. La «fecha de corte» existe desde ya con ese nombre, pero en esta versión es la fecha de hoy.</w:t>
+            </w:r>
+          </w:p>
+        </w:tc>
+      </w:tr>
+    </w:tbl>
+    <w:p>
+      <w:pPr>
+        <w:spacing w:after="120"/>
+      </w:pPr>
+    </w:p>
+    <w:p>
+      <w:pPr>
+        <w:pStyle w:val="Heading2"/>
+        <w:spacing w:after="120" w:before="240"/>
+      </w:pPr>
+      <w:r>
+        <w:rPr>
+          <w:rFonts w:ascii="Calibri" w:cs="Calibri" w:eastAsia="Calibri" w:hAnsi="Calibri"/>
+          <w:b/>
+          <w:bCs/>
+          <w:color w:val="13496B"/>
+          <w:sz w:val="23"/>
+          <w:szCs w:val="23"/>
+        </w:rPr>
+        <w:t xml:space="preserve">6.1 Cómo se calcula la duración</w:t>
+      </w:r>
+    </w:p>
+    <w:p>
+      <w:pPr>
+        <w:spacing w:after="140" w:line="288"/>
+      </w:pPr>
+      <w:r>
+        <w:rPr>
+          <w:rFonts w:ascii="Calibri" w:cs="Calibri" w:eastAsia="Calibri" w:hAnsi="Calibri"/>
+          <w:color w:val="1F2933"/>
+          <w:sz w:val="21"/>
+          <w:szCs w:val="21"/>
+        </w:rPr>
+        <w:t xml:space="preserve">Una actividad del presupuesto dura lo que tarda su cuadrilla en hacer la cantidad presupuestada. La cuadrilla es una unidad: el rendimiento de la mano de obra es tiempo de la cuadrilla completa por unidad de actividad, sin importar cuántas personas tenga.</w:t>
+      </w:r>
+    </w:p>
+    <w:tbl>
+      <w:tblPr>
+        <w:tblW w:type="dxa" w:w="9360"/>
+        <w:tblBorders>
+          <w:top w:val="single" w:color="E4E8EC" w:sz="2"/>
+          <w:left w:val="none" w:color="FFFFFF" w:sz="0"/>
+          <w:bottom w:val="single" w:color="E4E8EC" w:sz="2"/>
+          <w:right w:val="none" w:color="FFFFFF" w:sz="0"/>
+          <w:insideH w:val="single" w:color="E4E8EC" w:sz="2"/>
+          <w:insideV w:val="none" w:color="FFFFFF" w:sz="0"/>
+        </w:tblBorders>
+      </w:tblPr>
+      <w:tblGrid>
+        <w:gridCol w:w="2600"/>
+        <w:gridCol w:w="6760"/>
+      </w:tblGrid>
+      <w:tr>
+        <w:trPr>
+          <w:tblHeader/>
+        </w:trPr>
+        <w:tc>
+          <w:tcPr>
+            <w:tcW w:type="dxa" w:w="2600"/>
+            <w:shd w:fill="13496B" w:color="auto" w:val="clear"/>
+            <w:tcMar>
+              <w:top w:type="dxa" w:w="70"/>
+              <w:left w:type="dxa" w:w="110"/>
+              <w:bottom w:type="dxa" w:w="70"/>
+              <w:right w:type="dxa" w:w="110"/>
+            </w:tcMar>
+          </w:tcPr>
+          <w:p>
+            <w:pPr>
+              <w:spacing w:after="30"/>
+            </w:pPr>
+            <w:r>
+              <w:rPr>
+                <w:rFonts w:ascii="Calibri" w:cs="Calibri" w:eastAsia="Calibri" w:hAnsi="Calibri"/>
+                <w:b/>
+                <w:bCs/>
+                <w:color w:val="FFFFFF"/>
+                <w:sz w:val="18"/>
+                <w:szCs w:val="18"/>
+              </w:rPr>
+              <w:t xml:space="preserve">Dato</w:t>
+            </w:r>
+          </w:p>
+        </w:tc>
+        <w:tc>
+          <w:tcPr>
+            <w:tcW w:type="dxa" w:w="6760"/>
+            <w:shd w:fill="13496B" w:color="auto" w:val="clear"/>
+            <w:tcMar>
+              <w:top w:type="dxa" w:w="70"/>
+              <w:left w:type="dxa" w:w="110"/>
+              <w:bottom w:type="dxa" w:w="70"/>
+              <w:right w:type="dxa" w:w="110"/>
+            </w:tcMar>
+          </w:tcPr>
+          <w:p>
+            <w:pPr>
+              <w:spacing w:after="30"/>
+            </w:pPr>
+            <w:r>
+              <w:rPr>
+                <w:rFonts w:ascii="Calibri" w:cs="Calibri" w:eastAsia="Calibri" w:hAnsi="Calibri"/>
+                <w:b/>
+                <w:bCs/>
+                <w:color w:val="FFFFFF"/>
+                <w:sz w:val="18"/>
+                <w:szCs w:val="18"/>
+              </w:rPr>
+              <w:t xml:space="preserve">De dónde sale</w:t>
+            </w:r>
+          </w:p>
+        </w:tc>
+      </w:tr>
+      <w:tr>
+        <w:trPr>
+          <w:cantSplit/>
+        </w:trPr>
+        <w:tc>
+          <w:tcPr>
+            <w:tcW w:type="dxa" w:w="2600"/>
+            <w:tcMar>
+              <w:top w:type="dxa" w:w="70"/>
+              <w:left w:type="dxa" w:w="110"/>
+              <w:bottom w:type="dxa" w:w="70"/>
+              <w:right w:type="dxa" w:w="110"/>
+            </w:tcMar>
+          </w:tcPr>
+          <w:p>
+            <w:pPr>
+              <w:spacing w:after="30"/>
+            </w:pPr>
+            <w:r>
+              <w:rPr>
+                <w:rFonts w:ascii="Calibri" w:cs="Calibri" w:eastAsia="Calibri" w:hAnsi="Calibri"/>
+                <w:color w:val="1F2933"/>
+                <w:sz w:val="18"/>
+                <w:szCs w:val="18"/>
+              </w:rPr>
+              <w:t xml:space="preserve">Horas de la actividad</w:t>
+            </w:r>
+          </w:p>
+        </w:tc>
+        <w:tc>
+          <w:tcPr>
+            <w:tcW w:type="dxa" w:w="6760"/>
+            <w:tcMar>
+              <w:top w:type="dxa" w:w="70"/>
+              <w:left w:type="dxa" w:w="110"/>
+              <w:bottom w:type="dxa" w:w="70"/>
+              <w:right w:type="dxa" w:w="110"/>
+            </w:tcMar>
+          </w:tcPr>
+          <w:p>
+            <w:pPr>
+              <w:spacing w:after="30"/>
+            </w:pPr>
+            <w:r>
+              <w:rPr>
+                <w:rFonts w:ascii="Calibri" w:cs="Calibri" w:eastAsia="Calibri" w:hAnsi="Calibri"/>
+                <w:b/>
+                <w:bCs/>
+                <w:color w:val="1F2933"/>
+                <w:sz w:val="18"/>
+                <w:szCs w:val="18"/>
+              </w:rPr>
+              <w:t xml:space="preserve">cantidad × rendimiento × horas por jornal ÷ cuadrillas</w:t>
+            </w:r>
+            <w:r>
+              <w:rPr>
+                <w:rFonts w:ascii="Calibri" w:cs="Calibri" w:eastAsia="Calibri" w:hAnsi="Calibri"/>
+                <w:color w:val="1F2933"/>
+                <w:sz w:val="18"/>
+                <w:szCs w:val="18"/>
+              </w:rPr>
+              <w:t xml:space="preserve">, con el rendimiento en jornales. Si el rendimiento está en horas, no se multiplica por las horas por jornal.</w:t>
+            </w:r>
+          </w:p>
+        </w:tc>
+      </w:tr>
+      <w:tr>
+        <w:trPr>
+          <w:cantSplit/>
+        </w:trPr>
+        <w:tc>
+          <w:tcPr>
+            <w:tcW w:type="dxa" w:w="2600"/>
+            <w:shd w:fill="F7F9FA" w:color="auto" w:val="clear"/>
+            <w:tcMar>
+              <w:top w:type="dxa" w:w="70"/>
+              <w:left w:type="dxa" w:w="110"/>
+              <w:bottom w:type="dxa" w:w="70"/>
+              <w:right w:type="dxa" w:w="110"/>
+            </w:tcMar>
+          </w:tcPr>
+          <w:p>
+            <w:pPr>
+              <w:spacing w:after="30"/>
+            </w:pPr>
+            <w:r>
+              <w:rPr>
+                <w:rFonts w:ascii="Calibri" w:cs="Calibri" w:eastAsia="Calibri" w:hAnsi="Calibri"/>
+                <w:color w:val="1F2933"/>
+                <w:sz w:val="18"/>
+                <w:szCs w:val="18"/>
+              </w:rPr>
+              <w:t xml:space="preserve">Línea que gobierna</w:t>
+            </w:r>
+          </w:p>
+        </w:tc>
+        <w:tc>
+          <w:tcPr>
+            <w:tcW w:type="dxa" w:w="6760"/>
+            <w:shd w:fill="F7F9FA" w:color="auto" w:val="clear"/>
+            <w:tcMar>
+              <w:top w:type="dxa" w:w="70"/>
+              <w:left w:type="dxa" w:w="110"/>
+              <w:bottom w:type="dxa" w:w="70"/>
+              <w:right w:type="dxa" w:w="110"/>
+            </w:tcMar>
+          </w:tcPr>
+          <w:p>
+            <w:pPr>
+              <w:spacing w:after="30"/>
+            </w:pPr>
+            <w:r>
+              <w:rPr>
+                <w:rFonts w:ascii="Calibri" w:cs="Calibri" w:eastAsia="Calibri" w:hAnsi="Calibri"/>
+                <w:color w:val="1F2933"/>
+                <w:sz w:val="18"/>
+                <w:szCs w:val="18"/>
+              </w:rPr>
+              <w:t xml:space="preserve">La línea de personal del APU con más tiempo por unidad (la más lenta). Si el APU no tiene personal, la de equipo con más tiempo. Si tampoco hay equipo con rendimiento en tiempo, la duración se escribe a mano.</w:t>
+            </w:r>
+          </w:p>
+        </w:tc>
+      </w:tr>
+      <w:tr>
+        <w:trPr>
+          <w:cantSplit/>
+        </w:trPr>
+        <w:tc>
+          <w:tcPr>
+            <w:tcW w:type="dxa" w:w="2600"/>
+            <w:tcMar>
+              <w:top w:type="dxa" w:w="70"/>
+              <w:left w:type="dxa" w:w="110"/>
+              <w:bottom w:type="dxa" w:w="70"/>
+              <w:right w:type="dxa" w:w="110"/>
+            </w:tcMar>
+          </w:tcPr>
+          <w:p>
+            <w:pPr>
+              <w:spacing w:after="30"/>
+            </w:pPr>
+            <w:r>
+              <w:rPr>
+                <w:rFonts w:ascii="Calibri" w:cs="Calibri" w:eastAsia="Calibri" w:hAnsi="Calibri"/>
+                <w:color w:val="1F2933"/>
+                <w:sz w:val="18"/>
+                <w:szCs w:val="18"/>
+              </w:rPr>
+              <w:t xml:space="preserve">Actividad a todo costo</w:t>
+            </w:r>
+          </w:p>
+        </w:tc>
+        <w:tc>
+          <w:tcPr>
+            <w:tcW w:type="dxa" w:w="6760"/>
+            <w:tcMar>
+              <w:top w:type="dxa" w:w="70"/>
+              <w:left w:type="dxa" w:w="110"/>
+              <w:bottom w:type="dxa" w:w="70"/>
+              <w:right w:type="dxa" w:w="110"/>
+            </w:tcMar>
+          </w:tcPr>
+          <w:p>
+            <w:pPr>
+              <w:spacing w:after="30"/>
+            </w:pPr>
+            <w:r>
+              <w:rPr>
+                <w:rFonts w:ascii="Calibri" w:cs="Calibri" w:eastAsia="Calibri" w:hAnsi="Calibri"/>
+                <w:color w:val="1F2933"/>
+                <w:sz w:val="18"/>
+                <w:szCs w:val="18"/>
+              </w:rPr>
+              <w:t xml:space="preserve">Duración manual obligatoria: el subcontrato no trae rendimientos.</w:t>
+            </w:r>
+          </w:p>
+        </w:tc>
+      </w:tr>
+      <w:tr>
+        <w:trPr>
+          <w:cantSplit/>
+        </w:trPr>
+        <w:tc>
+          <w:tcPr>
+            <w:tcW w:type="dxa" w:w="2600"/>
+            <w:shd w:fill="F7F9FA" w:color="auto" w:val="clear"/>
+            <w:tcMar>
+              <w:top w:type="dxa" w:w="70"/>
+              <w:left w:type="dxa" w:w="110"/>
+              <w:bottom w:type="dxa" w:w="70"/>
+              <w:right w:type="dxa" w:w="110"/>
+            </w:tcMar>
+          </w:tcPr>
+          <w:p>
+            <w:pPr>
+              <w:spacing w:after="30"/>
+            </w:pPr>
+            <w:r>
+              <w:rPr>
+                <w:rFonts w:ascii="Calibri" w:cs="Calibri" w:eastAsia="Calibri" w:hAnsi="Calibri"/>
+                <w:color w:val="1F2933"/>
+                <w:sz w:val="18"/>
+                <w:szCs w:val="18"/>
+              </w:rPr>
+              <w:t xml:space="preserve">Cuadrillas</w:t>
+            </w:r>
+          </w:p>
+        </w:tc>
+        <w:tc>
+          <w:tcPr>
+            <w:tcW w:type="dxa" w:w="6760"/>
+            <w:shd w:fill="F7F9FA" w:color="auto" w:val="clear"/>
+            <w:tcMar>
+              <w:top w:type="dxa" w:w="70"/>
+              <w:left w:type="dxa" w:w="110"/>
+              <w:bottom w:type="dxa" w:w="70"/>
+              <w:right w:type="dxa" w:w="110"/>
+            </w:tcMar>
+          </w:tcPr>
+          <w:p>
+            <w:pPr>
+              <w:spacing w:after="30"/>
+            </w:pPr>
+            <w:r>
+              <w:rPr>
+                <w:rFonts w:ascii="Calibri" w:cs="Calibri" w:eastAsia="Calibri" w:hAnsi="Calibri"/>
+                <w:color w:val="1F2933"/>
+                <w:sz w:val="18"/>
+                <w:szCs w:val="18"/>
+              </w:rPr>
+              <w:t xml:space="preserve">Las fija el usuario por actividad (1 por defecto). Es la palanca para acortar.</w:t>
+            </w:r>
+          </w:p>
+        </w:tc>
+      </w:tr>
+      <w:tr>
+        <w:trPr>
+          <w:cantSplit/>
+        </w:trPr>
+        <w:tc>
+          <w:tcPr>
+            <w:tcW w:type="dxa" w:w="2600"/>
+            <w:tcMar>
+              <w:top w:type="dxa" w:w="70"/>
+              <w:left w:type="dxa" w:w="110"/>
+              <w:bottom w:type="dxa" w:w="70"/>
+              <w:right w:type="dxa" w:w="110"/>
+            </w:tcMar>
+          </w:tcPr>
+          <w:p>
+            <w:pPr>
+              <w:spacing w:after="30"/>
+            </w:pPr>
+            <w:r>
+              <w:rPr>
+                <w:rFonts w:ascii="Calibri" w:cs="Calibri" w:eastAsia="Calibri" w:hAnsi="Calibri"/>
+                <w:color w:val="1F2933"/>
+                <w:sz w:val="18"/>
+                <w:szCs w:val="18"/>
+              </w:rPr>
+              <w:t xml:space="preserve">Duración manual</w:t>
+            </w:r>
+          </w:p>
+        </w:tc>
+        <w:tc>
+          <w:tcPr>
+            <w:tcW w:type="dxa" w:w="6760"/>
+            <w:tcMar>
+              <w:top w:type="dxa" w:w="70"/>
+              <w:left w:type="dxa" w:w="110"/>
+              <w:bottom w:type="dxa" w:w="70"/>
+              <w:right w:type="dxa" w:w="110"/>
+            </w:tcMar>
+          </w:tcPr>
+          <w:p>
+            <w:pPr>
+              <w:spacing w:after="30"/>
+            </w:pPr>
+            <w:r>
+              <w:rPr>
+                <w:rFonts w:ascii="Calibri" w:cs="Calibri" w:eastAsia="Calibri" w:hAnsi="Calibri"/>
+                <w:color w:val="1F2933"/>
+                <w:sz w:val="18"/>
+                <w:szCs w:val="18"/>
+              </w:rPr>
+              <w:t xml:space="preserve">Si el usuario la escribe, manda. La calculada se sigue recalculando y se muestran las dos.</w:t>
+            </w:r>
+          </w:p>
+        </w:tc>
+      </w:tr>
+    </w:tbl>
+    <w:p>
+      <w:pPr>
+        <w:spacing w:after="120"/>
+      </w:pPr>
+    </w:p>
+    <w:p>
+      <w:pPr>
+        <w:spacing w:after="140" w:line="288"/>
+      </w:pPr>
+      <w:r>
+        <w:rPr>
+          <w:rFonts w:ascii="Calibri" w:cs="Calibri" w:eastAsia="Calibri" w:hAnsi="Calibri"/>
+          <w:color w:val="1F2933"/>
+          <w:sz w:val="21"/>
+          <w:szCs w:val="21"/>
+        </w:rPr>
+        <w:t xml:space="preserve">Supuesto que se declara y no se esconde: una hora rinde lo mismo en una jornada de 8 que en una de 10. En la práctica las jornadas largas rinden menos por hora; P6 y Project hacen la misma simplificación.</w:t>
+      </w:r>
+    </w:p>
+    <w:p>
+      <w:pPr>
+        <w:pStyle w:val="Heading2"/>
+        <w:spacing w:after="120" w:before="240"/>
+      </w:pPr>
+      <w:r>
+        <w:rPr>
+          <w:rFonts w:ascii="Calibri" w:cs="Calibri" w:eastAsia="Calibri" w:hAnsi="Calibri"/>
+          <w:b/>
+          <w:bCs/>
+          <w:color w:val="13496B"/>
+          <w:sz w:val="23"/>
+          <w:szCs w:val="23"/>
+        </w:rPr>
+        <w:t xml:space="preserve">6.2 Calendarios</w:t>
+      </w:r>
+    </w:p>
+    <w:p>
+      <w:pPr>
+        <w:pStyle w:val="ListParagraph"/>
+        <w:numPr>
+          <w:ilvl w:val="0"/>
+          <w:numId w:val="2"/>
+        </w:numPr>
+        <w:spacing w:after="80" w:line="276"/>
+      </w:pPr>
+      <w:r>
+        <w:rPr>
+          <w:rFonts w:ascii="Calibri" w:cs="Calibri" w:eastAsia="Calibri" w:hAnsi="Calibri"/>
+          <w:color w:val="1F2933"/>
+          <w:sz w:val="21"/>
+          <w:szCs w:val="21"/>
+        </w:rPr>
+        <w:t xml:space="preserve">El motor calcula en minutos. Los «días» de la pantalla son una conversión: horas ÷ el factor «1 día = X h» de cada calendario, que se ve en pantalla y es editable.</w:t>
+      </w:r>
+    </w:p>
+    <w:p>
+      <w:pPr>
+        <w:pStyle w:val="ListParagraph"/>
+        <w:numPr>
+          <w:ilvl w:val="0"/>
+          <w:numId w:val="2"/>
+        </w:numPr>
+        <w:spacing w:after="80" w:line="276"/>
+      </w:pPr>
+      <w:r>
+        <w:rPr>
+          <w:rFonts w:ascii="Calibri" w:cs="Calibri" w:eastAsia="Calibri" w:hAnsi="Calibri"/>
+          <w:color w:val="1F2933"/>
+          <w:sz w:val="21"/>
+          <w:szCs w:val="21"/>
+        </w:rPr>
+        <w:t xml:space="preserve">En pantalla el usuario escribe las horas de cada día de la semana y una hora de inicio; por debajo se guardan como tramos con hora, para que el almuerzo pueda entrar después como un segundo tramo sin migrar el motor. Las excepciones (festivos, un día sin trabajo, un sábado completo) tienen la misma forma que un día de la semana.</w:t>
+      </w:r>
+    </w:p>
+    <w:p>
+      <w:pPr>
+        <w:pStyle w:val="ListParagraph"/>
+        <w:numPr>
+          <w:ilvl w:val="0"/>
+          <w:numId w:val="2"/>
+        </w:numPr>
+        <w:spacing w:after="80" w:line="276"/>
+      </w:pPr>
+      <w:r>
+        <w:rPr>
+          <w:rFonts w:ascii="Calibri" w:cs="Calibri" w:eastAsia="Calibri" w:hAnsi="Calibri"/>
+          <w:color w:val="1F2933"/>
+          <w:sz w:val="21"/>
+          <w:szCs w:val="21"/>
+        </w:rPr>
+        <w:t xml:space="preserve">El motor solo consulta el calendario con dos operaciones: siguiente instante laborable desde una fecha-hora, y sumar N horas laborables (negativas en el paso hacia atrás).</w:t>
+      </w:r>
+    </w:p>
+    <w:p>
+      <w:pPr>
+        <w:pStyle w:val="ListParagraph"/>
+        <w:numPr>
+          <w:ilvl w:val="0"/>
+          <w:numId w:val="2"/>
+        </w:numPr>
+        <w:spacing w:after="80" w:line="276"/>
+      </w:pPr>
+      <w:r>
+        <w:rPr>
+          <w:rFonts w:ascii="Calibri" w:cs="Calibri" w:eastAsia="Calibri" w:hAnsi="Calibri"/>
+          <w:color w:val="1F2933"/>
+          <w:sz w:val="21"/>
+          <w:szCs w:val="21"/>
+        </w:rPr>
+        <w:t xml:space="preserve">La empresa tiene un calendario plantilla. Cada proyecto lo copia al crearse y lo edita; editar la plantilla no mueve ningún proyecto. Cada proyecto trae además un calendario de días corridos (7 días, 24 horas) para curados, fabricación y trámites.</w:t>
+      </w:r>
+    </w:p>
+    <w:p>
+      <w:pPr>
+        <w:pStyle w:val="ListParagraph"/>
+        <w:numPr>
+          <w:ilvl w:val="0"/>
+          <w:numId w:val="2"/>
+        </w:numPr>
+        <w:spacing w:after="80" w:line="276"/>
+      </w:pPr>
+      <w:r>
+        <w:rPr>
+          <w:rFonts w:ascii="Calibri" w:cs="Calibri" w:eastAsia="Calibri" w:hAnsi="Calibri"/>
+          <w:color w:val="1F2933"/>
+          <w:sz w:val="21"/>
+          <w:szCs w:val="21"/>
+        </w:rPr>
+        <w:t xml:space="preserve">Los festivos nacionales los calcula la función que ya existe (fn_festivos_colombia); no se cargan a mano.</w:t>
+      </w:r>
+    </w:p>
+    <w:p>
+      <w:pPr>
+        <w:pStyle w:val="ListParagraph"/>
+        <w:numPr>
+          <w:ilvl w:val="0"/>
+          <w:numId w:val="2"/>
+        </w:numPr>
+        <w:spacing w:after="80" w:line="276"/>
+      </w:pPr>
+      <w:r>
+        <w:rPr>
+          <w:rFonts w:ascii="Calibri" w:cs="Calibri" w:eastAsia="Calibri" w:hAnsi="Calibri"/>
+          <w:color w:val="1F2933"/>
+          <w:sz w:val="21"/>
+          <w:szCs w:val="21"/>
+        </w:rPr>
+        <w:t xml:space="preserve">Las fechas-hora se guardan como hora local del proyecto, sin zona horaria.</w:t>
+      </w:r>
+    </w:p>
+    <w:p>
+      <w:pPr>
+        <w:pStyle w:val="Heading2"/>
+        <w:spacing w:after="120" w:before="240"/>
+      </w:pPr>
+      <w:r>
+        <w:rPr>
+          <w:rFonts w:ascii="Calibri" w:cs="Calibri" w:eastAsia="Calibri" w:hAnsi="Calibri"/>
+          <w:b/>
+          <w:bCs/>
+          <w:color w:val="13496B"/>
+          <w:sz w:val="23"/>
+          <w:szCs w:val="23"/>
+        </w:rPr>
+        <w:t xml:space="preserve">6.3 Requisitos funcionales</w:t>
+      </w:r>
+    </w:p>
+    <w:tbl>
+      <w:tblPr>
+        <w:tblW w:type="dxa" w:w="9360"/>
+        <w:tblBorders>
+          <w:top w:val="single" w:color="E4E8EC" w:sz="2"/>
+          <w:left w:val="none" w:color="FFFFFF" w:sz="0"/>
+          <w:bottom w:val="single" w:color="E4E8EC" w:sz="2"/>
+          <w:right w:val="none" w:color="FFFFFF" w:sz="0"/>
+          <w:insideH w:val="single" w:color="E4E8EC" w:sz="2"/>
+          <w:insideV w:val="none" w:color="FFFFFF" w:sz="0"/>
+        </w:tblBorders>
+      </w:tblPr>
+      <w:tblGrid>
+        <w:gridCol w:w="1350"/>
+        <w:gridCol w:w="4310"/>
+        <w:gridCol w:w="3700"/>
+      </w:tblGrid>
+      <w:tr>
+        <w:trPr>
+          <w:tblHeader/>
+        </w:trPr>
+        <w:tc>
+          <w:tcPr>
+            <w:tcW w:type="dxa" w:w="1350"/>
+            <w:shd w:fill="13496B" w:color="auto" w:val="clear"/>
+            <w:tcMar>
+              <w:top w:type="dxa" w:w="70"/>
+              <w:left w:type="dxa" w:w="110"/>
+              <w:bottom w:type="dxa" w:w="70"/>
+              <w:right w:type="dxa" w:w="110"/>
+            </w:tcMar>
+          </w:tcPr>
+          <w:p>
+            <w:pPr>
+              <w:spacing w:after="30"/>
+            </w:pPr>
+            <w:r>
+              <w:rPr>
+                <w:rFonts w:ascii="Calibri" w:cs="Calibri" w:eastAsia="Calibri" w:hAnsi="Calibri"/>
+                <w:b/>
+                <w:bCs/>
+                <w:color w:val="FFFFFF"/>
+                <w:sz w:val="18"/>
+                <w:szCs w:val="18"/>
+              </w:rPr>
+              <w:t xml:space="preserve">Código</w:t>
+            </w:r>
+          </w:p>
+        </w:tc>
+        <w:tc>
+          <w:tcPr>
+            <w:tcW w:type="dxa" w:w="4310"/>
+            <w:shd w:fill="13496B" w:color="auto" w:val="clear"/>
+            <w:tcMar>
+              <w:top w:type="dxa" w:w="70"/>
+              <w:left w:type="dxa" w:w="110"/>
+              <w:bottom w:type="dxa" w:w="70"/>
+              <w:right w:type="dxa" w:w="110"/>
+            </w:tcMar>
+          </w:tcPr>
+          <w:p>
+            <w:pPr>
+              <w:spacing w:after="30"/>
+            </w:pPr>
+            <w:r>
+              <w:rPr>
+                <w:rFonts w:ascii="Calibri" w:cs="Calibri" w:eastAsia="Calibri" w:hAnsi="Calibri"/>
+                <w:b/>
+                <w:bCs/>
+                <w:color w:val="FFFFFF"/>
+                <w:sz w:val="18"/>
+                <w:szCs w:val="18"/>
+              </w:rPr>
+              <w:t xml:space="preserve">Requisito</w:t>
+            </w:r>
+          </w:p>
+        </w:tc>
+        <w:tc>
+          <w:tcPr>
+            <w:tcW w:type="dxa" w:w="3700"/>
+            <w:shd w:fill="13496B" w:color="auto" w:val="clear"/>
+            <w:tcMar>
+              <w:top w:type="dxa" w:w="70"/>
+              <w:left w:type="dxa" w:w="110"/>
+              <w:bottom w:type="dxa" w:w="70"/>
+              <w:right w:type="dxa" w:w="110"/>
+            </w:tcMar>
+          </w:tcPr>
+          <w:p>
+            <w:pPr>
+              <w:spacing w:after="30"/>
+            </w:pPr>
+            <w:r>
+              <w:rPr>
+                <w:rFonts w:ascii="Calibri" w:cs="Calibri" w:eastAsia="Calibri" w:hAnsi="Calibri"/>
+                <w:b/>
+                <w:bCs/>
+                <w:color w:val="FFFFFF"/>
+                <w:sz w:val="18"/>
+                <w:szCs w:val="18"/>
+              </w:rPr>
+              <w:t xml:space="preserve">Se acepta si</w:t>
+            </w:r>
+          </w:p>
+        </w:tc>
+      </w:tr>
+      <w:tr>
+        <w:trPr>
+          <w:cantSplit/>
+        </w:trPr>
+        <w:tc>
+          <w:tcPr>
+            <w:tcW w:type="dxa" w:w="1350"/>
+            <w:tcMar>
+              <w:top w:type="dxa" w:w="70"/>
+              <w:left w:type="dxa" w:w="110"/>
+              <w:bottom w:type="dxa" w:w="70"/>
+              <w:right w:type="dxa" w:w="110"/>
+            </w:tcMar>
+          </w:tcPr>
+          <w:p>
+            <w:pPr>
+              <w:spacing w:after="30"/>
+            </w:pPr>
+            <w:r>
+              <w:rPr>
+                <w:rFonts w:ascii="Calibri" w:cs="Calibri" w:eastAsia="Calibri" w:hAnsi="Calibri"/>
+                <w:color w:val="1F2933"/>
+                <w:sz w:val="18"/>
+                <w:szCs w:val="18"/>
+              </w:rPr>
+              <w:t xml:space="preserve">RF-CFG-27</w:t>
+            </w:r>
+          </w:p>
+        </w:tc>
+        <w:tc>
+          <w:tcPr>
+            <w:tcW w:type="dxa" w:w="4310"/>
+            <w:tcMar>
+              <w:top w:type="dxa" w:w="70"/>
+              <w:left w:type="dxa" w:w="110"/>
+              <w:bottom w:type="dxa" w:w="70"/>
+              <w:right w:type="dxa" w:w="110"/>
+            </w:tcMar>
+          </w:tcPr>
+          <w:p>
+            <w:pPr>
+              <w:spacing w:after="30"/>
+            </w:pPr>
+            <w:r>
+              <w:rPr>
+                <w:rFonts w:ascii="Calibri" w:cs="Calibri" w:eastAsia="Calibri" w:hAnsi="Calibri"/>
+                <w:color w:val="1F2933"/>
+                <w:sz w:val="18"/>
+                <w:szCs w:val="18"/>
+              </w:rPr>
+              <w:t xml:space="preserve">Horas por jornal en la configuración de la empresa.</w:t>
+            </w:r>
+          </w:p>
+        </w:tc>
+        <w:tc>
+          <w:tcPr>
+            <w:tcW w:type="dxa" w:w="3700"/>
+            <w:tcMar>
+              <w:top w:type="dxa" w:w="70"/>
+              <w:left w:type="dxa" w:w="110"/>
+              <w:bottom w:type="dxa" w:w="70"/>
+              <w:right w:type="dxa" w:w="110"/>
+            </w:tcMar>
+          </w:tcPr>
+          <w:p>
+            <w:pPr>
+              <w:spacing w:after="30"/>
+            </w:pPr>
+            <w:r>
+              <w:rPr>
+                <w:rFonts w:ascii="Calibri" w:cs="Calibri" w:eastAsia="Calibri" w:hAnsi="Calibri"/>
+                <w:color w:val="1F2933"/>
+                <w:sz w:val="18"/>
+                <w:szCs w:val="18"/>
+              </w:rPr>
+              <w:t xml:space="preserve">Al crear un presupuesto se copian en él y ya no cambian; cambiarlas en la empresa no altera presupuestos existentes.</w:t>
+            </w:r>
+          </w:p>
+        </w:tc>
+      </w:tr>
+      <w:tr>
+        <w:trPr>
+          <w:cantSplit/>
+        </w:trPr>
+        <w:tc>
+          <w:tcPr>
+            <w:tcW w:type="dxa" w:w="1350"/>
+            <w:shd w:fill="F7F9FA" w:color="auto" w:val="clear"/>
+            <w:tcMar>
+              <w:top w:type="dxa" w:w="70"/>
+              <w:left w:type="dxa" w:w="110"/>
+              <w:bottom w:type="dxa" w:w="70"/>
+              <w:right w:type="dxa" w:w="110"/>
+            </w:tcMar>
+          </w:tcPr>
+          <w:p>
+            <w:pPr>
+              <w:spacing w:after="30"/>
+            </w:pPr>
+            <w:r>
+              <w:rPr>
+                <w:rFonts w:ascii="Calibri" w:cs="Calibri" w:eastAsia="Calibri" w:hAnsi="Calibri"/>
+                <w:color w:val="1F2933"/>
+                <w:sz w:val="18"/>
+                <w:szCs w:val="18"/>
+              </w:rPr>
+              <w:t xml:space="preserve">RF-CFG-28</w:t>
+            </w:r>
+          </w:p>
+        </w:tc>
+        <w:tc>
+          <w:tcPr>
+            <w:tcW w:type="dxa" w:w="4310"/>
+            <w:shd w:fill="F7F9FA" w:color="auto" w:val="clear"/>
+            <w:tcMar>
+              <w:top w:type="dxa" w:w="70"/>
+              <w:left w:type="dxa" w:w="110"/>
+              <w:bottom w:type="dxa" w:w="70"/>
+              <w:right w:type="dxa" w:w="110"/>
+            </w:tcMar>
+          </w:tcPr>
+          <w:p>
+            <w:pPr>
+              <w:spacing w:after="30"/>
+            </w:pPr>
+            <w:r>
+              <w:rPr>
+                <w:rFonts w:ascii="Calibri" w:cs="Calibri" w:eastAsia="Calibri" w:hAnsi="Calibri"/>
+                <w:color w:val="1F2933"/>
+                <w:sz w:val="18"/>
+                <w:szCs w:val="18"/>
+              </w:rPr>
+              <w:t xml:space="preserve">Cada unidad de medida se marca como hora, día/jornal o no es tiempo.</w:t>
+            </w:r>
+          </w:p>
+        </w:tc>
+        <w:tc>
+          <w:tcPr>
+            <w:tcW w:type="dxa" w:w="3700"/>
+            <w:shd w:fill="F7F9FA" w:color="auto" w:val="clear"/>
+            <w:tcMar>
+              <w:top w:type="dxa" w:w="70"/>
+              <w:left w:type="dxa" w:w="110"/>
+              <w:bottom w:type="dxa" w:w="70"/>
+              <w:right w:type="dxa" w:w="110"/>
+            </w:tcMar>
+          </w:tcPr>
+          <w:p>
+            <w:pPr>
+              <w:spacing w:after="30"/>
+            </w:pPr>
+            <w:r>
+              <w:rPr>
+                <w:rFonts w:ascii="Calibri" w:cs="Calibri" w:eastAsia="Calibri" w:hAnsi="Calibri"/>
+                <w:color w:val="1F2933"/>
+                <w:sz w:val="18"/>
+                <w:szCs w:val="18"/>
+              </w:rPr>
+              <w:t xml:space="preserve">Un rendimiento en una unidad que no es tiempo no gobierna la duración.</w:t>
+            </w:r>
+          </w:p>
+        </w:tc>
+      </w:tr>
+      <w:tr>
+        <w:trPr>
+          <w:cantSplit/>
+        </w:trPr>
+        <w:tc>
+          <w:tcPr>
+            <w:tcW w:type="dxa" w:w="1350"/>
+            <w:tcMar>
+              <w:top w:type="dxa" w:w="70"/>
+              <w:left w:type="dxa" w:w="110"/>
+              <w:bottom w:type="dxa" w:w="70"/>
+              <w:right w:type="dxa" w:w="110"/>
+            </w:tcMar>
+          </w:tcPr>
+          <w:p>
+            <w:pPr>
+              <w:spacing w:after="30"/>
+            </w:pPr>
+            <w:r>
+              <w:rPr>
+                <w:rFonts w:ascii="Calibri" w:cs="Calibri" w:eastAsia="Calibri" w:hAnsi="Calibri"/>
+                <w:color w:val="1F2933"/>
+                <w:sz w:val="18"/>
+                <w:szCs w:val="18"/>
+              </w:rPr>
+              <w:t xml:space="preserve">RF-CFG-29</w:t>
+            </w:r>
+          </w:p>
+        </w:tc>
+        <w:tc>
+          <w:tcPr>
+            <w:tcW w:type="dxa" w:w="4310"/>
+            <w:tcMar>
+              <w:top w:type="dxa" w:w="70"/>
+              <w:left w:type="dxa" w:w="110"/>
+              <w:bottom w:type="dxa" w:w="70"/>
+              <w:right w:type="dxa" w:w="110"/>
+            </w:tcMar>
+          </w:tcPr>
+          <w:p>
+            <w:pPr>
+              <w:spacing w:after="30"/>
+            </w:pPr>
+            <w:r>
+              <w:rPr>
+                <w:rFonts w:ascii="Calibri" w:cs="Calibri" w:eastAsia="Calibri" w:hAnsi="Calibri"/>
+                <w:color w:val="1F2933"/>
+                <w:sz w:val="18"/>
+                <w:szCs w:val="18"/>
+              </w:rPr>
+              <w:t xml:space="preserve">Calendario plantilla de la empresa: horas por día de la semana, hora de inicio, factor «1 día = X h», excepciones.</w:t>
+            </w:r>
+          </w:p>
+        </w:tc>
+        <w:tc>
+          <w:tcPr>
+            <w:tcW w:type="dxa" w:w="3700"/>
+            <w:tcMar>
+              <w:top w:type="dxa" w:w="70"/>
+              <w:left w:type="dxa" w:w="110"/>
+              <w:bottom w:type="dxa" w:w="70"/>
+              <w:right w:type="dxa" w:w="110"/>
+            </w:tcMar>
+          </w:tcPr>
+          <w:p>
+            <w:pPr>
+              <w:spacing w:after="30"/>
+            </w:pPr>
+            <w:r>
+              <w:rPr>
+                <w:rFonts w:ascii="Calibri" w:cs="Calibri" w:eastAsia="Calibri" w:hAnsi="Calibri"/>
+                <w:color w:val="1F2933"/>
+                <w:sz w:val="18"/>
+                <w:szCs w:val="18"/>
+              </w:rPr>
+              <w:t xml:space="preserve">El total semanal se calcula y se muestra; cada día va de 0 a 24 horas; los tramos no se cruzan.</w:t>
+            </w:r>
+          </w:p>
+        </w:tc>
+      </w:tr>
+      <w:tr>
+        <w:trPr>
+          <w:cantSplit/>
+        </w:trPr>
+        <w:tc>
+          <w:tcPr>
+            <w:tcW w:type="dxa" w:w="1350"/>
+            <w:shd w:fill="F7F9FA" w:color="auto" w:val="clear"/>
+            <w:tcMar>
+              <w:top w:type="dxa" w:w="70"/>
+              <w:left w:type="dxa" w:w="110"/>
+              <w:bottom w:type="dxa" w:w="70"/>
+              <w:right w:type="dxa" w:w="110"/>
+            </w:tcMar>
+          </w:tcPr>
+          <w:p>
+            <w:pPr>
+              <w:spacing w:after="30"/>
+            </w:pPr>
+            <w:r>
+              <w:rPr>
+                <w:rFonts w:ascii="Calibri" w:cs="Calibri" w:eastAsia="Calibri" w:hAnsi="Calibri"/>
+                <w:color w:val="1F2933"/>
+                <w:sz w:val="18"/>
+                <w:szCs w:val="18"/>
+              </w:rPr>
+              <w:t xml:space="preserve">RF-PRG-01</w:t>
+            </w:r>
+          </w:p>
+        </w:tc>
+        <w:tc>
+          <w:tcPr>
+            <w:tcW w:type="dxa" w:w="4310"/>
+            <w:shd w:fill="F7F9FA" w:color="auto" w:val="clear"/>
+            <w:tcMar>
+              <w:top w:type="dxa" w:w="70"/>
+              <w:left w:type="dxa" w:w="110"/>
+              <w:bottom w:type="dxa" w:w="70"/>
+              <w:right w:type="dxa" w:w="110"/>
+            </w:tcMar>
+          </w:tcPr>
+          <w:p>
+            <w:pPr>
+              <w:spacing w:after="30"/>
+            </w:pPr>
+            <w:r>
+              <w:rPr>
+                <w:rFonts w:ascii="Calibri" w:cs="Calibri" w:eastAsia="Calibri" w:hAnsi="Calibri"/>
+                <w:color w:val="1F2933"/>
+                <w:sz w:val="18"/>
+                <w:szCs w:val="18"/>
+              </w:rPr>
+              <w:t xml:space="preserve">Crear el cronograma de un presupuesto con su fecha de inicio.</w:t>
+            </w:r>
+          </w:p>
+        </w:tc>
+        <w:tc>
+          <w:tcPr>
+            <w:tcW w:type="dxa" w:w="3700"/>
+            <w:shd w:fill="F7F9FA" w:color="auto" w:val="clear"/>
+            <w:tcMar>
+              <w:top w:type="dxa" w:w="70"/>
+              <w:left w:type="dxa" w:w="110"/>
+              <w:bottom w:type="dxa" w:w="70"/>
+              <w:right w:type="dxa" w:w="110"/>
+            </w:tcMar>
+          </w:tcPr>
+          <w:p>
+            <w:pPr>
+              <w:spacing w:after="30"/>
+            </w:pPr>
+            <w:r>
+              <w:rPr>
+                <w:rFonts w:ascii="Calibri" w:cs="Calibri" w:eastAsia="Calibri" w:hAnsi="Calibri"/>
+                <w:color w:val="1F2933"/>
+                <w:sz w:val="18"/>
+                <w:szCs w:val="18"/>
+              </w:rPr>
+              <w:t xml:space="preserve">Nace con una actividad por ítem, los capítulos como barras resumen, la tarea «Administración y supervisión de obra», el colchón y los dos calendarios copiados.</w:t>
+            </w:r>
+          </w:p>
+        </w:tc>
+      </w:tr>
+      <w:tr>
+        <w:trPr>
+          <w:cantSplit/>
+        </w:trPr>
+        <w:tc>
+          <w:tcPr>
+            <w:tcW w:type="dxa" w:w="1350"/>
+            <w:tcMar>
+              <w:top w:type="dxa" w:w="70"/>
+              <w:left w:type="dxa" w:w="110"/>
+              <w:bottom w:type="dxa" w:w="70"/>
+              <w:right w:type="dxa" w:w="110"/>
+            </w:tcMar>
+          </w:tcPr>
+          <w:p>
+            <w:pPr>
+              <w:spacing w:after="30"/>
+            </w:pPr>
+            <w:r>
+              <w:rPr>
+                <w:rFonts w:ascii="Calibri" w:cs="Calibri" w:eastAsia="Calibri" w:hAnsi="Calibri"/>
+                <w:color w:val="1F2933"/>
+                <w:sz w:val="18"/>
+                <w:szCs w:val="18"/>
+              </w:rPr>
+              <w:t xml:space="preserve">RF-PRG-02</w:t>
+            </w:r>
+          </w:p>
+        </w:tc>
+        <w:tc>
+          <w:tcPr>
+            <w:tcW w:type="dxa" w:w="4310"/>
+            <w:tcMar>
+              <w:top w:type="dxa" w:w="70"/>
+              <w:left w:type="dxa" w:w="110"/>
+              <w:bottom w:type="dxa" w:w="70"/>
+              <w:right w:type="dxa" w:w="110"/>
+            </w:tcMar>
+          </w:tcPr>
+          <w:p>
+            <w:pPr>
+              <w:spacing w:after="30"/>
+            </w:pPr>
+            <w:r>
+              <w:rPr>
+                <w:rFonts w:ascii="Calibri" w:cs="Calibri" w:eastAsia="Calibri" w:hAnsi="Calibri"/>
+                <w:color w:val="1F2933"/>
+                <w:sz w:val="18"/>
+                <w:szCs w:val="18"/>
+              </w:rPr>
+              <w:t xml:space="preserve">Editar una actividad: cuadrillas, duración manual, contingencia de lluvia, restricción «no antes de», calendario.</w:t>
+            </w:r>
+          </w:p>
+        </w:tc>
+        <w:tc>
+          <w:tcPr>
+            <w:tcW w:type="dxa" w:w="3700"/>
+            <w:tcMar>
+              <w:top w:type="dxa" w:w="70"/>
+              <w:left w:type="dxa" w:w="110"/>
+              <w:bottom w:type="dxa" w:w="70"/>
+              <w:right w:type="dxa" w:w="110"/>
+            </w:tcMar>
+          </w:tcPr>
+          <w:p>
+            <w:pPr>
+              <w:spacing w:after="30"/>
+            </w:pPr>
+            <w:r>
+              <w:rPr>
+                <w:rFonts w:ascii="Calibri" w:cs="Calibri" w:eastAsia="Calibri" w:hAnsi="Calibri"/>
+                <w:color w:val="1F2933"/>
+                <w:sz w:val="18"/>
+                <w:szCs w:val="18"/>
+              </w:rPr>
+              <w:t xml:space="preserve">Los capítulos no se editan: su duración y fechas salen de sus hijos.</w:t>
+            </w:r>
+          </w:p>
+        </w:tc>
+      </w:tr>
+      <w:tr>
+        <w:trPr>
+          <w:cantSplit/>
+        </w:trPr>
+        <w:tc>
+          <w:tcPr>
+            <w:tcW w:type="dxa" w:w="1350"/>
+            <w:shd w:fill="F7F9FA" w:color="auto" w:val="clear"/>
+            <w:tcMar>
+              <w:top w:type="dxa" w:w="70"/>
+              <w:left w:type="dxa" w:w="110"/>
+              <w:bottom w:type="dxa" w:w="70"/>
+              <w:right w:type="dxa" w:w="110"/>
+            </w:tcMar>
+          </w:tcPr>
+          <w:p>
+            <w:pPr>
+              <w:spacing w:after="30"/>
+            </w:pPr>
+            <w:r>
+              <w:rPr>
+                <w:rFonts w:ascii="Calibri" w:cs="Calibri" w:eastAsia="Calibri" w:hAnsi="Calibri"/>
+                <w:color w:val="1F2933"/>
+                <w:sz w:val="18"/>
+                <w:szCs w:val="18"/>
+              </w:rPr>
+              <w:t xml:space="preserve">RF-PRG-03</w:t>
+            </w:r>
+          </w:p>
+        </w:tc>
+        <w:tc>
+          <w:tcPr>
+            <w:tcW w:type="dxa" w:w="4310"/>
+            <w:shd w:fill="F7F9FA" w:color="auto" w:val="clear"/>
+            <w:tcMar>
+              <w:top w:type="dxa" w:w="70"/>
+              <w:left w:type="dxa" w:w="110"/>
+              <w:bottom w:type="dxa" w:w="70"/>
+              <w:right w:type="dxa" w:w="110"/>
+            </w:tcMar>
+          </w:tcPr>
+          <w:p>
+            <w:pPr>
+              <w:spacing w:after="30"/>
+            </w:pPr>
+            <w:r>
+              <w:rPr>
+                <w:rFonts w:ascii="Calibri" w:cs="Calibri" w:eastAsia="Calibri" w:hAnsi="Calibri"/>
+                <w:color w:val="1F2933"/>
+                <w:sz w:val="18"/>
+                <w:szCs w:val="18"/>
+              </w:rPr>
+              <w:t xml:space="preserve">Agregar hitos y actividades sin costo (licencia, curado, fabricación).</w:t>
+            </w:r>
+          </w:p>
+        </w:tc>
+        <w:tc>
+          <w:tcPr>
+            <w:tcW w:type="dxa" w:w="3700"/>
+            <w:shd w:fill="F7F9FA" w:color="auto" w:val="clear"/>
+            <w:tcMar>
+              <w:top w:type="dxa" w:w="70"/>
+              <w:left w:type="dxa" w:w="110"/>
+              <w:bottom w:type="dxa" w:w="70"/>
+              <w:right w:type="dxa" w:w="110"/>
+            </w:tcMar>
+          </w:tcPr>
+          <w:p>
+            <w:pPr>
+              <w:spacing w:after="30"/>
+            </w:pPr>
+            <w:r>
+              <w:rPr>
+                <w:rFonts w:ascii="Calibri" w:cs="Calibri" w:eastAsia="Calibri" w:hAnsi="Calibri"/>
+                <w:color w:val="1F2933"/>
+                <w:sz w:val="18"/>
+                <w:szCs w:val="18"/>
+              </w:rPr>
+              <w:t xml:space="preserve">Viven en un grupo «Hitos y trámites» que existe solo en el cronograma y no aparece en el presupuesto.</w:t>
+            </w:r>
+          </w:p>
+        </w:tc>
+      </w:tr>
+      <w:tr>
+        <w:trPr>
+          <w:cantSplit/>
+        </w:trPr>
+        <w:tc>
+          <w:tcPr>
+            <w:tcW w:type="dxa" w:w="1350"/>
+            <w:tcMar>
+              <w:top w:type="dxa" w:w="70"/>
+              <w:left w:type="dxa" w:w="110"/>
+              <w:bottom w:type="dxa" w:w="70"/>
+              <w:right w:type="dxa" w:w="110"/>
+            </w:tcMar>
+          </w:tcPr>
+          <w:p>
+            <w:pPr>
+              <w:spacing w:after="30"/>
+            </w:pPr>
+            <w:r>
+              <w:rPr>
+                <w:rFonts w:ascii="Calibri" w:cs="Calibri" w:eastAsia="Calibri" w:hAnsi="Calibri"/>
+                <w:color w:val="1F2933"/>
+                <w:sz w:val="18"/>
+                <w:szCs w:val="18"/>
+              </w:rPr>
+              <w:t xml:space="preserve">RF-PRG-04</w:t>
+            </w:r>
+          </w:p>
+        </w:tc>
+        <w:tc>
+          <w:tcPr>
+            <w:tcW w:type="dxa" w:w="4310"/>
+            <w:tcMar>
+              <w:top w:type="dxa" w:w="70"/>
+              <w:left w:type="dxa" w:w="110"/>
+              <w:bottom w:type="dxa" w:w="70"/>
+              <w:right w:type="dxa" w:w="110"/>
+            </w:tcMar>
+          </w:tcPr>
+          <w:p>
+            <w:pPr>
+              <w:spacing w:after="30"/>
+            </w:pPr>
+            <w:r>
+              <w:rPr>
+                <w:rFonts w:ascii="Calibri" w:cs="Calibri" w:eastAsia="Calibri" w:hAnsi="Calibri"/>
+                <w:color w:val="1F2933"/>
+                <w:sz w:val="18"/>
+                <w:szCs w:val="18"/>
+              </w:rPr>
+              <w:t xml:space="preserve">Crear dependencias FC, CC, FF y CF con desfase positivo o negativo.</w:t>
+            </w:r>
+          </w:p>
+        </w:tc>
+        <w:tc>
+          <w:tcPr>
+            <w:tcW w:type="dxa" w:w="3700"/>
+            <w:tcMar>
+              <w:top w:type="dxa" w:w="70"/>
+              <w:left w:type="dxa" w:w="110"/>
+              <w:bottom w:type="dxa" w:w="70"/>
+              <w:right w:type="dxa" w:w="110"/>
+            </w:tcMar>
+          </w:tcPr>
+          <w:p>
+            <w:pPr>
+              <w:spacing w:after="30"/>
+            </w:pPr>
+            <w:r>
+              <w:rPr>
+                <w:rFonts w:ascii="Calibri" w:cs="Calibri" w:eastAsia="Calibri" w:hAnsi="Calibri"/>
+                <w:color w:val="1F2933"/>
+                <w:sz w:val="18"/>
+                <w:szCs w:val="18"/>
+              </w:rPr>
+              <w:t xml:space="preserve">Solo entre actividades e hitos, nunca con capítulos.</w:t>
+            </w:r>
+          </w:p>
+        </w:tc>
+      </w:tr>
+      <w:tr>
+        <w:trPr>
+          <w:cantSplit/>
+        </w:trPr>
+        <w:tc>
+          <w:tcPr>
+            <w:tcW w:type="dxa" w:w="1350"/>
+            <w:shd w:fill="F7F9FA" w:color="auto" w:val="clear"/>
+            <w:tcMar>
+              <w:top w:type="dxa" w:w="70"/>
+              <w:left w:type="dxa" w:w="110"/>
+              <w:bottom w:type="dxa" w:w="70"/>
+              <w:right w:type="dxa" w:w="110"/>
+            </w:tcMar>
+          </w:tcPr>
+          <w:p>
+            <w:pPr>
+              <w:spacing w:after="30"/>
+            </w:pPr>
+            <w:r>
+              <w:rPr>
+                <w:rFonts w:ascii="Calibri" w:cs="Calibri" w:eastAsia="Calibri" w:hAnsi="Calibri"/>
+                <w:color w:val="1F2933"/>
+                <w:sz w:val="18"/>
+                <w:szCs w:val="18"/>
+              </w:rPr>
+              <w:t xml:space="preserve">RF-PRG-05</w:t>
+            </w:r>
+          </w:p>
+        </w:tc>
+        <w:tc>
+          <w:tcPr>
+            <w:tcW w:type="dxa" w:w="4310"/>
+            <w:shd w:fill="F7F9FA" w:color="auto" w:val="clear"/>
+            <w:tcMar>
+              <w:top w:type="dxa" w:w="70"/>
+              <w:left w:type="dxa" w:w="110"/>
+              <w:bottom w:type="dxa" w:w="70"/>
+              <w:right w:type="dxa" w:w="110"/>
+            </w:tcMar>
+          </w:tcPr>
+          <w:p>
+            <w:pPr>
+              <w:spacing w:after="30"/>
+            </w:pPr>
+            <w:r>
+              <w:rPr>
+                <w:rFonts w:ascii="Calibri" w:cs="Calibri" w:eastAsia="Calibri" w:hAnsi="Calibri"/>
+                <w:color w:val="1F2933"/>
+                <w:sz w:val="18"/>
+                <w:szCs w:val="18"/>
+              </w:rPr>
+              <w:t xml:space="preserve">Calcular el cronograma: fechas tempranas y tardías, holgura total, ruta crítica.</w:t>
+            </w:r>
+          </w:p>
+        </w:tc>
+        <w:tc>
+          <w:tcPr>
+            <w:tcW w:type="dxa" w:w="3700"/>
+            <w:shd w:fill="F7F9FA" w:color="auto" w:val="clear"/>
+            <w:tcMar>
+              <w:top w:type="dxa" w:w="70"/>
+              <w:left w:type="dxa" w:w="110"/>
+              <w:bottom w:type="dxa" w:w="70"/>
+              <w:right w:type="dxa" w:w="110"/>
+            </w:tcMar>
+          </w:tcPr>
+          <w:p>
+            <w:pPr>
+              <w:spacing w:after="30"/>
+            </w:pPr>
+            <w:r>
+              <w:rPr>
+                <w:rFonts w:ascii="Calibri" w:cs="Calibri" w:eastAsia="Calibri" w:hAnsi="Calibri"/>
+                <w:color w:val="1F2933"/>
+                <w:sz w:val="18"/>
+                <w:szCs w:val="18"/>
+              </w:rPr>
+              <w:t xml:space="preserve">Si hay un ciclo, no calcula nada y dice qué actividades lo forman.</w:t>
+            </w:r>
+          </w:p>
+        </w:tc>
+      </w:tr>
+      <w:tr>
+        <w:trPr>
+          <w:cantSplit/>
+        </w:trPr>
+        <w:tc>
+          <w:tcPr>
+            <w:tcW w:type="dxa" w:w="1350"/>
+            <w:tcMar>
+              <w:top w:type="dxa" w:w="70"/>
+              <w:left w:type="dxa" w:w="110"/>
+              <w:bottom w:type="dxa" w:w="70"/>
+              <w:right w:type="dxa" w:w="110"/>
+            </w:tcMar>
+          </w:tcPr>
+          <w:p>
+            <w:pPr>
+              <w:spacing w:after="30"/>
+            </w:pPr>
+            <w:r>
+              <w:rPr>
+                <w:rFonts w:ascii="Calibri" w:cs="Calibri" w:eastAsia="Calibri" w:hAnsi="Calibri"/>
+                <w:color w:val="1F2933"/>
+                <w:sz w:val="18"/>
+                <w:szCs w:val="18"/>
+              </w:rPr>
+              <w:t xml:space="preserve">RF-PRG-06</w:t>
+            </w:r>
+          </w:p>
+        </w:tc>
+        <w:tc>
+          <w:tcPr>
+            <w:tcW w:type="dxa" w:w="4310"/>
+            <w:tcMar>
+              <w:top w:type="dxa" w:w="70"/>
+              <w:left w:type="dxa" w:w="110"/>
+              <w:bottom w:type="dxa" w:w="70"/>
+              <w:right w:type="dxa" w:w="110"/>
+            </w:tcMar>
+          </w:tcPr>
+          <w:p>
+            <w:pPr>
+              <w:spacing w:after="30"/>
+            </w:pPr>
+            <w:r>
+              <w:rPr>
+                <w:rFonts w:ascii="Calibri" w:cs="Calibri" w:eastAsia="Calibri" w:hAnsi="Calibri"/>
+                <w:color w:val="1F2933"/>
+                <w:sz w:val="18"/>
+                <w:szCs w:val="18"/>
+              </w:rPr>
+              <w:t xml:space="preserve">Ver el Gantt junto a la tabla de actividades.</w:t>
+            </w:r>
+          </w:p>
+        </w:tc>
+        <w:tc>
+          <w:tcPr>
+            <w:tcW w:type="dxa" w:w="3700"/>
+            <w:tcMar>
+              <w:top w:type="dxa" w:w="70"/>
+              <w:left w:type="dxa" w:w="110"/>
+              <w:bottom w:type="dxa" w:w="70"/>
+              <w:right w:type="dxa" w:w="110"/>
+            </w:tcMar>
+          </w:tcPr>
+          <w:p>
+            <w:pPr>
+              <w:spacing w:after="30"/>
+            </w:pPr>
+            <w:r>
+              <w:rPr>
+                <w:rFonts w:ascii="Calibri" w:cs="Calibri" w:eastAsia="Calibri" w:hAnsi="Calibri"/>
+                <w:color w:val="1F2933"/>
+                <w:sz w:val="18"/>
+                <w:szCs w:val="18"/>
+              </w:rPr>
+              <w:t xml:space="preserve">Ver sección 6.6.</w:t>
+            </w:r>
+          </w:p>
+        </w:tc>
+      </w:tr>
+      <w:tr>
+        <w:trPr>
+          <w:cantSplit/>
+        </w:trPr>
+        <w:tc>
+          <w:tcPr>
+            <w:tcW w:type="dxa" w:w="1350"/>
+            <w:shd w:fill="F7F9FA" w:color="auto" w:val="clear"/>
+            <w:tcMar>
+              <w:top w:type="dxa" w:w="70"/>
+              <w:left w:type="dxa" w:w="110"/>
+              <w:bottom w:type="dxa" w:w="70"/>
+              <w:right w:type="dxa" w:w="110"/>
+            </w:tcMar>
+          </w:tcPr>
+          <w:p>
+            <w:pPr>
+              <w:spacing w:after="30"/>
+            </w:pPr>
+            <w:r>
+              <w:rPr>
+                <w:rFonts w:ascii="Calibri" w:cs="Calibri" w:eastAsia="Calibri" w:hAnsi="Calibri"/>
+                <w:color w:val="1F2933"/>
+                <w:sz w:val="18"/>
+                <w:szCs w:val="18"/>
+              </w:rPr>
+              <w:t xml:space="preserve">RF-PRG-07</w:t>
+            </w:r>
+          </w:p>
+        </w:tc>
+        <w:tc>
+          <w:tcPr>
+            <w:tcW w:type="dxa" w:w="4310"/>
+            <w:shd w:fill="F7F9FA" w:color="auto" w:val="clear"/>
+            <w:tcMar>
+              <w:top w:type="dxa" w:w="70"/>
+              <w:left w:type="dxa" w:w="110"/>
+              <w:bottom w:type="dxa" w:w="70"/>
+              <w:right w:type="dxa" w:w="110"/>
+            </w:tcMar>
+          </w:tcPr>
+          <w:p>
+            <w:pPr>
+              <w:spacing w:after="30"/>
+            </w:pPr>
+            <w:r>
+              <w:rPr>
+                <w:rFonts w:ascii="Calibri" w:cs="Calibri" w:eastAsia="Calibri" w:hAnsi="Calibri"/>
+                <w:color w:val="1F2933"/>
+                <w:sz w:val="18"/>
+                <w:szCs w:val="18"/>
+              </w:rPr>
+              <w:t xml:space="preserve">Revisar lo que cambió en el presupuesto desde la última vez.</w:t>
+            </w:r>
+          </w:p>
+        </w:tc>
+        <w:tc>
+          <w:tcPr>
+            <w:tcW w:type="dxa" w:w="3700"/>
+            <w:shd w:fill="F7F9FA" w:color="auto" w:val="clear"/>
+            <w:tcMar>
+              <w:top w:type="dxa" w:w="70"/>
+              <w:left w:type="dxa" w:w="110"/>
+              <w:bottom w:type="dxa" w:w="70"/>
+              <w:right w:type="dxa" w:w="110"/>
+            </w:tcMar>
+          </w:tcPr>
+          <w:p>
+            <w:pPr>
+              <w:spacing w:after="30"/>
+            </w:pPr>
+            <w:r>
+              <w:rPr>
+                <w:rFonts w:ascii="Calibri" w:cs="Calibri" w:eastAsia="Calibri" w:hAnsi="Calibri"/>
+                <w:color w:val="1F2933"/>
+                <w:sz w:val="18"/>
+                <w:szCs w:val="18"/>
+              </w:rPr>
+              <w:t xml:space="preserve">Lista las actividades sin programar, las que ya no están en el presupuesto y las de duración manual distinta de la calculada.</w:t>
+            </w:r>
+          </w:p>
+        </w:tc>
+      </w:tr>
+      <w:tr>
+        <w:trPr>
+          <w:cantSplit/>
+        </w:trPr>
+        <w:tc>
+          <w:tcPr>
+            <w:tcW w:type="dxa" w:w="1350"/>
+            <w:tcMar>
+              <w:top w:type="dxa" w:w="70"/>
+              <w:left w:type="dxa" w:w="110"/>
+              <w:bottom w:type="dxa" w:w="70"/>
+              <w:right w:type="dxa" w:w="110"/>
+            </w:tcMar>
+          </w:tcPr>
+          <w:p>
+            <w:pPr>
+              <w:spacing w:after="30"/>
+            </w:pPr>
+            <w:r>
+              <w:rPr>
+                <w:rFonts w:ascii="Calibri" w:cs="Calibri" w:eastAsia="Calibri" w:hAnsi="Calibri"/>
+                <w:color w:val="1F2933"/>
+                <w:sz w:val="18"/>
+                <w:szCs w:val="18"/>
+              </w:rPr>
+              <w:t xml:space="preserve">RF-PRG-08</w:t>
+            </w:r>
+          </w:p>
+        </w:tc>
+        <w:tc>
+          <w:tcPr>
+            <w:tcW w:type="dxa" w:w="4310"/>
+            <w:tcMar>
+              <w:top w:type="dxa" w:w="70"/>
+              <w:left w:type="dxa" w:w="110"/>
+              <w:bottom w:type="dxa" w:w="70"/>
+              <w:right w:type="dxa" w:w="110"/>
+            </w:tcMar>
+          </w:tcPr>
+          <w:p>
+            <w:pPr>
+              <w:spacing w:after="30"/>
+            </w:pPr>
+            <w:r>
+              <w:rPr>
+                <w:rFonts w:ascii="Calibri" w:cs="Calibri" w:eastAsia="Calibri" w:hAnsi="Calibri"/>
+                <w:color w:val="1F2933"/>
+                <w:sz w:val="18"/>
+                <w:szCs w:val="18"/>
+              </w:rPr>
+              <w:t xml:space="preserve">Ver el costo repartido en el tiempo, por semana o por mes, y la curva S planeada.</w:t>
+            </w:r>
+          </w:p>
+        </w:tc>
+        <w:tc>
+          <w:tcPr>
+            <w:tcW w:type="dxa" w:w="3700"/>
+            <w:tcMar>
+              <w:top w:type="dxa" w:w="70"/>
+              <w:left w:type="dxa" w:w="110"/>
+              <w:bottom w:type="dxa" w:w="70"/>
+              <w:right w:type="dxa" w:w="110"/>
+            </w:tcMar>
+          </w:tcPr>
+          <w:p>
+            <w:pPr>
+              <w:spacing w:after="30"/>
+            </w:pPr>
+            <w:r>
+              <w:rPr>
+                <w:rFonts w:ascii="Calibri" w:cs="Calibri" w:eastAsia="Calibri" w:hAnsi="Calibri"/>
+                <w:color w:val="1F2933"/>
+                <w:sz w:val="18"/>
+                <w:szCs w:val="18"/>
+              </w:rPr>
+              <w:t xml:space="preserve">La suma de los periodos es igual al costo del presupuesto.</w:t>
+            </w:r>
+          </w:p>
+        </w:tc>
+      </w:tr>
+      <w:tr>
+        <w:trPr>
+          <w:cantSplit/>
+        </w:trPr>
+        <w:tc>
+          <w:tcPr>
+            <w:tcW w:type="dxa" w:w="1350"/>
+            <w:shd w:fill="F7F9FA" w:color="auto" w:val="clear"/>
+            <w:tcMar>
+              <w:top w:type="dxa" w:w="70"/>
+              <w:left w:type="dxa" w:w="110"/>
+              <w:bottom w:type="dxa" w:w="70"/>
+              <w:right w:type="dxa" w:w="110"/>
+            </w:tcMar>
+          </w:tcPr>
+          <w:p>
+            <w:pPr>
+              <w:spacing w:after="30"/>
+            </w:pPr>
+            <w:r>
+              <w:rPr>
+                <w:rFonts w:ascii="Calibri" w:cs="Calibri" w:eastAsia="Calibri" w:hAnsi="Calibri"/>
+                <w:color w:val="1F2933"/>
+                <w:sz w:val="18"/>
+                <w:szCs w:val="18"/>
+              </w:rPr>
+              <w:t xml:space="preserve">RF-PRG-09</w:t>
+            </w:r>
+          </w:p>
+        </w:tc>
+        <w:tc>
+          <w:tcPr>
+            <w:tcW w:type="dxa" w:w="4310"/>
+            <w:shd w:fill="F7F9FA" w:color="auto" w:val="clear"/>
+            <w:tcMar>
+              <w:top w:type="dxa" w:w="70"/>
+              <w:left w:type="dxa" w:w="110"/>
+              <w:bottom w:type="dxa" w:w="70"/>
+              <w:right w:type="dxa" w:w="110"/>
+            </w:tcMar>
+          </w:tcPr>
+          <w:p>
+            <w:pPr>
+              <w:spacing w:after="30"/>
+            </w:pPr>
+            <w:r>
+              <w:rPr>
+                <w:rFonts w:ascii="Calibri" w:cs="Calibri" w:eastAsia="Calibri" w:hAnsi="Calibri"/>
+                <w:color w:val="1F2933"/>
+                <w:sz w:val="18"/>
+                <w:szCs w:val="18"/>
+              </w:rPr>
+              <w:t xml:space="preserve">Guardar la línea base y compararla con el cronograma actual.</w:t>
+            </w:r>
+          </w:p>
+        </w:tc>
+        <w:tc>
+          <w:tcPr>
+            <w:tcW w:type="dxa" w:w="3700"/>
+            <w:shd w:fill="F7F9FA" w:color="auto" w:val="clear"/>
+            <w:tcMar>
+              <w:top w:type="dxa" w:w="70"/>
+              <w:left w:type="dxa" w:w="110"/>
+              <w:bottom w:type="dxa" w:w="70"/>
+              <w:right w:type="dxa" w:w="110"/>
+            </w:tcMar>
+          </w:tcPr>
+          <w:p>
+            <w:pPr>
+              <w:spacing w:after="30"/>
+            </w:pPr>
+            <w:r>
+              <w:rPr>
+                <w:rFonts w:ascii="Calibri" w:cs="Calibri" w:eastAsia="Calibri" w:hAnsi="Calibri"/>
+                <w:color w:val="1F2933"/>
+                <w:sz w:val="18"/>
+                <w:szCs w:val="18"/>
+              </w:rPr>
+              <w:t xml:space="preserve">Guardar sobre una existente pide confirmación; nunca sobrescribe en silencio.</w:t>
+            </w:r>
+          </w:p>
+        </w:tc>
+      </w:tr>
+    </w:tbl>
+    <w:p>
+      <w:pPr>
+        <w:spacing w:after="120"/>
+      </w:pPr>
+    </w:p>
+    <w:p>
+      <w:pPr>
+        <w:pStyle w:val="Heading2"/>
+        <w:spacing w:after="120" w:before="240"/>
+      </w:pPr>
+      <w:r>
+        <w:rPr>
+          <w:rFonts w:ascii="Calibri" w:cs="Calibri" w:eastAsia="Calibri" w:hAnsi="Calibri"/>
+          <w:b/>
+          <w:bCs/>
+          <w:color w:val="13496B"/>
+          <w:sz w:val="23"/>
+          <w:szCs w:val="23"/>
+        </w:rPr>
+        <w:t xml:space="preserve">6.4 Reglas de negocio</w:t>
+      </w:r>
+    </w:p>
+    <w:tbl>
+      <w:tblPr>
+        <w:tblW w:type="dxa" w:w="9360"/>
+        <w:tblBorders>
+          <w:top w:val="single" w:color="E4E8EC" w:sz="2"/>
+          <w:left w:val="none" w:color="FFFFFF" w:sz="0"/>
+          <w:bottom w:val="single" w:color="E4E8EC" w:sz="2"/>
+          <w:right w:val="none" w:color="FFFFFF" w:sz="0"/>
+          <w:insideH w:val="single" w:color="E4E8EC" w:sz="2"/>
+          <w:insideV w:val="none" w:color="FFFFFF" w:sz="0"/>
+        </w:tblBorders>
+      </w:tblPr>
+      <w:tblGrid>
+        <w:gridCol w:w="1100"/>
+        <w:gridCol w:w="8260"/>
+      </w:tblGrid>
+      <w:tr>
+        <w:trPr>
+          <w:tblHeader/>
+        </w:trPr>
+        <w:tc>
+          <w:tcPr>
+            <w:tcW w:type="dxa" w:w="1100"/>
+            <w:shd w:fill="13496B" w:color="auto" w:val="clear"/>
+            <w:tcMar>
+              <w:top w:type="dxa" w:w="70"/>
+              <w:left w:type="dxa" w:w="110"/>
+              <w:bottom w:type="dxa" w:w="70"/>
+              <w:right w:type="dxa" w:w="110"/>
+            </w:tcMar>
+          </w:tcPr>
+          <w:p>
+            <w:pPr>
+              <w:spacing w:after="30"/>
+            </w:pPr>
+            <w:r>
+              <w:rPr>
+                <w:rFonts w:ascii="Calibri" w:cs="Calibri" w:eastAsia="Calibri" w:hAnsi="Calibri"/>
+                <w:b/>
+                <w:bCs/>
+                <w:color w:val="FFFFFF"/>
+                <w:sz w:val="18"/>
+                <w:szCs w:val="18"/>
+              </w:rPr>
+              <w:t xml:space="preserve">Código</w:t>
+            </w:r>
+          </w:p>
+        </w:tc>
+        <w:tc>
+          <w:tcPr>
+            <w:tcW w:type="dxa" w:w="8260"/>
+            <w:shd w:fill="13496B" w:color="auto" w:val="clear"/>
+            <w:tcMar>
+              <w:top w:type="dxa" w:w="70"/>
+              <w:left w:type="dxa" w:w="110"/>
+              <w:bottom w:type="dxa" w:w="70"/>
+              <w:right w:type="dxa" w:w="110"/>
+            </w:tcMar>
+          </w:tcPr>
+          <w:p>
+            <w:pPr>
+              <w:spacing w:after="30"/>
+            </w:pPr>
+            <w:r>
+              <w:rPr>
+                <w:rFonts w:ascii="Calibri" w:cs="Calibri" w:eastAsia="Calibri" w:hAnsi="Calibri"/>
+                <w:b/>
+                <w:bCs/>
+                <w:color w:val="FFFFFF"/>
+                <w:sz w:val="18"/>
+                <w:szCs w:val="18"/>
+              </w:rPr>
+              <w:t xml:space="preserve">Regla</w:t>
+            </w:r>
+          </w:p>
+        </w:tc>
+      </w:tr>
+      <w:tr>
+        <w:trPr>
+          <w:cantSplit/>
+        </w:trPr>
+        <w:tc>
+          <w:tcPr>
+            <w:tcW w:type="dxa" w:w="1100"/>
+            <w:tcMar>
+              <w:top w:type="dxa" w:w="70"/>
+              <w:left w:type="dxa" w:w="110"/>
+              <w:bottom w:type="dxa" w:w="70"/>
+              <w:right w:type="dxa" w:w="110"/>
+            </w:tcMar>
+          </w:tcPr>
+          <w:p>
+            <w:pPr>
+              <w:spacing w:after="30"/>
+            </w:pPr>
+            <w:r>
+              <w:rPr>
+                <w:rFonts w:ascii="Calibri" w:cs="Calibri" w:eastAsia="Calibri" w:hAnsi="Calibri"/>
+                <w:color w:val="1F2933"/>
+                <w:sz w:val="18"/>
+                <w:szCs w:val="18"/>
+              </w:rPr>
+              <w:t xml:space="preserve">RN-25</w:t>
+            </w:r>
+          </w:p>
+        </w:tc>
+        <w:tc>
+          <w:tcPr>
+            <w:tcW w:type="dxa" w:w="8260"/>
+            <w:tcMar>
+              <w:top w:type="dxa" w:w="70"/>
+              <w:left w:type="dxa" w:w="110"/>
+              <w:bottom w:type="dxa" w:w="70"/>
+              <w:right w:type="dxa" w:w="110"/>
+            </w:tcMar>
+          </w:tcPr>
+          <w:p>
+            <w:pPr>
+              <w:spacing w:after="30"/>
+            </w:pPr>
+            <w:r>
+              <w:rPr>
+                <w:rFonts w:ascii="Calibri" w:cs="Calibri" w:eastAsia="Calibri" w:hAnsi="Calibri"/>
+                <w:b/>
+                <w:bCs/>
+                <w:color w:val="1F2933"/>
+                <w:sz w:val="18"/>
+                <w:szCs w:val="18"/>
+              </w:rPr>
+              <w:t xml:space="preserve">La duración sale de la mano de obra más lenta</w:t>
+            </w:r>
+            <w:r>
+              <w:rPr>
+                <w:rFonts w:ascii="Calibri" w:cs="Calibri" w:eastAsia="Calibri" w:hAnsi="Calibri"/>
+                <w:color w:val="1F2933"/>
+                <w:sz w:val="18"/>
+                <w:szCs w:val="18"/>
+              </w:rPr>
+              <w:t xml:space="preserve"> (sección 6.1). Si las líneas trabajan en secuencia y no en paralelo, el usuario corrige la duración a mano.</w:t>
+            </w:r>
+          </w:p>
+        </w:tc>
+      </w:tr>
+      <w:tr>
+        <w:trPr>
+          <w:cantSplit/>
+        </w:trPr>
+        <w:tc>
+          <w:tcPr>
+            <w:tcW w:type="dxa" w:w="1100"/>
+            <w:shd w:fill="F7F9FA" w:color="auto" w:val="clear"/>
+            <w:tcMar>
+              <w:top w:type="dxa" w:w="70"/>
+              <w:left w:type="dxa" w:w="110"/>
+              <w:bottom w:type="dxa" w:w="70"/>
+              <w:right w:type="dxa" w:w="110"/>
+            </w:tcMar>
+          </w:tcPr>
+          <w:p>
+            <w:pPr>
+              <w:spacing w:after="30"/>
+            </w:pPr>
+            <w:r>
+              <w:rPr>
+                <w:rFonts w:ascii="Calibri" w:cs="Calibri" w:eastAsia="Calibri" w:hAnsi="Calibri"/>
+                <w:color w:val="1F2933"/>
+                <w:sz w:val="18"/>
+                <w:szCs w:val="18"/>
+              </w:rPr>
+              <w:t xml:space="preserve">RN-26</w:t>
+            </w:r>
+          </w:p>
+        </w:tc>
+        <w:tc>
+          <w:tcPr>
+            <w:tcW w:type="dxa" w:w="8260"/>
+            <w:shd w:fill="F7F9FA" w:color="auto" w:val="clear"/>
+            <w:tcMar>
+              <w:top w:type="dxa" w:w="70"/>
+              <w:left w:type="dxa" w:w="110"/>
+              <w:bottom w:type="dxa" w:w="70"/>
+              <w:right w:type="dxa" w:w="110"/>
+            </w:tcMar>
+          </w:tcPr>
+          <w:p>
+            <w:pPr>
+              <w:spacing w:after="30"/>
+            </w:pPr>
+            <w:r>
+              <w:rPr>
+                <w:rFonts w:ascii="Calibri" w:cs="Calibri" w:eastAsia="Calibri" w:hAnsi="Calibri"/>
+                <w:b/>
+                <w:bCs/>
+                <w:color w:val="1F2933"/>
+                <w:sz w:val="18"/>
+                <w:szCs w:val="18"/>
+              </w:rPr>
+              <w:t xml:space="preserve">Solo un rendimiento en unidad de tiempo gobierna la duración.</w:t>
+            </w:r>
+            <w:r>
+              <w:rPr>
+                <w:rFonts w:ascii="Calibri" w:cs="Calibri" w:eastAsia="Calibri" w:hAnsi="Calibri"/>
+                <w:color w:val="1F2933"/>
+                <w:sz w:val="18"/>
+                <w:szCs w:val="18"/>
+              </w:rPr>
+              <w:t xml:space="preserve"> Un equipo que se cobra por tiempo pero no produce (andamio, formaleta) puede dar una duración equivocada si es el único recurso: el usuario la corrige.</w:t>
+            </w:r>
+          </w:p>
+        </w:tc>
+      </w:tr>
+      <w:tr>
+        <w:trPr>
+          <w:cantSplit/>
+        </w:trPr>
+        <w:tc>
+          <w:tcPr>
+            <w:tcW w:type="dxa" w:w="1100"/>
+            <w:tcMar>
+              <w:top w:type="dxa" w:w="70"/>
+              <w:left w:type="dxa" w:w="110"/>
+              <w:bottom w:type="dxa" w:w="70"/>
+              <w:right w:type="dxa" w:w="110"/>
+            </w:tcMar>
+          </w:tcPr>
+          <w:p>
+            <w:pPr>
+              <w:spacing w:after="30"/>
+            </w:pPr>
+            <w:r>
+              <w:rPr>
+                <w:rFonts w:ascii="Calibri" w:cs="Calibri" w:eastAsia="Calibri" w:hAnsi="Calibri"/>
+                <w:color w:val="1F2933"/>
+                <w:sz w:val="18"/>
+                <w:szCs w:val="18"/>
+              </w:rPr>
+              <w:t xml:space="preserve">RN-27</w:t>
+            </w:r>
+          </w:p>
+        </w:tc>
+        <w:tc>
+          <w:tcPr>
+            <w:tcW w:type="dxa" w:w="8260"/>
+            <w:tcMar>
+              <w:top w:type="dxa" w:w="70"/>
+              <w:left w:type="dxa" w:w="110"/>
+              <w:bottom w:type="dxa" w:w="70"/>
+              <w:right w:type="dxa" w:w="110"/>
+            </w:tcMar>
+          </w:tcPr>
+          <w:p>
+            <w:pPr>
+              <w:spacing w:after="30"/>
+            </w:pPr>
+            <w:r>
+              <w:rPr>
+                <w:rFonts w:ascii="Calibri" w:cs="Calibri" w:eastAsia="Calibri" w:hAnsi="Calibri"/>
+                <w:b/>
+                <w:bCs/>
+                <w:color w:val="1F2933"/>
+                <w:sz w:val="18"/>
+                <w:szCs w:val="18"/>
+              </w:rPr>
+              <w:t xml:space="preserve">El motor nunca redondea fechas.</w:t>
+            </w:r>
+            <w:r>
+              <w:rPr>
+                <w:rFonts w:ascii="Calibri" w:cs="Calibri" w:eastAsia="Calibri" w:hAnsi="Calibri"/>
+                <w:color w:val="1F2933"/>
+                <w:sz w:val="18"/>
+                <w:szCs w:val="18"/>
+              </w:rPr>
+              <w:t xml:space="preserve"> Un inicio pasa al siguiente instante laborable; un fin se queda al cierre del último tramo trabajado. Quien quiera redondear, redondea la duración. En pantalla las duraciones van con un decimal y se marcan las barras que terminan a mitad de jornada.</w:t>
+            </w:r>
+          </w:p>
+        </w:tc>
+      </w:tr>
+      <w:tr>
+        <w:trPr>
+          <w:cantSplit/>
+        </w:trPr>
+        <w:tc>
+          <w:tcPr>
+            <w:tcW w:type="dxa" w:w="1100"/>
+            <w:shd w:fill="F7F9FA" w:color="auto" w:val="clear"/>
+            <w:tcMar>
+              <w:top w:type="dxa" w:w="70"/>
+              <w:left w:type="dxa" w:w="110"/>
+              <w:bottom w:type="dxa" w:w="70"/>
+              <w:right w:type="dxa" w:w="110"/>
+            </w:tcMar>
+          </w:tcPr>
+          <w:p>
+            <w:pPr>
+              <w:spacing w:after="30"/>
+            </w:pPr>
+            <w:r>
+              <w:rPr>
+                <w:rFonts w:ascii="Calibri" w:cs="Calibri" w:eastAsia="Calibri" w:hAnsi="Calibri"/>
+                <w:color w:val="1F2933"/>
+                <w:sz w:val="18"/>
+                <w:szCs w:val="18"/>
+              </w:rPr>
+              <w:t xml:space="preserve">RN-28</w:t>
+            </w:r>
+          </w:p>
+        </w:tc>
+        <w:tc>
+          <w:tcPr>
+            <w:tcW w:type="dxa" w:w="8260"/>
+            <w:shd w:fill="F7F9FA" w:color="auto" w:val="clear"/>
+            <w:tcMar>
+              <w:top w:type="dxa" w:w="70"/>
+              <w:left w:type="dxa" w:w="110"/>
+              <w:bottom w:type="dxa" w:w="70"/>
+              <w:right w:type="dxa" w:w="110"/>
+            </w:tcMar>
+          </w:tcPr>
+          <w:p>
+            <w:pPr>
+              <w:spacing w:after="30"/>
+            </w:pPr>
+            <w:r>
+              <w:rPr>
+                <w:rFonts w:ascii="Calibri" w:cs="Calibri" w:eastAsia="Calibri" w:hAnsi="Calibri"/>
+                <w:b/>
+                <w:bCs/>
+                <w:color w:val="1F2933"/>
+                <w:sz w:val="18"/>
+                <w:szCs w:val="18"/>
+              </w:rPr>
+              <w:t xml:space="preserve">Un hito dura cero y queda en el instante donde cae,</w:t>
+            </w:r>
+            <w:r>
+              <w:rPr>
+                <w:rFonts w:ascii="Calibri" w:cs="Calibri" w:eastAsia="Calibri" w:hAnsi="Calibri"/>
+                <w:color w:val="1F2933"/>
+                <w:sz w:val="18"/>
+                <w:szCs w:val="18"/>
+              </w:rPr>
+              <w:t xml:space="preserve"> sin correrse a ningún lado; se muestra solo el día. La fecha contractual de entrega es un hito de referencia, no una restricción.</w:t>
+            </w:r>
+          </w:p>
+        </w:tc>
+      </w:tr>
+      <w:tr>
+        <w:trPr>
+          <w:cantSplit/>
+        </w:trPr>
+        <w:tc>
+          <w:tcPr>
+            <w:tcW w:type="dxa" w:w="1100"/>
+            <w:tcMar>
+              <w:top w:type="dxa" w:w="70"/>
+              <w:left w:type="dxa" w:w="110"/>
+              <w:bottom w:type="dxa" w:w="70"/>
+              <w:right w:type="dxa" w:w="110"/>
+            </w:tcMar>
+          </w:tcPr>
+          <w:p>
+            <w:pPr>
+              <w:spacing w:after="30"/>
+            </w:pPr>
+            <w:r>
+              <w:rPr>
+                <w:rFonts w:ascii="Calibri" w:cs="Calibri" w:eastAsia="Calibri" w:hAnsi="Calibri"/>
+                <w:color w:val="1F2933"/>
+                <w:sz w:val="18"/>
+                <w:szCs w:val="18"/>
+              </w:rPr>
+              <w:t xml:space="preserve">RN-29</w:t>
+            </w:r>
+          </w:p>
+        </w:tc>
+        <w:tc>
+          <w:tcPr>
+            <w:tcW w:type="dxa" w:w="8260"/>
+            <w:tcMar>
+              <w:top w:type="dxa" w:w="70"/>
+              <w:left w:type="dxa" w:w="110"/>
+              <w:bottom w:type="dxa" w:w="70"/>
+              <w:right w:type="dxa" w:w="110"/>
+            </w:tcMar>
+          </w:tcPr>
+          <w:p>
+            <w:pPr>
+              <w:spacing w:after="30"/>
+            </w:pPr>
+            <w:r>
+              <w:rPr>
+                <w:rFonts w:ascii="Calibri" w:cs="Calibri" w:eastAsia="Calibri" w:hAnsi="Calibri"/>
+                <w:b/>
+                <w:bCs/>
+                <w:color w:val="1F2933"/>
+                <w:sz w:val="18"/>
+                <w:szCs w:val="18"/>
+              </w:rPr>
+              <w:t xml:space="preserve">El desfase de una dependencia se cuenta en el calendario de la sucesora.</w:t>
+            </w:r>
+            <w:r>
+              <w:rPr>
+                <w:rFonts w:ascii="Calibri" w:cs="Calibri" w:eastAsia="Calibri" w:hAnsi="Calibri"/>
+                <w:color w:val="1F2933"/>
+                <w:sz w:val="18"/>
+                <w:szCs w:val="18"/>
+              </w:rPr>
+              <w:t xml:space="preserve"> Los desfases son para traslapos; las esperas físicas (curado, fabricación, trámites) son actividades con su calendario, para que se vean en el Gantt.</w:t>
+            </w:r>
+          </w:p>
+        </w:tc>
+      </w:tr>
+      <w:tr>
+        <w:trPr>
+          <w:cantSplit/>
+        </w:trPr>
+        <w:tc>
+          <w:tcPr>
+            <w:tcW w:type="dxa" w:w="1100"/>
+            <w:shd w:fill="F7F9FA" w:color="auto" w:val="clear"/>
+            <w:tcMar>
+              <w:top w:type="dxa" w:w="70"/>
+              <w:left w:type="dxa" w:w="110"/>
+              <w:bottom w:type="dxa" w:w="70"/>
+              <w:right w:type="dxa" w:w="110"/>
+            </w:tcMar>
+          </w:tcPr>
+          <w:p>
+            <w:pPr>
+              <w:spacing w:after="30"/>
+            </w:pPr>
+            <w:r>
+              <w:rPr>
+                <w:rFonts w:ascii="Calibri" w:cs="Calibri" w:eastAsia="Calibri" w:hAnsi="Calibri"/>
+                <w:color w:val="1F2933"/>
+                <w:sz w:val="18"/>
+                <w:szCs w:val="18"/>
+              </w:rPr>
+              <w:t xml:space="preserve">RN-30</w:t>
+            </w:r>
+          </w:p>
+        </w:tc>
+        <w:tc>
+          <w:tcPr>
+            <w:tcW w:type="dxa" w:w="8260"/>
+            <w:shd w:fill="F7F9FA" w:color="auto" w:val="clear"/>
+            <w:tcMar>
+              <w:top w:type="dxa" w:w="70"/>
+              <w:left w:type="dxa" w:w="110"/>
+              <w:bottom w:type="dxa" w:w="70"/>
+              <w:right w:type="dxa" w:w="110"/>
+            </w:tcMar>
+          </w:tcPr>
+          <w:p>
+            <w:pPr>
+              <w:spacing w:after="30"/>
+            </w:pPr>
+            <w:r>
+              <w:rPr>
+                <w:rFonts w:ascii="Calibri" w:cs="Calibri" w:eastAsia="Calibri" w:hAnsi="Calibri"/>
+                <w:b/>
+                <w:bCs/>
+                <w:color w:val="1F2933"/>
+                <w:sz w:val="18"/>
+                <w:szCs w:val="18"/>
+              </w:rPr>
+              <w:t xml:space="preserve">La única restricción de fecha es «no antes de».</w:t>
+            </w:r>
+            <w:r>
+              <w:rPr>
+                <w:rFonts w:ascii="Calibri" w:cs="Calibri" w:eastAsia="Calibri" w:hAnsi="Calibri"/>
+                <w:color w:val="1F2933"/>
+                <w:sz w:val="18"/>
+                <w:szCs w:val="18"/>
+              </w:rPr>
+              <w:t xml:space="preserve"> El inicio es el mayor entre lo que dan las predecesoras y la restricción. Las de «debe terminar el» no entran: producen holguras negativas.</w:t>
+            </w:r>
+          </w:p>
+        </w:tc>
+      </w:tr>
+      <w:tr>
+        <w:trPr>
+          <w:cantSplit/>
+        </w:trPr>
+        <w:tc>
+          <w:tcPr>
+            <w:tcW w:type="dxa" w:w="1100"/>
+            <w:tcMar>
+              <w:top w:type="dxa" w:w="70"/>
+              <w:left w:type="dxa" w:w="110"/>
+              <w:bottom w:type="dxa" w:w="70"/>
+              <w:right w:type="dxa" w:w="110"/>
+            </w:tcMar>
+          </w:tcPr>
+          <w:p>
+            <w:pPr>
+              <w:spacing w:after="30"/>
+            </w:pPr>
+            <w:r>
+              <w:rPr>
+                <w:rFonts w:ascii="Calibri" w:cs="Calibri" w:eastAsia="Calibri" w:hAnsi="Calibri"/>
+                <w:color w:val="1F2933"/>
+                <w:sz w:val="18"/>
+                <w:szCs w:val="18"/>
+              </w:rPr>
+              <w:t xml:space="preserve">RN-31</w:t>
+            </w:r>
+          </w:p>
+        </w:tc>
+        <w:tc>
+          <w:tcPr>
+            <w:tcW w:type="dxa" w:w="8260"/>
+            <w:tcMar>
+              <w:top w:type="dxa" w:w="70"/>
+              <w:left w:type="dxa" w:w="110"/>
+              <w:bottom w:type="dxa" w:w="70"/>
+              <w:right w:type="dxa" w:w="110"/>
+            </w:tcMar>
+          </w:tcPr>
+          <w:p>
+            <w:pPr>
+              <w:spacing w:after="30"/>
+            </w:pPr>
+            <w:r>
+              <w:rPr>
+                <w:rFonts w:ascii="Calibri" w:cs="Calibri" w:eastAsia="Calibri" w:hAnsi="Calibri"/>
+                <w:b/>
+                <w:bCs/>
+                <w:color w:val="1F2933"/>
+                <w:sz w:val="18"/>
+                <w:szCs w:val="18"/>
+              </w:rPr>
+              <w:t xml:space="preserve">Una actividad es crítica si su holgura total es cero o menos.</w:t>
+            </w:r>
+            <w:r>
+              <w:rPr>
+                <w:rFonts w:ascii="Calibri" w:cs="Calibri" w:eastAsia="Calibri" w:hAnsi="Calibri"/>
+                <w:color w:val="1F2933"/>
+                <w:sz w:val="18"/>
+                <w:szCs w:val="18"/>
+              </w:rPr>
+              <w:t xml:space="preserve"> La holgura se muestra en la tabla.</w:t>
+            </w:r>
+          </w:p>
+        </w:tc>
+      </w:tr>
+      <w:tr>
+        <w:trPr>
+          <w:cantSplit/>
+        </w:trPr>
+        <w:tc>
+          <w:tcPr>
+            <w:tcW w:type="dxa" w:w="1100"/>
+            <w:shd w:fill="F7F9FA" w:color="auto" w:val="clear"/>
+            <w:tcMar>
+              <w:top w:type="dxa" w:w="70"/>
+              <w:left w:type="dxa" w:w="110"/>
+              <w:bottom w:type="dxa" w:w="70"/>
+              <w:right w:type="dxa" w:w="110"/>
+            </w:tcMar>
+          </w:tcPr>
+          <w:p>
+            <w:pPr>
+              <w:spacing w:after="30"/>
+            </w:pPr>
+            <w:r>
+              <w:rPr>
+                <w:rFonts w:ascii="Calibri" w:cs="Calibri" w:eastAsia="Calibri" w:hAnsi="Calibri"/>
+                <w:color w:val="1F2933"/>
+                <w:sz w:val="18"/>
+                <w:szCs w:val="18"/>
+              </w:rPr>
+              <w:t xml:space="preserve">RN-32</w:t>
+            </w:r>
+          </w:p>
+        </w:tc>
+        <w:tc>
+          <w:tcPr>
+            <w:tcW w:type="dxa" w:w="8260"/>
+            <w:shd w:fill="F7F9FA" w:color="auto" w:val="clear"/>
+            <w:tcMar>
+              <w:top w:type="dxa" w:w="70"/>
+              <w:left w:type="dxa" w:w="110"/>
+              <w:bottom w:type="dxa" w:w="70"/>
+              <w:right w:type="dxa" w:w="110"/>
+            </w:tcMar>
+          </w:tcPr>
+          <w:p>
+            <w:pPr>
+              <w:spacing w:after="30"/>
+            </w:pPr>
+            <w:r>
+              <w:rPr>
+                <w:rFonts w:ascii="Calibri" w:cs="Calibri" w:eastAsia="Calibri" w:hAnsi="Calibri"/>
+                <w:b/>
+                <w:bCs/>
+                <w:color w:val="1F2933"/>
+                <w:sz w:val="18"/>
+                <w:szCs w:val="18"/>
+              </w:rPr>
+              <w:t xml:space="preserve">La lluvia no alarga las actividades: dimensiona el colchón.</w:t>
+            </w:r>
+            <w:r>
+              <w:rPr>
+                <w:rFonts w:ascii="Calibri" w:cs="Calibri" w:eastAsia="Calibri" w:hAnsi="Calibri"/>
+                <w:color w:val="1F2933"/>
+                <w:sz w:val="18"/>
+                <w:szCs w:val="18"/>
+              </w:rPr>
+              <w:t xml:space="preserve"> Cada actividad tiene un porcentaje de contingencia, heredado del proyecto o de su capítulo y editable. Fechas y costos usan la duración base. El colchón sugerido es la suma de la contingencia de las actividades de la ruta crítica; el usuario lo puede cambiar. El colchón es una actividad al final, sin costo.</w:t>
+            </w:r>
+          </w:p>
+        </w:tc>
+      </w:tr>
+      <w:tr>
+        <w:trPr>
+          <w:cantSplit/>
+        </w:trPr>
+        <w:tc>
+          <w:tcPr>
+            <w:tcW w:type="dxa" w:w="1100"/>
+            <w:tcMar>
+              <w:top w:type="dxa" w:w="70"/>
+              <w:left w:type="dxa" w:w="110"/>
+              <w:bottom w:type="dxa" w:w="70"/>
+              <w:right w:type="dxa" w:w="110"/>
+            </w:tcMar>
+          </w:tcPr>
+          <w:p>
+            <w:pPr>
+              <w:spacing w:after="30"/>
+            </w:pPr>
+            <w:r>
+              <w:rPr>
+                <w:rFonts w:ascii="Calibri" w:cs="Calibri" w:eastAsia="Calibri" w:hAnsi="Calibri"/>
+                <w:color w:val="1F2933"/>
+                <w:sz w:val="18"/>
+                <w:szCs w:val="18"/>
+              </w:rPr>
+              <w:t xml:space="preserve">RN-33</w:t>
+            </w:r>
+          </w:p>
+        </w:tc>
+        <w:tc>
+          <w:tcPr>
+            <w:tcW w:type="dxa" w:w="8260"/>
+            <w:tcMar>
+              <w:top w:type="dxa" w:w="70"/>
+              <w:left w:type="dxa" w:w="110"/>
+              <w:bottom w:type="dxa" w:w="70"/>
+              <w:right w:type="dxa" w:w="110"/>
+            </w:tcMar>
+          </w:tcPr>
+          <w:p>
+            <w:pPr>
+              <w:spacing w:after="30"/>
+            </w:pPr>
+            <w:r>
+              <w:rPr>
+                <w:rFonts w:ascii="Calibri" w:cs="Calibri" w:eastAsia="Calibri" w:hAnsi="Calibri"/>
+                <w:b/>
+                <w:bCs/>
+                <w:color w:val="1F2933"/>
+                <w:sz w:val="18"/>
+                <w:szCs w:val="18"/>
+              </w:rPr>
+              <w:t xml:space="preserve">El presupuesto manda sobre el cronograma.</w:t>
+            </w:r>
+            <w:r>
+              <w:rPr>
+                <w:rFonts w:ascii="Calibri" w:cs="Calibri" w:eastAsia="Calibri" w:hAnsi="Calibri"/>
+                <w:color w:val="1F2933"/>
+                <w:sz w:val="18"/>
+                <w:szCs w:val="18"/>
+              </w:rPr>
+              <w:t xml:space="preserve"> Un ítem nuevo aparece sin dependencias, con su duración calculada y marcado «sin programar». Un ítem que desaparece no se borra solo: se marca «ya no está en el presupuesto» y lo borra el usuario, que así ve qué cadena se rompe. Las cuadrillas se conservan al recalcular.</w:t>
+            </w:r>
+          </w:p>
+        </w:tc>
+      </w:tr>
+      <w:tr>
+        <w:trPr>
+          <w:cantSplit/>
+        </w:trPr>
+        <w:tc>
+          <w:tcPr>
+            <w:tcW w:type="dxa" w:w="1100"/>
+            <w:shd w:fill="F7F9FA" w:color="auto" w:val="clear"/>
+            <w:tcMar>
+              <w:top w:type="dxa" w:w="70"/>
+              <w:left w:type="dxa" w:w="110"/>
+              <w:bottom w:type="dxa" w:w="70"/>
+              <w:right w:type="dxa" w:w="110"/>
+            </w:tcMar>
+          </w:tcPr>
+          <w:p>
+            <w:pPr>
+              <w:spacing w:after="30"/>
+            </w:pPr>
+            <w:r>
+              <w:rPr>
+                <w:rFonts w:ascii="Calibri" w:cs="Calibri" w:eastAsia="Calibri" w:hAnsi="Calibri"/>
+                <w:color w:val="1F2933"/>
+                <w:sz w:val="18"/>
+                <w:szCs w:val="18"/>
+              </w:rPr>
+              <w:t xml:space="preserve">RN-34</w:t>
+            </w:r>
+          </w:p>
+        </w:tc>
+        <w:tc>
+          <w:tcPr>
+            <w:tcW w:type="dxa" w:w="8260"/>
+            <w:shd w:fill="F7F9FA" w:color="auto" w:val="clear"/>
+            <w:tcMar>
+              <w:top w:type="dxa" w:w="70"/>
+              <w:left w:type="dxa" w:w="110"/>
+              <w:bottom w:type="dxa" w:w="70"/>
+              <w:right w:type="dxa" w:w="110"/>
+            </w:tcMar>
+          </w:tcPr>
+          <w:p>
+            <w:pPr>
+              <w:spacing w:after="30"/>
+            </w:pPr>
+            <w:r>
+              <w:rPr>
+                <w:rFonts w:ascii="Calibri" w:cs="Calibri" w:eastAsia="Calibri" w:hAnsi="Calibri"/>
+                <w:b/>
+                <w:bCs/>
+                <w:color w:val="1F2933"/>
+                <w:sz w:val="18"/>
+                <w:szCs w:val="18"/>
+              </w:rPr>
+              <w:t xml:space="preserve">Se programa con el presupuesto Abierto o Activo.</w:t>
+            </w:r>
+            <w:r>
+              <w:rPr>
+                <w:rFonts w:ascii="Calibri" w:cs="Calibri" w:eastAsia="Calibri" w:hAnsi="Calibri"/>
+                <w:color w:val="1F2933"/>
+                <w:sz w:val="18"/>
+                <w:szCs w:val="18"/>
+              </w:rPr>
+              <w:t xml:space="preserve"> Con el presupuesto Cerrado, el cronograma es de solo lectura.</w:t>
+            </w:r>
+          </w:p>
+        </w:tc>
+      </w:tr>
+      <w:tr>
+        <w:trPr>
+          <w:cantSplit/>
+        </w:trPr>
+        <w:tc>
+          <w:tcPr>
+            <w:tcW w:type="dxa" w:w="1100"/>
+            <w:tcMar>
+              <w:top w:type="dxa" w:w="70"/>
+              <w:left w:type="dxa" w:w="110"/>
+              <w:bottom w:type="dxa" w:w="70"/>
+              <w:right w:type="dxa" w:w="110"/>
+            </w:tcMar>
+          </w:tcPr>
+          <w:p>
+            <w:pPr>
+              <w:spacing w:after="30"/>
+            </w:pPr>
+            <w:r>
+              <w:rPr>
+                <w:rFonts w:ascii="Calibri" w:cs="Calibri" w:eastAsia="Calibri" w:hAnsi="Calibri"/>
+                <w:color w:val="1F2933"/>
+                <w:sz w:val="18"/>
+                <w:szCs w:val="18"/>
+              </w:rPr>
+              <w:t xml:space="preserve">RN-35</w:t>
+            </w:r>
+          </w:p>
+        </w:tc>
+        <w:tc>
+          <w:tcPr>
+            <w:tcW w:type="dxa" w:w="8260"/>
+            <w:tcMar>
+              <w:top w:type="dxa" w:w="70"/>
+              <w:left w:type="dxa" w:w="110"/>
+              <w:bottom w:type="dxa" w:w="70"/>
+              <w:right w:type="dxa" w:w="110"/>
+            </w:tcMar>
+          </w:tcPr>
+          <w:p>
+            <w:pPr>
+              <w:spacing w:after="30"/>
+            </w:pPr>
+            <w:r>
+              <w:rPr>
+                <w:rFonts w:ascii="Calibri" w:cs="Calibri" w:eastAsia="Calibri" w:hAnsi="Calibri"/>
+                <w:b/>
+                <w:bCs/>
+                <w:color w:val="1F2933"/>
+                <w:sz w:val="18"/>
+                <w:szCs w:val="18"/>
+              </w:rPr>
+              <w:t xml:space="preserve">El calendario avisa, no bloquea.</w:t>
+            </w:r>
+            <w:r>
+              <w:rPr>
+                <w:rFonts w:ascii="Calibri" w:cs="Calibri" w:eastAsia="Calibri" w:hAnsi="Calibri"/>
+                <w:color w:val="1F2933"/>
+                <w:sz w:val="18"/>
+                <w:szCs w:val="18"/>
+              </w:rPr>
+              <w:t xml:space="preserve"> Por encima de la jornada ordinaria (42 h, desde el 15 de julio de 2026) avisa que si lo cubre una cuadrilla el excedente es hora extra y cuesta más; por encima de 54 h, que tienen que ser turnos. Los dos umbrales son parámetros con vigencia (D-78), porque la ley los cambia.</w:t>
+            </w:r>
+          </w:p>
+        </w:tc>
+      </w:tr>
+      <w:tr>
+        <w:trPr>
+          <w:cantSplit/>
+        </w:trPr>
+        <w:tc>
+          <w:tcPr>
+            <w:tcW w:type="dxa" w:w="1100"/>
+            <w:shd w:fill="F7F9FA" w:color="auto" w:val="clear"/>
+            <w:tcMar>
+              <w:top w:type="dxa" w:w="70"/>
+              <w:left w:type="dxa" w:w="110"/>
+              <w:bottom w:type="dxa" w:w="70"/>
+              <w:right w:type="dxa" w:w="110"/>
+            </w:tcMar>
+          </w:tcPr>
+          <w:p>
+            <w:pPr>
+              <w:spacing w:after="30"/>
+            </w:pPr>
+            <w:r>
+              <w:rPr>
+                <w:rFonts w:ascii="Calibri" w:cs="Calibri" w:eastAsia="Calibri" w:hAnsi="Calibri"/>
+                <w:color w:val="1F2933"/>
+                <w:sz w:val="18"/>
+                <w:szCs w:val="18"/>
+              </w:rPr>
+              <w:t xml:space="preserve">RN-36</w:t>
+            </w:r>
+          </w:p>
+        </w:tc>
+        <w:tc>
+          <w:tcPr>
+            <w:tcW w:type="dxa" w:w="8260"/>
+            <w:shd w:fill="F7F9FA" w:color="auto" w:val="clear"/>
+            <w:tcMar>
+              <w:top w:type="dxa" w:w="70"/>
+              <w:left w:type="dxa" w:w="110"/>
+              <w:bottom w:type="dxa" w:w="70"/>
+              <w:right w:type="dxa" w:w="110"/>
+            </w:tcMar>
+          </w:tcPr>
+          <w:p>
+            <w:pPr>
+              <w:spacing w:after="30"/>
+            </w:pPr>
+            <w:r>
+              <w:rPr>
+                <w:rFonts w:ascii="Calibri" w:cs="Calibri" w:eastAsia="Calibri" w:hAnsi="Calibri"/>
+                <w:b/>
+                <w:bCs/>
+                <w:color w:val="1F2933"/>
+                <w:sz w:val="18"/>
+                <w:szCs w:val="18"/>
+              </w:rPr>
+              <w:t xml:space="preserve">El costo directo se reparte en línea recta sobre las horas laborables de cada actividad,</w:t>
+            </w:r>
+            <w:r>
+              <w:rPr>
+                <w:rFonts w:ascii="Calibri" w:cs="Calibri" w:eastAsia="Calibri" w:hAnsi="Calibri"/>
+                <w:color w:val="1F2933"/>
+                <w:sz w:val="18"/>
+                <w:szCs w:val="18"/>
+              </w:rPr>
+              <w:t xml:space="preserve"> con su duración base y en su calendario. Una actividad que cruza de mes reparte según las horas trabajadas en cada mes.</w:t>
+            </w:r>
+          </w:p>
+        </w:tc>
+      </w:tr>
+      <w:tr>
+        <w:trPr>
+          <w:cantSplit/>
+        </w:trPr>
+        <w:tc>
+          <w:tcPr>
+            <w:tcW w:type="dxa" w:w="1100"/>
+            <w:tcMar>
+              <w:top w:type="dxa" w:w="70"/>
+              <w:left w:type="dxa" w:w="110"/>
+              <w:bottom w:type="dxa" w:w="70"/>
+              <w:right w:type="dxa" w:w="110"/>
+            </w:tcMar>
+          </w:tcPr>
+          <w:p>
+            <w:pPr>
+              <w:spacing w:after="30"/>
+            </w:pPr>
+            <w:r>
+              <w:rPr>
+                <w:rFonts w:ascii="Calibri" w:cs="Calibri" w:eastAsia="Calibri" w:hAnsi="Calibri"/>
+                <w:color w:val="1F2933"/>
+                <w:sz w:val="18"/>
+                <w:szCs w:val="18"/>
+              </w:rPr>
+              <w:t xml:space="preserve">RN-37</w:t>
+            </w:r>
+          </w:p>
+        </w:tc>
+        <w:tc>
+          <w:tcPr>
+            <w:tcW w:type="dxa" w:w="8260"/>
+            <w:tcMar>
+              <w:top w:type="dxa" w:w="70"/>
+              <w:left w:type="dxa" w:w="110"/>
+              <w:bottom w:type="dxa" w:w="70"/>
+              <w:right w:type="dxa" w:w="110"/>
+            </w:tcMar>
+          </w:tcPr>
+          <w:p>
+            <w:pPr>
+              <w:spacing w:after="30"/>
+            </w:pPr>
+            <w:r>
+              <w:rPr>
+                <w:rFonts w:ascii="Calibri" w:cs="Calibri" w:eastAsia="Calibri" w:hAnsi="Calibri"/>
+                <w:b/>
+                <w:bCs/>
+                <w:color w:val="1F2933"/>
+                <w:sz w:val="18"/>
+                <w:szCs w:val="18"/>
+              </w:rPr>
+              <w:t xml:space="preserve">La administración del AIU va en la tarea «Administración y supervisión de obra»,</w:t>
+            </w:r>
+            <w:r>
+              <w:rPr>
+                <w:rFonts w:ascii="Calibri" w:cs="Calibri" w:eastAsia="Calibri" w:hAnsi="Calibri"/>
+                <w:color w:val="1F2933"/>
+                <w:sz w:val="18"/>
+                <w:szCs w:val="18"/>
+              </w:rPr>
+              <w:t xml:space="preserve"> que va del primer al último día de la duración base y la reparte por horas laborables. El colchón no tiene costo; muestra cuánto más costaría la administración si se consume.</w:t>
+            </w:r>
+          </w:p>
+        </w:tc>
+      </w:tr>
+      <w:tr>
+        <w:trPr>
+          <w:cantSplit/>
+        </w:trPr>
+        <w:tc>
+          <w:tcPr>
+            <w:tcW w:type="dxa" w:w="1100"/>
+            <w:shd w:fill="F7F9FA" w:color="auto" w:val="clear"/>
+            <w:tcMar>
+              <w:top w:type="dxa" w:w="70"/>
+              <w:left w:type="dxa" w:w="110"/>
+              <w:bottom w:type="dxa" w:w="70"/>
+              <w:right w:type="dxa" w:w="110"/>
+            </w:tcMar>
+          </w:tcPr>
+          <w:p>
+            <w:pPr>
+              <w:spacing w:after="30"/>
+            </w:pPr>
+            <w:r>
+              <w:rPr>
+                <w:rFonts w:ascii="Calibri" w:cs="Calibri" w:eastAsia="Calibri" w:hAnsi="Calibri"/>
+                <w:color w:val="1F2933"/>
+                <w:sz w:val="18"/>
+                <w:szCs w:val="18"/>
+              </w:rPr>
+              <w:t xml:space="preserve">RN-38</w:t>
+            </w:r>
+          </w:p>
+        </w:tc>
+        <w:tc>
+          <w:tcPr>
+            <w:tcW w:type="dxa" w:w="8260"/>
+            <w:shd w:fill="F7F9FA" w:color="auto" w:val="clear"/>
+            <w:tcMar>
+              <w:top w:type="dxa" w:w="70"/>
+              <w:left w:type="dxa" w:w="110"/>
+              <w:bottom w:type="dxa" w:w="70"/>
+              <w:right w:type="dxa" w:w="110"/>
+            </w:tcMar>
+          </w:tcPr>
+          <w:p>
+            <w:pPr>
+              <w:spacing w:after="30"/>
+            </w:pPr>
+            <w:r>
+              <w:rPr>
+                <w:rFonts w:ascii="Calibri" w:cs="Calibri" w:eastAsia="Calibri" w:hAnsi="Calibri"/>
+                <w:b/>
+                <w:bCs/>
+                <w:color w:val="1F2933"/>
+                <w:sz w:val="18"/>
+                <w:szCs w:val="18"/>
+              </w:rPr>
+              <w:t xml:space="preserve">La línea base guarda inicio, fin, duración, costo y el costo repartido por periodo.</w:t>
+            </w:r>
+            <w:r>
+              <w:rPr>
+                <w:rFonts w:ascii="Calibri" w:cs="Calibri" w:eastAsia="Calibri" w:hAnsi="Calibri"/>
+                <w:color w:val="1F2933"/>
+                <w:sz w:val="18"/>
+                <w:szCs w:val="18"/>
+              </w:rPr>
+              <w:t xml:space="preserve"> Así la curva S planeada no cambia cuando se toca el presupuesto.</w:t>
+            </w:r>
+          </w:p>
+        </w:tc>
+      </w:tr>
+    </w:tbl>
+    <w:p>
+      <w:pPr>
+        <w:spacing w:after="120"/>
+      </w:pPr>
+    </w:p>
+    <w:p>
+      <w:pPr>
+        <w:pStyle w:val="Heading2"/>
+        <w:spacing w:after="120" w:before="240"/>
+      </w:pPr>
+      <w:r>
+        <w:rPr>
+          <w:rFonts w:ascii="Calibri" w:cs="Calibri" w:eastAsia="Calibri" w:hAnsi="Calibri"/>
+          <w:b/>
+          <w:bCs/>
+          <w:color w:val="13496B"/>
+          <w:sz w:val="23"/>
+          <w:szCs w:val="23"/>
+        </w:rPr>
+        <w:t xml:space="preserve">6.5 Requisito no funcional</w:t>
+      </w:r>
+    </w:p>
+    <w:tbl>
+      <w:tblPr>
+        <w:tblW w:type="dxa" w:w="9360"/>
+        <w:tblBorders>
+          <w:top w:val="single" w:color="E4E8EC" w:sz="2"/>
+          <w:left w:val="none" w:color="FFFFFF" w:sz="0"/>
+          <w:bottom w:val="single" w:color="E4E8EC" w:sz="2"/>
+          <w:right w:val="none" w:color="FFFFFF" w:sz="0"/>
+          <w:insideH w:val="single" w:color="E4E8EC" w:sz="2"/>
+          <w:insideV w:val="none" w:color="FFFFFF" w:sz="0"/>
+        </w:tblBorders>
+      </w:tblPr>
+      <w:tblGrid>
+        <w:gridCol w:w="1700"/>
+        <w:gridCol w:w="7660"/>
+      </w:tblGrid>
+      <w:tr>
+        <w:trPr>
+          <w:cantSplit/>
+        </w:trPr>
+        <w:tc>
+          <w:tcPr>
+            <w:tcW w:type="dxa" w:w="1700"/>
+            <w:shd w:fill="F7F9FA" w:color="auto" w:val="clear"/>
+            <w:tcMar>
+              <w:top w:type="dxa" w:w="70"/>
+              <w:left w:type="dxa" w:w="110"/>
+              <w:bottom w:type="dxa" w:w="70"/>
+              <w:right w:type="dxa" w:w="110"/>
+            </w:tcMar>
+          </w:tcPr>
+          <w:p>
+            <w:pPr>
+              <w:spacing w:after="30"/>
+            </w:pPr>
+            <w:r>
+              <w:rPr>
+                <w:rFonts w:ascii="Calibri" w:cs="Calibri" w:eastAsia="Calibri" w:hAnsi="Calibri"/>
+                <w:b/>
+                <w:bCs/>
+                <w:color w:val="13496B"/>
+                <w:sz w:val="18"/>
+                <w:szCs w:val="18"/>
+              </w:rPr>
+              <w:t xml:space="preserve">RNF-29</w:t>
+            </w:r>
+          </w:p>
+        </w:tc>
+        <w:tc>
+          <w:tcPr>
+            <w:tcW w:type="dxa" w:w="7660"/>
+            <w:shd w:fill="F7F9FA" w:color="auto" w:val="clear"/>
+            <w:tcMar>
+              <w:top w:type="dxa" w:w="70"/>
+              <w:left w:type="dxa" w:w="110"/>
+              <w:bottom w:type="dxa" w:w="70"/>
+              <w:right w:type="dxa" w:w="110"/>
+            </w:tcMar>
+          </w:tcPr>
+          <w:p>
+            <w:pPr>
+              <w:spacing w:after="30"/>
+            </w:pPr>
+            <w:r>
+              <w:rPr>
+                <w:rFonts w:ascii="Calibri" w:cs="Calibri" w:eastAsia="Calibri" w:hAnsi="Calibri"/>
+                <w:b/>
+                <w:bCs/>
+                <w:color w:val="1F2933"/>
+                <w:sz w:val="18"/>
+                <w:szCs w:val="18"/>
+              </w:rPr>
+              <w:t xml:space="preserve">El cronograma de un presupuesto grande se calcula y se dibuja sin esperas</w:t>
+            </w:r>
+          </w:p>
+        </w:tc>
+      </w:tr>
+      <w:tr>
+        <w:trPr>
+          <w:cantSplit/>
+        </w:trPr>
+        <w:tc>
+          <w:tcPr>
+            <w:tcW w:type="dxa" w:w="1700"/>
+            <w:tcMar>
+              <w:top w:type="dxa" w:w="70"/>
+              <w:left w:type="dxa" w:w="110"/>
+              <w:bottom w:type="dxa" w:w="70"/>
+              <w:right w:type="dxa" w:w="110"/>
+            </w:tcMar>
+          </w:tcPr>
+          <w:p>
+            <w:pPr>
+              <w:spacing w:after="30"/>
+            </w:pPr>
+            <w:r>
+              <w:rPr>
+                <w:rFonts w:ascii="Calibri" w:cs="Calibri" w:eastAsia="Calibri" w:hAnsi="Calibri"/>
+                <w:color w:val="7A8896"/>
+                <w:sz w:val="18"/>
+                <w:szCs w:val="18"/>
+              </w:rPr>
+              <w:t xml:space="preserve">Qué</w:t>
+            </w:r>
+          </w:p>
+        </w:tc>
+        <w:tc>
+          <w:tcPr>
+            <w:tcW w:type="dxa" w:w="7660"/>
+            <w:tcMar>
+              <w:top w:type="dxa" w:w="70"/>
+              <w:left w:type="dxa" w:w="110"/>
+              <w:bottom w:type="dxa" w:w="70"/>
+              <w:right w:type="dxa" w:w="110"/>
+            </w:tcMar>
+          </w:tcPr>
+          <w:p>
+            <w:pPr>
+              <w:spacing w:after="30"/>
+            </w:pPr>
+            <w:r>
+              <w:rPr>
+                <w:rFonts w:ascii="Calibri" w:cs="Calibri" w:eastAsia="Calibri" w:hAnsi="Calibri"/>
+                <w:color w:val="1F2933"/>
+                <w:sz w:val="18"/>
+                <w:szCs w:val="18"/>
+              </w:rPr>
+              <w:t xml:space="preserve">Con 1.500 actividades, el cálculo completo (fechas, holguras, ruta crítica y reparto de costo) y el Gantt tienen que responder sin que el usuario espere. El Gantt dibuja solo las filas visibles.</w:t>
+            </w:r>
+          </w:p>
+        </w:tc>
+      </w:tr>
+      <w:tr>
+        <w:trPr>
+          <w:cantSplit/>
+        </w:trPr>
+        <w:tc>
+          <w:tcPr>
+            <w:tcW w:type="dxa" w:w="1700"/>
+            <w:tcMar>
+              <w:top w:type="dxa" w:w="70"/>
+              <w:left w:type="dxa" w:w="110"/>
+              <w:bottom w:type="dxa" w:w="70"/>
+              <w:right w:type="dxa" w:w="110"/>
+            </w:tcMar>
+          </w:tcPr>
+          <w:p>
+            <w:pPr>
+              <w:spacing w:after="30"/>
+            </w:pPr>
+            <w:r>
+              <w:rPr>
+                <w:rFonts w:ascii="Calibri" w:cs="Calibri" w:eastAsia="Calibri" w:hAnsi="Calibri"/>
+                <w:color w:val="7A8896"/>
+                <w:sz w:val="18"/>
+                <w:szCs w:val="18"/>
+              </w:rPr>
+              <w:t xml:space="preserve">Se acepta si</w:t>
+            </w:r>
+          </w:p>
+        </w:tc>
+        <w:tc>
+          <w:tcPr>
+            <w:tcW w:type="dxa" w:w="7660"/>
+            <w:tcMar>
+              <w:top w:type="dxa" w:w="70"/>
+              <w:left w:type="dxa" w:w="110"/>
+              <w:bottom w:type="dxa" w:w="70"/>
+              <w:right w:type="dxa" w:w="110"/>
+            </w:tcMar>
+          </w:tcPr>
+          <w:p>
+            <w:pPr>
+              <w:spacing w:after="30"/>
+            </w:pPr>
+            <w:r>
+              <w:rPr>
+                <w:rFonts w:ascii="Calibri" w:cs="Calibri" w:eastAsia="Calibri" w:hAnsi="Calibri"/>
+                <w:color w:val="1F2933"/>
+                <w:sz w:val="18"/>
+                <w:szCs w:val="18"/>
+              </w:rPr>
+              <w:t xml:space="preserve">Meta a medir sobre un presupuesto de 1.500 actividades y 3.000 dependencias: cálculo completo en menos de 500 ms y Gantt que se desplaza sin saltos. Las cifras se fijan al medir, como se hizo con la EDT.</w:t>
+            </w:r>
+          </w:p>
+        </w:tc>
+      </w:tr>
+    </w:tbl>
+    <w:p>
+      <w:pPr>
+        <w:spacing w:after="120"/>
+      </w:pPr>
+    </w:p>
+    <w:p>
+      <w:pPr>
+        <w:pStyle w:val="Heading2"/>
+        <w:spacing w:after="120" w:before="240"/>
+      </w:pPr>
+      <w:r>
+        <w:rPr>
+          <w:rFonts w:ascii="Calibri" w:cs="Calibri" w:eastAsia="Calibri" w:hAnsi="Calibri"/>
+          <w:b/>
+          <w:bCs/>
+          <w:color w:val="13496B"/>
+          <w:sz w:val="23"/>
+          <w:szCs w:val="23"/>
+        </w:rPr>
+        <w:t xml:space="preserve">6.6 El Gantt</w:t>
+      </w:r>
+    </w:p>
+    <w:p>
+      <w:pPr>
+        <w:spacing w:after="140" w:line="288"/>
+      </w:pPr>
+      <w:r>
+        <w:rPr>
+          <w:rFonts w:ascii="Calibri" w:cs="Calibri" w:eastAsia="Calibri" w:hAnsi="Calibri"/>
+          <w:color w:val="1F2933"/>
+          <w:sz w:val="21"/>
+          <w:szCs w:val="21"/>
+        </w:rPr>
+        <w:t xml:space="preserve">Es la vista principal del módulo: muestra el tiempo previsto de cada actividad dentro de la duración total de la obra.</w:t>
+      </w:r>
+    </w:p>
+    <w:p>
+      <w:pPr>
+        <w:pStyle w:val="ListParagraph"/>
+        <w:numPr>
+          <w:ilvl w:val="0"/>
+          <w:numId w:val="2"/>
+        </w:numPr>
+        <w:spacing w:after="80" w:line="276"/>
+      </w:pPr>
+      <w:r>
+        <w:rPr>
+          <w:rFonts w:ascii="Calibri" w:cs="Calibri" w:eastAsia="Calibri" w:hAnsi="Calibri"/>
+          <w:color w:val="1F2933"/>
+          <w:sz w:val="21"/>
+          <w:szCs w:val="21"/>
+        </w:rPr>
+        <w:t xml:space="preserve">Barras por EDT, con los capítulos como barras resumen; ruta crítica resaltada; flechas de dependencia; hitos como rombos.</w:t>
+      </w:r>
+    </w:p>
+    <w:p>
+      <w:pPr>
+        <w:pStyle w:val="ListParagraph"/>
+        <w:numPr>
+          <w:ilvl w:val="0"/>
+          <w:numId w:val="2"/>
+        </w:numPr>
+        <w:spacing w:after="80" w:line="276"/>
+      </w:pPr>
+      <w:r>
+        <w:rPr>
+          <w:rFonts w:ascii="Calibri" w:cs="Calibri" w:eastAsia="Calibri" w:hAnsi="Calibri"/>
+          <w:color w:val="1F2933"/>
+          <w:sz w:val="21"/>
+          <w:szCs w:val="21"/>
+        </w:rPr>
+        <w:t xml:space="preserve">Línea de fecha de corte; tiempo no laborable sombreado (domingos, festivos, la tarde del sábado); zoom por día, semana o mes.</w:t>
+      </w:r>
+    </w:p>
+    <w:p>
+      <w:pPr>
+        <w:pStyle w:val="ListParagraph"/>
+        <w:numPr>
+          <w:ilvl w:val="0"/>
+          <w:numId w:val="2"/>
+        </w:numPr>
+        <w:spacing w:after="80" w:line="276"/>
+      </w:pPr>
+      <w:r>
+        <w:rPr>
+          <w:rFonts w:ascii="Calibri" w:cs="Calibri" w:eastAsia="Calibri" w:hAnsi="Calibri"/>
+          <w:b/>
+          <w:bCs/>
+          <w:color w:val="1F2933"/>
+          <w:sz w:val="21"/>
+          <w:szCs w:val="21"/>
+        </w:rPr>
+        <w:t xml:space="preserve">De solo lectura en esta versión:</w:t>
+      </w:r>
+      <w:r>
+        <w:rPr>
+          <w:rFonts w:ascii="Calibri" w:cs="Calibri" w:eastAsia="Calibri" w:hAnsi="Calibri"/>
+          <w:color w:val="1F2933"/>
+          <w:sz w:val="21"/>
+          <w:szCs w:val="21"/>
+        </w:rPr>
+        <w:t xml:space="preserve"> se edita en la tabla de al lado. Clic en una barra selecciona su fila. No se arrastran barras: la fecha sale del cálculo, y arrastrar obligaría a decidir si eso cambia la duración, crea una restricción o mueve una dependencia.</w:t>
+      </w:r>
+    </w:p>
+    <w:p>
+      <w:pPr>
+        <w:pStyle w:val="Heading2"/>
+        <w:spacing w:after="120" w:before="240"/>
+      </w:pPr>
+      <w:r>
+        <w:rPr>
+          <w:rFonts w:ascii="Calibri" w:cs="Calibri" w:eastAsia="Calibri" w:hAnsi="Calibri"/>
+          <w:b/>
+          <w:bCs/>
+          <w:color w:val="13496B"/>
+          <w:sz w:val="23"/>
+          <w:szCs w:val="23"/>
+        </w:rPr>
+        <w:t xml:space="preserve">6.7 Modelo de datos propuesto</w:t>
+      </w:r>
+    </w:p>
+    <w:p>
+      <w:pPr>
+        <w:spacing w:after="140" w:line="288"/>
+      </w:pPr>
+      <w:r>
+        <w:rPr>
+          <w:rFonts w:ascii="Calibri" w:cs="Calibri" w:eastAsia="Calibri" w:hAnsi="Calibri"/>
+          <w:color w:val="1F2933"/>
+          <w:sz w:val="21"/>
+          <w:szCs w:val="21"/>
+        </w:rPr>
+        <w:t xml:space="preserve">Toda tabla lleva tenant_id con RLS forzada y entra por migración. Los nombres son provisionales hasta escribir la migración.</w:t>
+      </w:r>
+    </w:p>
+    <w:tbl>
+      <w:tblPr>
+        <w:tblW w:type="dxa" w:w="9360"/>
+        <w:tblBorders>
+          <w:top w:val="single" w:color="E4E8EC" w:sz="2"/>
+          <w:left w:val="none" w:color="FFFFFF" w:sz="0"/>
+          <w:bottom w:val="single" w:color="E4E8EC" w:sz="2"/>
+          <w:right w:val="none" w:color="FFFFFF" w:sz="0"/>
+          <w:insideH w:val="single" w:color="E4E8EC" w:sz="2"/>
+          <w:insideV w:val="none" w:color="FFFFFF" w:sz="0"/>
+        </w:tblBorders>
+      </w:tblPr>
+      <w:tblGrid>
+        <w:gridCol w:w="2900"/>
+        <w:gridCol w:w="6460"/>
+      </w:tblGrid>
+      <w:tr>
+        <w:trPr>
+          <w:tblHeader/>
+        </w:trPr>
+        <w:tc>
+          <w:tcPr>
+            <w:tcW w:type="dxa" w:w="2900"/>
+            <w:shd w:fill="13496B" w:color="auto" w:val="clear"/>
+            <w:tcMar>
+              <w:top w:type="dxa" w:w="70"/>
+              <w:left w:type="dxa" w:w="110"/>
+              <w:bottom w:type="dxa" w:w="70"/>
+              <w:right w:type="dxa" w:w="110"/>
+            </w:tcMar>
+          </w:tcPr>
+          <w:p>
+            <w:pPr>
+              <w:spacing w:after="30"/>
+            </w:pPr>
+            <w:r>
+              <w:rPr>
+                <w:rFonts w:ascii="Calibri" w:cs="Calibri" w:eastAsia="Calibri" w:hAnsi="Calibri"/>
+                <w:b/>
+                <w:bCs/>
+                <w:color w:val="FFFFFF"/>
+                <w:sz w:val="18"/>
+                <w:szCs w:val="18"/>
+              </w:rPr>
+              <w:t xml:space="preserve">Tabla o campo</w:t>
+            </w:r>
+          </w:p>
+        </w:tc>
+        <w:tc>
+          <w:tcPr>
+            <w:tcW w:type="dxa" w:w="6460"/>
+            <w:shd w:fill="13496B" w:color="auto" w:val="clear"/>
+            <w:tcMar>
+              <w:top w:type="dxa" w:w="70"/>
+              <w:left w:type="dxa" w:w="110"/>
+              <w:bottom w:type="dxa" w:w="70"/>
+              <w:right w:type="dxa" w:w="110"/>
+            </w:tcMar>
+          </w:tcPr>
+          <w:p>
+            <w:pPr>
+              <w:spacing w:after="30"/>
+            </w:pPr>
+            <w:r>
+              <w:rPr>
+                <w:rFonts w:ascii="Calibri" w:cs="Calibri" w:eastAsia="Calibri" w:hAnsi="Calibri"/>
+                <w:b/>
+                <w:bCs/>
+                <w:color w:val="FFFFFF"/>
+                <w:sz w:val="18"/>
+                <w:szCs w:val="18"/>
+              </w:rPr>
+              <w:t xml:space="preserve">Para qué</w:t>
+            </w:r>
+          </w:p>
+        </w:tc>
+      </w:tr>
+      <w:tr>
+        <w:trPr>
+          <w:cantSplit/>
+        </w:trPr>
+        <w:tc>
+          <w:tcPr>
+            <w:tcW w:type="dxa" w:w="2900"/>
+            <w:tcMar>
+              <w:top w:type="dxa" w:w="70"/>
+              <w:left w:type="dxa" w:w="110"/>
+              <w:bottom w:type="dxa" w:w="70"/>
+              <w:right w:type="dxa" w:w="110"/>
+            </w:tcMar>
+          </w:tcPr>
+          <w:p>
+            <w:pPr>
+              <w:spacing w:after="30"/>
+            </w:pPr>
+            <w:r>
+              <w:rPr>
+                <w:rFonts w:ascii="Calibri" w:cs="Calibri" w:eastAsia="Calibri" w:hAnsi="Calibri"/>
+                <w:color w:val="1F2933"/>
+                <w:sz w:val="18"/>
+                <w:szCs w:val="18"/>
+              </w:rPr>
+              <w:t xml:space="preserve">configuracion_empresa.horas_por_jornal</w:t>
+            </w:r>
+          </w:p>
+        </w:tc>
+        <w:tc>
+          <w:tcPr>
+            <w:tcW w:type="dxa" w:w="6460"/>
+            <w:tcMar>
+              <w:top w:type="dxa" w:w="70"/>
+              <w:left w:type="dxa" w:w="110"/>
+              <w:bottom w:type="dxa" w:w="70"/>
+              <w:right w:type="dxa" w:w="110"/>
+            </w:tcMar>
+          </w:tcPr>
+          <w:p>
+            <w:pPr>
+              <w:spacing w:after="30"/>
+            </w:pPr>
+            <w:r>
+              <w:rPr>
+                <w:rFonts w:ascii="Calibri" w:cs="Calibri" w:eastAsia="Calibri" w:hAnsi="Calibri"/>
+                <w:color w:val="1F2933"/>
+                <w:sz w:val="18"/>
+                <w:szCs w:val="18"/>
+              </w:rPr>
+              <w:t xml:space="preserve">Lo que significa un jornal en los APU de la empresa.</w:t>
+            </w:r>
+          </w:p>
+        </w:tc>
+      </w:tr>
+      <w:tr>
+        <w:trPr>
+          <w:cantSplit/>
+        </w:trPr>
+        <w:tc>
+          <w:tcPr>
+            <w:tcW w:type="dxa" w:w="2900"/>
+            <w:shd w:fill="F7F9FA" w:color="auto" w:val="clear"/>
+            <w:tcMar>
+              <w:top w:type="dxa" w:w="70"/>
+              <w:left w:type="dxa" w:w="110"/>
+              <w:bottom w:type="dxa" w:w="70"/>
+              <w:right w:type="dxa" w:w="110"/>
+            </w:tcMar>
+          </w:tcPr>
+          <w:p>
+            <w:pPr>
+              <w:spacing w:after="30"/>
+            </w:pPr>
+            <w:r>
+              <w:rPr>
+                <w:rFonts w:ascii="Calibri" w:cs="Calibri" w:eastAsia="Calibri" w:hAnsi="Calibri"/>
+                <w:color w:val="1F2933"/>
+                <w:sz w:val="18"/>
+                <w:szCs w:val="18"/>
+              </w:rPr>
+              <w:t xml:space="preserve">presupuesto.horas_por_jornal</w:t>
+            </w:r>
+          </w:p>
+        </w:tc>
+        <w:tc>
+          <w:tcPr>
+            <w:tcW w:type="dxa" w:w="6460"/>
+            <w:shd w:fill="F7F9FA" w:color="auto" w:val="clear"/>
+            <w:tcMar>
+              <w:top w:type="dxa" w:w="70"/>
+              <w:left w:type="dxa" w:w="110"/>
+              <w:bottom w:type="dxa" w:w="70"/>
+              <w:right w:type="dxa" w:w="110"/>
+            </w:tcMar>
+          </w:tcPr>
+          <w:p>
+            <w:pPr>
+              <w:spacing w:after="30"/>
+            </w:pPr>
+            <w:r>
+              <w:rPr>
+                <w:rFonts w:ascii="Calibri" w:cs="Calibri" w:eastAsia="Calibri" w:hAnsi="Calibri"/>
+                <w:color w:val="1F2933"/>
+                <w:sz w:val="18"/>
+                <w:szCs w:val="18"/>
+              </w:rPr>
+              <w:t xml:space="preserve">La copia al crearlo; los presupuestos existentes la reciben en la migración.</w:t>
+            </w:r>
+          </w:p>
+        </w:tc>
+      </w:tr>
+      <w:tr>
+        <w:trPr>
+          <w:cantSplit/>
+        </w:trPr>
+        <w:tc>
+          <w:tcPr>
+            <w:tcW w:type="dxa" w:w="2900"/>
+            <w:tcMar>
+              <w:top w:type="dxa" w:w="70"/>
+              <w:left w:type="dxa" w:w="110"/>
+              <w:bottom w:type="dxa" w:w="70"/>
+              <w:right w:type="dxa" w:w="110"/>
+            </w:tcMar>
+          </w:tcPr>
+          <w:p>
+            <w:pPr>
+              <w:spacing w:after="30"/>
+            </w:pPr>
+            <w:r>
+              <w:rPr>
+                <w:rFonts w:ascii="Calibri" w:cs="Calibri" w:eastAsia="Calibri" w:hAnsi="Calibri"/>
+                <w:color w:val="1F2933"/>
+                <w:sz w:val="18"/>
+                <w:szCs w:val="18"/>
+              </w:rPr>
+              <w:t xml:space="preserve">unidad_medida.magnitud_tiempo</w:t>
+            </w:r>
+          </w:p>
+        </w:tc>
+        <w:tc>
+          <w:tcPr>
+            <w:tcW w:type="dxa" w:w="6460"/>
+            <w:tcMar>
+              <w:top w:type="dxa" w:w="70"/>
+              <w:left w:type="dxa" w:w="110"/>
+              <w:bottom w:type="dxa" w:w="70"/>
+              <w:right w:type="dxa" w:w="110"/>
+            </w:tcMar>
+          </w:tcPr>
+          <w:p>
+            <w:pPr>
+              <w:spacing w:after="30"/>
+            </w:pPr>
+            <w:r>
+              <w:rPr>
+                <w:rFonts w:ascii="Calibri" w:cs="Calibri" w:eastAsia="Calibri" w:hAnsi="Calibri"/>
+                <w:color w:val="1F2933"/>
+                <w:sz w:val="18"/>
+                <w:szCs w:val="18"/>
+              </w:rPr>
+              <w:t xml:space="preserve">HORA, DIA o NINGUNA.</w:t>
+            </w:r>
+          </w:p>
+        </w:tc>
+      </w:tr>
+      <w:tr>
+        <w:trPr>
+          <w:cantSplit/>
+        </w:trPr>
+        <w:tc>
+          <w:tcPr>
+            <w:tcW w:type="dxa" w:w="2900"/>
+            <w:shd w:fill="F7F9FA" w:color="auto" w:val="clear"/>
+            <w:tcMar>
+              <w:top w:type="dxa" w:w="70"/>
+              <w:left w:type="dxa" w:w="110"/>
+              <w:bottom w:type="dxa" w:w="70"/>
+              <w:right w:type="dxa" w:w="110"/>
+            </w:tcMar>
+          </w:tcPr>
+          <w:p>
+            <w:pPr>
+              <w:spacing w:after="30"/>
+            </w:pPr>
+            <w:r>
+              <w:rPr>
+                <w:rFonts w:ascii="Calibri" w:cs="Calibri" w:eastAsia="Calibri" w:hAnsi="Calibri"/>
+                <w:color w:val="1F2933"/>
+                <w:sz w:val="18"/>
+                <w:szCs w:val="18"/>
+              </w:rPr>
+              <w:t xml:space="preserve">calendario, calendario_tramo, calendario_excepcion</w:t>
+            </w:r>
+          </w:p>
+        </w:tc>
+        <w:tc>
+          <w:tcPr>
+            <w:tcW w:type="dxa" w:w="6460"/>
+            <w:shd w:fill="F7F9FA" w:color="auto" w:val="clear"/>
+            <w:tcMar>
+              <w:top w:type="dxa" w:w="70"/>
+              <w:left w:type="dxa" w:w="110"/>
+              <w:bottom w:type="dxa" w:w="70"/>
+              <w:right w:type="dxa" w:w="110"/>
+            </w:tcMar>
+          </w:tcPr>
+          <w:p>
+            <w:pPr>
+              <w:spacing w:after="30"/>
+            </w:pPr>
+            <w:r>
+              <w:rPr>
+                <w:rFonts w:ascii="Calibri" w:cs="Calibri" w:eastAsia="Calibri" w:hAnsi="Calibri"/>
+                <w:color w:val="1F2933"/>
+                <w:sz w:val="18"/>
+                <w:szCs w:val="18"/>
+              </w:rPr>
+              <w:t xml:space="preserve">Plantilla de la empresa y calendarios del proyecto; tramos por día de la semana; excepciones con la misma forma.</w:t>
+            </w:r>
+          </w:p>
+        </w:tc>
+      </w:tr>
+      <w:tr>
+        <w:trPr>
+          <w:cantSplit/>
+        </w:trPr>
+        <w:tc>
+          <w:tcPr>
+            <w:tcW w:type="dxa" w:w="2900"/>
+            <w:tcMar>
+              <w:top w:type="dxa" w:w="70"/>
+              <w:left w:type="dxa" w:w="110"/>
+              <w:bottom w:type="dxa" w:w="70"/>
+              <w:right w:type="dxa" w:w="110"/>
+            </w:tcMar>
+          </w:tcPr>
+          <w:p>
+            <w:pPr>
+              <w:spacing w:after="30"/>
+            </w:pPr>
+            <w:r>
+              <w:rPr>
+                <w:rFonts w:ascii="Calibri" w:cs="Calibri" w:eastAsia="Calibri" w:hAnsi="Calibri"/>
+                <w:color w:val="1F2933"/>
+                <w:sz w:val="18"/>
+                <w:szCs w:val="18"/>
+              </w:rPr>
+              <w:t xml:space="preserve">cronograma</w:t>
+            </w:r>
+          </w:p>
+        </w:tc>
+        <w:tc>
+          <w:tcPr>
+            <w:tcW w:type="dxa" w:w="6460"/>
+            <w:tcMar>
+              <w:top w:type="dxa" w:w="70"/>
+              <w:left w:type="dxa" w:w="110"/>
+              <w:bottom w:type="dxa" w:w="70"/>
+              <w:right w:type="dxa" w:w="110"/>
+            </w:tcMar>
+          </w:tcPr>
+          <w:p>
+            <w:pPr>
+              <w:spacing w:after="30"/>
+            </w:pPr>
+            <w:r>
+              <w:rPr>
+                <w:rFonts w:ascii="Calibri" w:cs="Calibri" w:eastAsia="Calibri" w:hAnsi="Calibri"/>
+                <w:color w:val="1F2933"/>
+                <w:sz w:val="18"/>
+                <w:szCs w:val="18"/>
+              </w:rPr>
+              <w:t xml:space="preserve">Uno por presupuesto: fecha de inicio, contingencia por defecto, colchón, fecha de corte.</w:t>
+            </w:r>
+          </w:p>
+        </w:tc>
+      </w:tr>
+      <w:tr>
+        <w:trPr>
+          <w:cantSplit/>
+        </w:trPr>
+        <w:tc>
+          <w:tcPr>
+            <w:tcW w:type="dxa" w:w="2900"/>
+            <w:shd w:fill="F7F9FA" w:color="auto" w:val="clear"/>
+            <w:tcMar>
+              <w:top w:type="dxa" w:w="70"/>
+              <w:left w:type="dxa" w:w="110"/>
+              <w:bottom w:type="dxa" w:w="70"/>
+              <w:right w:type="dxa" w:w="110"/>
+            </w:tcMar>
+          </w:tcPr>
+          <w:p>
+            <w:pPr>
+              <w:spacing w:after="30"/>
+            </w:pPr>
+            <w:r>
+              <w:rPr>
+                <w:rFonts w:ascii="Calibri" w:cs="Calibri" w:eastAsia="Calibri" w:hAnsi="Calibri"/>
+                <w:color w:val="1F2933"/>
+                <w:sz w:val="18"/>
+                <w:szCs w:val="18"/>
+              </w:rPr>
+              <w:t xml:space="preserve">actividad_programada</w:t>
+            </w:r>
+          </w:p>
+        </w:tc>
+        <w:tc>
+          <w:tcPr>
+            <w:tcW w:type="dxa" w:w="6460"/>
+            <w:shd w:fill="F7F9FA" w:color="auto" w:val="clear"/>
+            <w:tcMar>
+              <w:top w:type="dxa" w:w="70"/>
+              <w:left w:type="dxa" w:w="110"/>
+              <w:bottom w:type="dxa" w:w="70"/>
+              <w:right w:type="dxa" w:w="110"/>
+            </w:tcMar>
+          </w:tcPr>
+          <w:p>
+            <w:pPr>
+              <w:spacing w:after="30"/>
+            </w:pPr>
+            <w:r>
+              <w:rPr>
+                <w:rFonts w:ascii="Calibri" w:cs="Calibri" w:eastAsia="Calibri" w:hAnsi="Calibri"/>
+                <w:color w:val="1F2933"/>
+                <w:sz w:val="18"/>
+                <w:szCs w:val="18"/>
+              </w:rPr>
+              <w:t xml:space="preserve">Ítem, hito, actividad sin costo, administración o colchón; cuadrillas, horas calculadas, horas manuales, contingencia, «no antes de», calendario, fechas y holgura calculadas, marca de revisión.</w:t>
+            </w:r>
+          </w:p>
+        </w:tc>
+      </w:tr>
+      <w:tr>
+        <w:trPr>
+          <w:cantSplit/>
+        </w:trPr>
+        <w:tc>
+          <w:tcPr>
+            <w:tcW w:type="dxa" w:w="2900"/>
+            <w:tcMar>
+              <w:top w:type="dxa" w:w="70"/>
+              <w:left w:type="dxa" w:w="110"/>
+              <w:bottom w:type="dxa" w:w="70"/>
+              <w:right w:type="dxa" w:w="110"/>
+            </w:tcMar>
+          </w:tcPr>
+          <w:p>
+            <w:pPr>
+              <w:spacing w:after="30"/>
+            </w:pPr>
+            <w:r>
+              <w:rPr>
+                <w:rFonts w:ascii="Calibri" w:cs="Calibri" w:eastAsia="Calibri" w:hAnsi="Calibri"/>
+                <w:color w:val="1F2933"/>
+                <w:sz w:val="18"/>
+                <w:szCs w:val="18"/>
+              </w:rPr>
+              <w:t xml:space="preserve">contingencia_capitulo</w:t>
+            </w:r>
+          </w:p>
+        </w:tc>
+        <w:tc>
+          <w:tcPr>
+            <w:tcW w:type="dxa" w:w="6460"/>
+            <w:tcMar>
+              <w:top w:type="dxa" w:w="70"/>
+              <w:left w:type="dxa" w:w="110"/>
+              <w:bottom w:type="dxa" w:w="70"/>
+              <w:right w:type="dxa" w:w="110"/>
+            </w:tcMar>
+          </w:tcPr>
+          <w:p>
+            <w:pPr>
+              <w:spacing w:after="30"/>
+            </w:pPr>
+            <w:r>
+              <w:rPr>
+                <w:rFonts w:ascii="Calibri" w:cs="Calibri" w:eastAsia="Calibri" w:hAnsi="Calibri"/>
+                <w:color w:val="1F2933"/>
+                <w:sz w:val="18"/>
+                <w:szCs w:val="18"/>
+              </w:rPr>
+              <w:t xml:space="preserve">El porcentaje que un capítulo hereda a sus actividades.</w:t>
+            </w:r>
+          </w:p>
+        </w:tc>
+      </w:tr>
+      <w:tr>
+        <w:trPr>
+          <w:cantSplit/>
+        </w:trPr>
+        <w:tc>
+          <w:tcPr>
+            <w:tcW w:type="dxa" w:w="2900"/>
+            <w:shd w:fill="F7F9FA" w:color="auto" w:val="clear"/>
+            <w:tcMar>
+              <w:top w:type="dxa" w:w="70"/>
+              <w:left w:type="dxa" w:w="110"/>
+              <w:bottom w:type="dxa" w:w="70"/>
+              <w:right w:type="dxa" w:w="110"/>
+            </w:tcMar>
+          </w:tcPr>
+          <w:p>
+            <w:pPr>
+              <w:spacing w:after="30"/>
+            </w:pPr>
+            <w:r>
+              <w:rPr>
+                <w:rFonts w:ascii="Calibri" w:cs="Calibri" w:eastAsia="Calibri" w:hAnsi="Calibri"/>
+                <w:color w:val="1F2933"/>
+                <w:sz w:val="18"/>
+                <w:szCs w:val="18"/>
+              </w:rPr>
+              <w:t xml:space="preserve">dependencia</w:t>
+            </w:r>
+          </w:p>
+        </w:tc>
+        <w:tc>
+          <w:tcPr>
+            <w:tcW w:type="dxa" w:w="6460"/>
+            <w:shd w:fill="F7F9FA" w:color="auto" w:val="clear"/>
+            <w:tcMar>
+              <w:top w:type="dxa" w:w="70"/>
+              <w:left w:type="dxa" w:w="110"/>
+              <w:bottom w:type="dxa" w:w="70"/>
+              <w:right w:type="dxa" w:w="110"/>
+            </w:tcMar>
+          </w:tcPr>
+          <w:p>
+            <w:pPr>
+              <w:spacing w:after="30"/>
+            </w:pPr>
+            <w:r>
+              <w:rPr>
+                <w:rFonts w:ascii="Calibri" w:cs="Calibri" w:eastAsia="Calibri" w:hAnsi="Calibri"/>
+                <w:color w:val="1F2933"/>
+                <w:sz w:val="18"/>
+                <w:szCs w:val="18"/>
+              </w:rPr>
+              <w:t xml:space="preserve">Predecesora, sucesora, tipo y desfase en horas.</w:t>
+            </w:r>
+          </w:p>
+        </w:tc>
+      </w:tr>
+      <w:tr>
+        <w:trPr>
+          <w:cantSplit/>
+        </w:trPr>
+        <w:tc>
+          <w:tcPr>
+            <w:tcW w:type="dxa" w:w="2900"/>
+            <w:tcMar>
+              <w:top w:type="dxa" w:w="70"/>
+              <w:left w:type="dxa" w:w="110"/>
+              <w:bottom w:type="dxa" w:w="70"/>
+              <w:right w:type="dxa" w:w="110"/>
+            </w:tcMar>
+          </w:tcPr>
+          <w:p>
+            <w:pPr>
+              <w:spacing w:after="30"/>
+            </w:pPr>
+            <w:r>
+              <w:rPr>
+                <w:rFonts w:ascii="Calibri" w:cs="Calibri" w:eastAsia="Calibri" w:hAnsi="Calibri"/>
+                <w:color w:val="1F2933"/>
+                <w:sz w:val="18"/>
+                <w:szCs w:val="18"/>
+              </w:rPr>
+              <w:t xml:space="preserve">linea_base, linea_base_actividad, linea_base_periodo</w:t>
+            </w:r>
+          </w:p>
+        </w:tc>
+        <w:tc>
+          <w:tcPr>
+            <w:tcW w:type="dxa" w:w="6460"/>
+            <w:tcMar>
+              <w:top w:type="dxa" w:w="70"/>
+              <w:left w:type="dxa" w:w="110"/>
+              <w:bottom w:type="dxa" w:w="70"/>
+              <w:right w:type="dxa" w:w="110"/>
+            </w:tcMar>
+          </w:tcPr>
+          <w:p>
+            <w:pPr>
+              <w:spacing w:after="30"/>
+            </w:pPr>
+            <w:r>
+              <w:rPr>
+                <w:rFonts w:ascii="Calibri" w:cs="Calibri" w:eastAsia="Calibri" w:hAnsi="Calibri"/>
+                <w:color w:val="1F2933"/>
+                <w:sz w:val="18"/>
+                <w:szCs w:val="18"/>
+              </w:rPr>
+              <w:t xml:space="preserve">La foto: actividades y costo repartido por periodo.</w:t>
+            </w:r>
+          </w:p>
+        </w:tc>
+      </w:tr>
+    </w:tbl>
+    <w:p>
+      <w:pPr>
+        <w:spacing w:after="120"/>
+      </w:pPr>
+    </w:p>
+    <w:p>
+      <w:pPr>
+        <w:pStyle w:val="Heading2"/>
+        <w:spacing w:after="120" w:before="240"/>
+      </w:pPr>
+      <w:r>
+        <w:rPr>
+          <w:rFonts w:ascii="Calibri" w:cs="Calibri" w:eastAsia="Calibri" w:hAnsi="Calibri"/>
+          <w:b/>
+          <w:bCs/>
+          <w:color w:val="13496B"/>
+          <w:sz w:val="23"/>
+          <w:szCs w:val="23"/>
+        </w:rPr>
+        <w:t xml:space="preserve">6.8 Decisiones técnicas</w:t>
+      </w:r>
+    </w:p>
+    <w:tbl>
+      <w:tblPr>
+        <w:tblW w:type="dxa" w:w="9360"/>
+        <w:tblBorders>
+          <w:top w:val="single" w:color="E4E8EC" w:sz="2"/>
+          <w:left w:val="none" w:color="FFFFFF" w:sz="0"/>
+          <w:bottom w:val="single" w:color="E4E8EC" w:sz="2"/>
+          <w:right w:val="none" w:color="FFFFFF" w:sz="0"/>
+          <w:insideH w:val="single" w:color="E4E8EC" w:sz="2"/>
+          <w:insideV w:val="none" w:color="FFFFFF" w:sz="0"/>
+        </w:tblBorders>
+      </w:tblPr>
+      <w:tblGrid>
+        <w:gridCol w:w="1000"/>
+        <w:gridCol w:w="3900"/>
+        <w:gridCol w:w="4460"/>
+      </w:tblGrid>
+      <w:tr>
+        <w:trPr>
+          <w:tblHeader/>
+        </w:trPr>
+        <w:tc>
+          <w:tcPr>
+            <w:tcW w:type="dxa" w:w="1000"/>
+            <w:shd w:fill="13496B" w:color="auto" w:val="clear"/>
+            <w:tcMar>
+              <w:top w:type="dxa" w:w="70"/>
+              <w:left w:type="dxa" w:w="110"/>
+              <w:bottom w:type="dxa" w:w="70"/>
+              <w:right w:type="dxa" w:w="110"/>
+            </w:tcMar>
+          </w:tcPr>
+          <w:p>
+            <w:pPr>
+              <w:spacing w:after="30"/>
+            </w:pPr>
+          </w:p>
+        </w:tc>
+        <w:tc>
+          <w:tcPr>
+            <w:tcW w:type="dxa" w:w="3900"/>
+            <w:shd w:fill="13496B" w:color="auto" w:val="clear"/>
+            <w:tcMar>
+              <w:top w:type="dxa" w:w="70"/>
+              <w:left w:type="dxa" w:w="110"/>
+              <w:bottom w:type="dxa" w:w="70"/>
+              <w:right w:type="dxa" w:w="110"/>
+            </w:tcMar>
+          </w:tcPr>
+          <w:p>
+            <w:pPr>
+              <w:spacing w:after="30"/>
+            </w:pPr>
+            <w:r>
+              <w:rPr>
+                <w:rFonts w:ascii="Calibri" w:cs="Calibri" w:eastAsia="Calibri" w:hAnsi="Calibri"/>
+                <w:b/>
+                <w:bCs/>
+                <w:color w:val="FFFFFF"/>
+                <w:sz w:val="18"/>
+                <w:szCs w:val="18"/>
+              </w:rPr>
+              <w:t xml:space="preserve">Decisión</w:t>
+            </w:r>
+          </w:p>
+        </w:tc>
+        <w:tc>
+          <w:tcPr>
+            <w:tcW w:type="dxa" w:w="4460"/>
+            <w:shd w:fill="13496B" w:color="auto" w:val="clear"/>
+            <w:tcMar>
+              <w:top w:type="dxa" w:w="70"/>
+              <w:left w:type="dxa" w:w="110"/>
+              <w:bottom w:type="dxa" w:w="70"/>
+              <w:right w:type="dxa" w:w="110"/>
+            </w:tcMar>
+          </w:tcPr>
+          <w:p>
+            <w:pPr>
+              <w:spacing w:after="30"/>
+            </w:pPr>
+            <w:r>
+              <w:rPr>
+                <w:rFonts w:ascii="Calibri" w:cs="Calibri" w:eastAsia="Calibri" w:hAnsi="Calibri"/>
+                <w:b/>
+                <w:bCs/>
+                <w:color w:val="FFFFFF"/>
+                <w:sz w:val="18"/>
+                <w:szCs w:val="18"/>
+              </w:rPr>
+              <w:t xml:space="preserve">Razón</w:t>
+            </w:r>
+          </w:p>
+        </w:tc>
+      </w:tr>
+      <w:tr>
+        <w:trPr>
+          <w:cantSplit/>
+        </w:trPr>
+        <w:tc>
+          <w:tcPr>
+            <w:tcW w:type="dxa" w:w="1000"/>
+            <w:tcMar>
+              <w:top w:type="dxa" w:w="70"/>
+              <w:left w:type="dxa" w:w="110"/>
+              <w:bottom w:type="dxa" w:w="70"/>
+              <w:right w:type="dxa" w:w="110"/>
+            </w:tcMar>
+          </w:tcPr>
+          <w:p>
+            <w:pPr>
+              <w:spacing w:after="30"/>
+            </w:pPr>
+            <w:r>
+              <w:rPr>
+                <w:rFonts w:ascii="Calibri" w:cs="Calibri" w:eastAsia="Calibri" w:hAnsi="Calibri"/>
+                <w:color w:val="1F2933"/>
+                <w:sz w:val="18"/>
+                <w:szCs w:val="18"/>
+              </w:rPr>
+              <w:t xml:space="preserve">D-80</w:t>
+            </w:r>
+          </w:p>
+        </w:tc>
+        <w:tc>
+          <w:tcPr>
+            <w:tcW w:type="dxa" w:w="3900"/>
+            <w:tcMar>
+              <w:top w:type="dxa" w:w="70"/>
+              <w:left w:type="dxa" w:w="110"/>
+              <w:bottom w:type="dxa" w:w="70"/>
+              <w:right w:type="dxa" w:w="110"/>
+            </w:tcMar>
+          </w:tcPr>
+          <w:p>
+            <w:pPr>
+              <w:spacing w:after="30"/>
+            </w:pPr>
+            <w:r>
+              <w:rPr>
+                <w:rFonts w:ascii="Calibri" w:cs="Calibri" w:eastAsia="Calibri" w:hAnsi="Calibri"/>
+                <w:color w:val="1F2933"/>
+                <w:sz w:val="18"/>
+                <w:szCs w:val="18"/>
+              </w:rPr>
+              <w:t xml:space="preserve">Motor en minutos contra calendarios de tramos, a través de dos operaciones.</w:t>
+            </w:r>
+          </w:p>
+        </w:tc>
+        <w:tc>
+          <w:tcPr>
+            <w:tcW w:type="dxa" w:w="4460"/>
+            <w:tcMar>
+              <w:top w:type="dxa" w:w="70"/>
+              <w:left w:type="dxa" w:w="110"/>
+              <w:bottom w:type="dxa" w:w="70"/>
+              <w:right w:type="dxa" w:w="110"/>
+            </w:tcMar>
+          </w:tcPr>
+          <w:p>
+            <w:pPr>
+              <w:spacing w:after="30"/>
+            </w:pPr>
+            <w:r>
+              <w:rPr>
+                <w:rFonts w:ascii="Calibri" w:cs="Calibri" w:eastAsia="Calibri" w:hAnsi="Calibri"/>
+                <w:color w:val="1F2933"/>
+                <w:sz w:val="18"/>
+                <w:szCs w:val="18"/>
+              </w:rPr>
+              <w:t xml:space="preserve">Medio sábado y fracciones de jornada sin redondeos; cambiar la forma del calendario no toca el motor; compatible con P6.</w:t>
+            </w:r>
+          </w:p>
+        </w:tc>
+      </w:tr>
+      <w:tr>
+        <w:trPr>
+          <w:cantSplit/>
+        </w:trPr>
+        <w:tc>
+          <w:tcPr>
+            <w:tcW w:type="dxa" w:w="1000"/>
+            <w:shd w:fill="F7F9FA" w:color="auto" w:val="clear"/>
+            <w:tcMar>
+              <w:top w:type="dxa" w:w="70"/>
+              <w:left w:type="dxa" w:w="110"/>
+              <w:bottom w:type="dxa" w:w="70"/>
+              <w:right w:type="dxa" w:w="110"/>
+            </w:tcMar>
+          </w:tcPr>
+          <w:p>
+            <w:pPr>
+              <w:spacing w:after="30"/>
+            </w:pPr>
+            <w:r>
+              <w:rPr>
+                <w:rFonts w:ascii="Calibri" w:cs="Calibri" w:eastAsia="Calibri" w:hAnsi="Calibri"/>
+                <w:color w:val="1F2933"/>
+                <w:sz w:val="18"/>
+                <w:szCs w:val="18"/>
+              </w:rPr>
+              <w:t xml:space="preserve">D-81</w:t>
+            </w:r>
+          </w:p>
+        </w:tc>
+        <w:tc>
+          <w:tcPr>
+            <w:tcW w:type="dxa" w:w="3900"/>
+            <w:shd w:fill="F7F9FA" w:color="auto" w:val="clear"/>
+            <w:tcMar>
+              <w:top w:type="dxa" w:w="70"/>
+              <w:left w:type="dxa" w:w="110"/>
+              <w:bottom w:type="dxa" w:w="70"/>
+              <w:right w:type="dxa" w:w="110"/>
+            </w:tcMar>
+          </w:tcPr>
+          <w:p>
+            <w:pPr>
+              <w:spacing w:after="30"/>
+            </w:pPr>
+            <w:r>
+              <w:rPr>
+                <w:rFonts w:ascii="Calibri" w:cs="Calibri" w:eastAsia="Calibri" w:hAnsi="Calibri"/>
+                <w:color w:val="1F2933"/>
+                <w:sz w:val="18"/>
+                <w:szCs w:val="18"/>
+              </w:rPr>
+              <w:t xml:space="preserve">El cronograma va 1 a 1 con el presupuesto, que en el sistema es el proyecto; lee y no escribe.</w:t>
+            </w:r>
+          </w:p>
+        </w:tc>
+        <w:tc>
+          <w:tcPr>
+            <w:tcW w:type="dxa" w:w="4460"/>
+            <w:shd w:fill="F7F9FA" w:color="auto" w:val="clear"/>
+            <w:tcMar>
+              <w:top w:type="dxa" w:w="70"/>
+              <w:left w:type="dxa" w:w="110"/>
+              <w:bottom w:type="dxa" w:w="70"/>
+              <w:right w:type="dxa" w:w="110"/>
+            </w:tcMar>
+          </w:tcPr>
+          <w:p>
+            <w:pPr>
+              <w:spacing w:after="30"/>
+            </w:pPr>
+            <w:r>
+              <w:rPr>
+                <w:rFonts w:ascii="Calibri" w:cs="Calibri" w:eastAsia="Calibri" w:hAnsi="Calibri"/>
+                <w:color w:val="1F2933"/>
+                <w:sz w:val="18"/>
+                <w:szCs w:val="18"/>
+              </w:rPr>
+              <w:t xml:space="preserve">No hay tabla de proyecto ni versiones de presupuesto: crearlas sería preparar por adelantado.</w:t>
+            </w:r>
+          </w:p>
+        </w:tc>
+      </w:tr>
+      <w:tr>
+        <w:trPr>
+          <w:cantSplit/>
+        </w:trPr>
+        <w:tc>
+          <w:tcPr>
+            <w:tcW w:type="dxa" w:w="1000"/>
+            <w:tcMar>
+              <w:top w:type="dxa" w:w="70"/>
+              <w:left w:type="dxa" w:w="110"/>
+              <w:bottom w:type="dxa" w:w="70"/>
+              <w:right w:type="dxa" w:w="110"/>
+            </w:tcMar>
+          </w:tcPr>
+          <w:p>
+            <w:pPr>
+              <w:spacing w:after="30"/>
+            </w:pPr>
+            <w:r>
+              <w:rPr>
+                <w:rFonts w:ascii="Calibri" w:cs="Calibri" w:eastAsia="Calibri" w:hAnsi="Calibri"/>
+                <w:color w:val="1F2933"/>
+                <w:sz w:val="18"/>
+                <w:szCs w:val="18"/>
+              </w:rPr>
+              <w:t xml:space="preserve">D-82</w:t>
+            </w:r>
+          </w:p>
+        </w:tc>
+        <w:tc>
+          <w:tcPr>
+            <w:tcW w:type="dxa" w:w="3900"/>
+            <w:tcMar>
+              <w:top w:type="dxa" w:w="70"/>
+              <w:left w:type="dxa" w:w="110"/>
+              <w:bottom w:type="dxa" w:w="70"/>
+              <w:right w:type="dxa" w:w="110"/>
+            </w:tcMar>
+          </w:tcPr>
+          <w:p>
+            <w:pPr>
+              <w:spacing w:after="30"/>
+            </w:pPr>
+            <w:r>
+              <w:rPr>
+                <w:rFonts w:ascii="Calibri" w:cs="Calibri" w:eastAsia="Calibri" w:hAnsi="Calibri"/>
+                <w:color w:val="1F2933"/>
+                <w:sz w:val="18"/>
+                <w:szCs w:val="18"/>
+              </w:rPr>
+              <w:t xml:space="preserve">La contingencia de lluvia dimensiona un colchón al final, no alarga actividades.</w:t>
+            </w:r>
+          </w:p>
+        </w:tc>
+        <w:tc>
+          <w:tcPr>
+            <w:tcW w:type="dxa" w:w="4460"/>
+            <w:tcMar>
+              <w:top w:type="dxa" w:w="70"/>
+              <w:left w:type="dxa" w:w="110"/>
+              <w:bottom w:type="dxa" w:w="70"/>
+              <w:right w:type="dxa" w:w="110"/>
+            </w:tcMar>
+          </w:tcPr>
+          <w:p>
+            <w:pPr>
+              <w:spacing w:after="30"/>
+            </w:pPr>
+            <w:r>
+              <w:rPr>
+                <w:rFonts w:ascii="Calibri" w:cs="Calibri" w:eastAsia="Calibri" w:hAnsi="Calibri"/>
+                <w:color w:val="1F2933"/>
+                <w:sz w:val="18"/>
+                <w:szCs w:val="18"/>
+              </w:rPr>
+              <w:t xml:space="preserve">Evita la Ley de Parkinson y que el flujo de caja muestre el gasto más lento de lo real.</w:t>
+            </w:r>
+          </w:p>
+        </w:tc>
+      </w:tr>
+      <w:tr>
+        <w:trPr>
+          <w:cantSplit/>
+        </w:trPr>
+        <w:tc>
+          <w:tcPr>
+            <w:tcW w:type="dxa" w:w="1000"/>
+            <w:shd w:fill="F7F9FA" w:color="auto" w:val="clear"/>
+            <w:tcMar>
+              <w:top w:type="dxa" w:w="70"/>
+              <w:left w:type="dxa" w:w="110"/>
+              <w:bottom w:type="dxa" w:w="70"/>
+              <w:right w:type="dxa" w:w="110"/>
+            </w:tcMar>
+          </w:tcPr>
+          <w:p>
+            <w:pPr>
+              <w:spacing w:after="30"/>
+            </w:pPr>
+            <w:r>
+              <w:rPr>
+                <w:rFonts w:ascii="Calibri" w:cs="Calibri" w:eastAsia="Calibri" w:hAnsi="Calibri"/>
+                <w:color w:val="1F2933"/>
+                <w:sz w:val="18"/>
+                <w:szCs w:val="18"/>
+              </w:rPr>
+              <w:t xml:space="preserve">D-83</w:t>
+            </w:r>
+          </w:p>
+        </w:tc>
+        <w:tc>
+          <w:tcPr>
+            <w:tcW w:type="dxa" w:w="3900"/>
+            <w:shd w:fill="F7F9FA" w:color="auto" w:val="clear"/>
+            <w:tcMar>
+              <w:top w:type="dxa" w:w="70"/>
+              <w:left w:type="dxa" w:w="110"/>
+              <w:bottom w:type="dxa" w:w="70"/>
+              <w:right w:type="dxa" w:w="110"/>
+            </w:tcMar>
+          </w:tcPr>
+          <w:p>
+            <w:pPr>
+              <w:spacing w:after="30"/>
+            </w:pPr>
+            <w:r>
+              <w:rPr>
+                <w:rFonts w:ascii="Calibri" w:cs="Calibri" w:eastAsia="Calibri" w:hAnsi="Calibri"/>
+                <w:color w:val="1F2933"/>
+                <w:sz w:val="18"/>
+                <w:szCs w:val="18"/>
+              </w:rPr>
+              <w:t xml:space="preserve">Las horas por jornal se copian en el presupuesto.</w:t>
+            </w:r>
+          </w:p>
+        </w:tc>
+        <w:tc>
+          <w:tcPr>
+            <w:tcW w:type="dxa" w:w="4460"/>
+            <w:shd w:fill="F7F9FA" w:color="auto" w:val="clear"/>
+            <w:tcMar>
+              <w:top w:type="dxa" w:w="70"/>
+              <w:left w:type="dxa" w:w="110"/>
+              <w:bottom w:type="dxa" w:w="70"/>
+              <w:right w:type="dxa" w:w="110"/>
+            </w:tcMar>
+          </w:tcPr>
+          <w:p>
+            <w:pPr>
+              <w:spacing w:after="30"/>
+            </w:pPr>
+            <w:r>
+              <w:rPr>
+                <w:rFonts w:ascii="Calibri" w:cs="Calibri" w:eastAsia="Calibri" w:hAnsi="Calibri"/>
+                <w:color w:val="1F2933"/>
+                <w:sz w:val="18"/>
+                <w:szCs w:val="18"/>
+              </w:rPr>
+              <w:t xml:space="preserve">Un cambio de la empresa no mueve presupuestos ya hechos, igual que el IVA (D-33).</w:t>
+            </w:r>
+          </w:p>
+        </w:tc>
+      </w:tr>
+    </w:tbl>
+    <w:p>
+      <w:pPr>
+        <w:spacing w:after="120"/>
+      </w:pPr>
+    </w:p>
+    <w:p>
+      <w:pPr>
+        <w:pStyle w:val="Heading2"/>
+        <w:spacing w:after="120" w:before="240"/>
+      </w:pPr>
+      <w:r>
+        <w:rPr>
+          <w:rFonts w:ascii="Calibri" w:cs="Calibri" w:eastAsia="Calibri" w:hAnsi="Calibri"/>
+          <w:b/>
+          <w:bCs/>
+          <w:color w:val="13496B"/>
+          <w:sz w:val="23"/>
+          <w:szCs w:val="23"/>
+        </w:rPr>
+        <w:t xml:space="preserve">6.9 Pendiente antes de construir</w:t>
+      </w:r>
+    </w:p>
+    <w:p>
+      <w:pPr>
+        <w:pStyle w:val="ListParagraph"/>
+        <w:numPr>
+          <w:ilvl w:val="0"/>
+          <w:numId w:val="2"/>
+        </w:numPr>
+        <w:spacing w:after="80" w:line="276"/>
+      </w:pPr>
+      <w:r>
+        <w:rPr>
+          <w:rFonts w:ascii="Calibri" w:cs="Calibri" w:eastAsia="Calibri" w:hAnsi="Calibri"/>
+          <w:b/>
+          <w:bCs/>
+          <w:color w:val="1F2933"/>
+          <w:sz w:val="21"/>
+          <w:szCs w:val="21"/>
+        </w:rPr>
+        <w:t xml:space="preserve">Cómo se reparten imprevistos, utilidad e IVA en el flujo de caja.</w:t>
+      </w:r>
+      <w:r>
+        <w:rPr>
+          <w:rFonts w:ascii="Calibri" w:cs="Calibri" w:eastAsia="Calibri" w:hAnsi="Calibri"/>
+          <w:color w:val="1F2933"/>
+          <w:sz w:val="21"/>
+          <w:szCs w:val="21"/>
+        </w:rPr>
+        <w:t xml:space="preserve"> Propuesta: en proporción a la obra ejecutada en cada periodo, como un acta de obra. Esperando respuesta.</w:t>
+      </w:r>
+    </w:p>
+    <w:p>
+      <w:pPr>
+        <w:pStyle w:val="ListParagraph"/>
+        <w:numPr>
+          <w:ilvl w:val="0"/>
+          <w:numId w:val="2"/>
+        </w:numPr>
+        <w:spacing w:after="80" w:line="276"/>
+      </w:pPr>
+      <w:r>
+        <w:rPr>
+          <w:rFonts w:ascii="Calibri" w:cs="Calibri" w:eastAsia="Calibri" w:hAnsi="Calibri"/>
+          <w:b/>
+          <w:bCs/>
+          <w:color w:val="1F2933"/>
+          <w:sz w:val="21"/>
+          <w:szCs w:val="21"/>
+        </w:rPr>
+        <w:t xml:space="preserve">La tarea de administración termina al fin de la duración base, no al fin del colchón</w:t>
+      </w:r>
+      <w:r>
+        <w:rPr>
+          <w:rFonts w:ascii="Calibri" w:cs="Calibri" w:eastAsia="Calibri" w:hAnsi="Calibri"/>
+          <w:color w:val="1F2933"/>
+          <w:sz w:val="21"/>
+          <w:szCs w:val="21"/>
+        </w:rPr>
+        <w:t xml:space="preserve"> (RN-37). Es la propuesta; falta la confirmación explícita.</w:t>
+      </w:r>
+    </w:p>
+    <w:p>
+      <w:pPr>
+        <w:pStyle w:val="ListParagraph"/>
+        <w:numPr>
+          <w:ilvl w:val="0"/>
+          <w:numId w:val="2"/>
+        </w:numPr>
+        <w:spacing w:after="80" w:line="276"/>
+      </w:pPr>
+      <w:r>
+        <w:rPr>
+          <w:rFonts w:ascii="Calibri" w:cs="Calibri" w:eastAsia="Calibri" w:hAnsi="Calibri"/>
+          <w:b/>
+          <w:bCs/>
+          <w:color w:val="1F2933"/>
+          <w:sz w:val="21"/>
+          <w:szCs w:val="21"/>
+        </w:rPr>
+        <w:t xml:space="preserve">Si la línea base solo se puede guardar con el presupuesto Activo.</w:t>
+      </w:r>
+      <w:r>
+        <w:rPr>
+          <w:rFonts w:ascii="Calibri" w:cs="Calibri" w:eastAsia="Calibri" w:hAnsi="Calibri"/>
+          <w:color w:val="1F2933"/>
+          <w:sz w:val="21"/>
+          <w:szCs w:val="21"/>
+        </w:rPr>
+        <w:t xml:space="preserve"> Propuesta: sí, porque una línea base sobre una oferta que todavía cambia no sirve para comparar.</w:t>
+      </w:r>
+    </w:p>
+    <w:p>
+      <w:pPr>
+        <w:pStyle w:val="ListParagraph"/>
+        <w:numPr>
+          <w:ilvl w:val="0"/>
+          <w:numId w:val="2"/>
+        </w:numPr>
+        <w:spacing w:after="80" w:line="276"/>
+      </w:pPr>
+      <w:r>
+        <w:rPr>
+          <w:rFonts w:ascii="Calibri" w:cs="Calibri" w:eastAsia="Calibri" w:hAnsi="Calibri"/>
+          <w:b/>
+          <w:bCs/>
+          <w:color w:val="1F2933"/>
+          <w:sz w:val="21"/>
+          <w:szCs w:val="21"/>
+        </w:rPr>
+        <w:t xml:space="preserve">Dónde corre el cálculo, en la base o en la API.</w:t>
+      </w:r>
+      <w:r>
+        <w:rPr>
+          <w:rFonts w:ascii="Calibri" w:cs="Calibri" w:eastAsia="Calibri" w:hAnsi="Calibri"/>
+          <w:color w:val="1F2933"/>
+          <w:sz w:val="21"/>
+          <w:szCs w:val="21"/>
+        </w:rPr>
+        <w:t xml:space="preserve"> Es una decisión técnica con Claude Code. El cálculo recorre un grafo y hace aritmética de calendario, que en PL/pgSQL es posible pero incómodo; la recomendación inicial es la API, con los resultados guardados en la base. Se decide antes de escribir la migración.</w:t>
       </w:r>
     </w:p>
     <w:sectPr>

</xml_diff>

<commit_message>
docs(07): las parejas de restricciones principal y secundaria (RN-30)
Lo confirmado en la documentación de Oracle y el resto por lógica: con
las cinco principales de ventana, cualquier secundaria de ventana que no
sea la misma; dos del mismo tipo de fecha no pueden cruzarse; los hitos
solo admiten restricciones de su lado. La tabla exacta de P6 no está
publicada; si difiere, se corrige con una migración.

Co-Authored-By: Claude Opus 5.5 <noreply@anthropic.com>
Claude-Session: https://claude.ai/code/session_01QkUecTxXWHcSEBT7CByXQu
</commit_message>
<xml_diff>
--- a/docs/07 - Alcance despues del MVP.docx
+++ b/docs/07 - Alcance despues del MVP.docx
@@ -8887,7 +8887,7 @@
                 <w:sz w:val="18"/>
                 <w:lang w:val="es-CO"/>
               </w:rPr>
-              <w:t xml:space="preserve"> inicio el, inicio en o antes de, inicio en o después de, fin el, fin en o antes de, fin en o después de, lo más tarde posible, inicio obligatorio y fin obligatorio. Las obligatorias pasan por encima de la lógica, como en P6. Una restricción que la lógica no cumple produce holgura negativa: es una alerta, no un error. Las parejas de principal y secundaria permitidas salen de una tabla basada en P6, que se confirma antes de construir (sección 6.9).</w:t>
+              <w:t xml:space="preserve"> inicio el, inicio en o antes de, inicio en o después de, fin el, fin en o antes de, fin en o después de, lo más tarde posible, inicio obligatorio y fin obligatorio. Las obligatorias pasan por encima de la lógica, como en P6. Una restricción que la lógica no cumple produce holgura negativa: es una alerta, no un error. Sin principal no hay secundaria. «Inicio el», «fin el», «inicio obligatorio» y «fin obligatorio» no admiten secundaria. Con las otras cinco, la secundaria es cualquiera de las cuatro de ventana (inicio en o antes de, inicio en o después de, fin en o antes de, fin en o después de) que no sea la misma principal; «lo más tarde posible» admite las cuatro. Si las dos son del mismo tipo de fecha —dos de inicio o dos de fin—, el límite «antes de» no puede ser anterior al límite «después de». Un hito de fin no admite restricciones de inicio, y uno de inicio no admite restricciones de fin.</w:t>
             </w:r>
           </w:p>
         </w:tc>
@@ -12139,13 +12139,13 @@
           <w:bCs/>
           <w:lang w:val="es-CO"/>
         </w:rPr>
-        <w:t xml:space="preserve">Pendiente: las parejas de restricción principal y secundaria (RN-30).</w:t>
-      </w:r>
-      <w:r>
-        <w:rPr>
-          <w:lang w:val="es-CO"/>
-        </w:rPr>
-        <w:t xml:space="preserve"> Confirmado en la documentación de Oracle: «inicio el», «fin el», «inicio obligatorio» y «fin obligatorio» no admiten secundaria, y un hito de fin no admite restricciones de inicio. El resto de la tabla no está publicado; se levanta en P6 antes de construir.</w:t>
+        <w:t xml:space="preserve">Parejas de restricciones (RN-30): definidas el 20 de octubre de 2026.</w:t>
+      </w:r>
+      <w:r>
+        <w:rPr>
+          <w:lang w:val="es-CO"/>
+        </w:rPr>
+        <w:t xml:space="preserve"> De la documentación de Oracle están confirmadas tres cosas: sin principal no hay secundaria, la principal decide qué secundarias se ofrecen, y «inicio el», «fin el» y las obligatorias no admiten ninguna; también que un hito de fin no admite restricciones de inicio. El resto de la tabla de la RN-30 sale de la lógica, no de P6: la lista exacta no está publicada. Si al abrirla en P6 aparece una diferencia, se corrige con una migración. La regla de los hitos de inicio es la simétrica de la de fin y tampoco está confirmada en P6.</w:t>
       </w:r>
     </w:p>
     <w:p>

</xml_diff>

<commit_message>
docs: el módulo 1 listo para construir; orden de trabajo en la bitácora
La bitácora dice qué hace cada lado y en qué orden: migración 0004
(calendarios, horas por jornal, rendimiento del APU, festivos), 0005 (el
cronograma), CONTRATO §19, y después la API y la web en paralelo. El 07
registra que el XML para Project no se verifica en Project y que la
pantalla recomienda tenerlo.

Co-Authored-By: Claude Opus 5.5 <noreply@anthropic.com>
Claude-Session: https://claude.ai/code/session_01QkUecTxXWHcSEBT7CByXQu
</commit_message>
<xml_diff>
--- a/docs/07 - Alcance despues del MVP.docx
+++ b/docs/07 - Alcance despues del MVP.docx
@@ -12162,13 +12162,13 @@
           <w:bCs/>
           <w:lang w:val="es-CO"/>
         </w:rPr>
-        <w:t xml:space="preserve">Pendiente: verificar el XML en Project.</w:t>
-      </w:r>
-      <w:r>
-        <w:rPr>
-          <w:lang w:val="es-CO"/>
-        </w:rPr>
-        <w:t xml:space="preserve"> Sin acceso a Project no se puede comprobar que abre bien.</w:t>
+        <w:t xml:space="preserve">El XML para Project no se verifica en Project</w:t>
+      </w:r>
+      <w:r>
+        <w:rPr>
+          <w:lang w:val="es-CO"/>
+        </w:rPr>
+        <w:t xml:space="preserve">, porque no hay acceso a él (decisión del 20 de octubre de 2026). La pantalla de exportación le recomienda al usuario tener MS Project para abrirlo. Para detectar errores gruesos durante el desarrollo se puede abrir en ProjectLibre, que es gratuito.</w:t>
       </w:r>
     </w:p>
     <w:p>

</xml_diff>

<commit_message>
docs: respuesta a la lectura del motor; decisiones del 20 de octubre en el 07
Acepto las propuestas técnicas de la API (amarre al ítem, resultados en
actividad_calculo, versión y revisión, curvas repartidas por la base,
línea base por día) y quedan escritas las diez decisiones de producto del
dueño: corrido de 24 h, duración manual en horas, redondeo al minuto,
restricciones en días no laborables, ciclos rechazados, exportación a
Project con lo que se pierde, administración como Level of Effort.

Co-Authored-By: Claude Opus 5.5 <noreply@anthropic.com>
Claude-Session: https://claude.ai/code/session_01QkUecTxXWHcSEBT7CByXQu
</commit_message>
<xml_diff>
--- a/docs/07 - Alcance despues del MVP.docx
+++ b/docs/07 - Alcance despues del MVP.docx
@@ -10504,7 +10504,7 @@
                 <w:sz w:val="18"/>
                 <w:lang w:val="es-CO"/>
               </w:rPr>
-              <w:t xml:space="preserve">Calendarios de la empresa, la copia de cada proyecto y su calendario corrido; tramos por día de la semana (varios por día); excepciones con la misma forma.</w:t>
+              <w:t xml:space="preserve">Calendarios de la empresa, la copia de cada proyecto y su calendario corrido (24 h todos los días, 1 día = 24 h); tramos por día de la semana, varios por día; excepciones con la misma forma. El calendario guarda de qué lista salieron sus festivos y hasta qué año llegan.</w:t>
             </w:r>
           </w:p>
         </w:tc>
@@ -10621,7 +10621,7 @@
                 <w:sz w:val="18"/>
                 <w:lang w:val="es-CO"/>
               </w:rPr>
-              <w:t xml:space="preserve">Uno por presupuesto: fecha de inicio, calendario del proyecto, calendario corrido, versión (para detectar dos ediciones a la vez) y marca de desactualizado.</w:t>
+              <w:t xml:space="preserve">Uno por presupuesto: fecha de inicio, calendario del proyecto, calendario corrido. version sube con cada guardado y decide el rechazo por edición simultánea; calculado_version y calculado_revision dicen con qué entradas y con qué revisión del presupuesto se hizo el último cálculo. Escribir resultados no sube version.</w:t>
             </w:r>
           </w:p>
         </w:tc>
@@ -10738,7 +10738,66 @@
                 <w:sz w:val="18"/>
                 <w:lang w:val="es-CO"/>
               </w:rPr>
-              <w:t xml:space="preserve">Ítem, hito de inicio, hito de fin, actividad sin costo o administración; código, subgrupo, calendario (solo esperas), cuadrillas, horas calculadas, horas manuales, restricción principal y secundaria (tipo y fecha), fechas y holgura calculadas, marca de revisión.</w:t>
+              <w:t xml:space="preserve">Ítem, hito de inicio, hito de fin, actividad sin costo o administración; ítem del presupuesto (se anula solo esa columna si el ítem se borra: así se sabe que «ya no está en el presupuesto»), nombre, código y orden, subgrupo, calendario (solo esperas), cuadrillas, duración manual en horas, restricción principal y secundaria (tipo y fecha). Son solo las entradas.</w:t>
+            </w:r>
+          </w:p>
+        </w:tc>
+      </w:tr>
+      <w:tr>
+        <w:trPr>
+          <w:trHeight w:val="614"/>
+        </w:trPr>
+        <w:tc>
+          <w:tcPr>
+            <w:tcW w:w="3011" w:type="dxa"/>
+            <w:tcBorders>
+              <w:top w:val="single" w:sz="2" w:space="0" w:color="E4E8EC"/>
+              <w:left w:val="nil"/>
+              <w:bottom w:val="single" w:sz="2" w:space="0" w:color="E4E8EC"/>
+              <w:right w:val="nil"/>
+            </w:tcBorders>
+          </w:tcPr>
+          <w:p>
+            <w:pPr>
+              <w:spacing w:after="0" w:line="259" w:lineRule="auto"/>
+              <w:ind w:left="112" w:firstLine="0"/>
+              <w:rPr>
+                <w:lang w:val="es-CO"/>
+              </w:rPr>
+            </w:pPr>
+            <w:r>
+              <w:rPr>
+                <w:sz w:val="18"/>
+                <w:lang w:val="es-CO"/>
+              </w:rPr>
+              <w:t xml:space="preserve">actividad_calculo</w:t>
+            </w:r>
+          </w:p>
+        </w:tc>
+        <w:tc>
+          <w:tcPr>
+            <w:tcW w:w="6348" w:type="dxa"/>
+            <w:tcBorders>
+              <w:top w:val="single" w:sz="2" w:space="0" w:color="E4E8EC"/>
+              <w:left w:val="nil"/>
+              <w:bottom w:val="single" w:sz="2" w:space="0" w:color="E4E8EC"/>
+              <w:right w:val="nil"/>
+            </w:tcBorders>
+          </w:tcPr>
+          <w:p>
+            <w:pPr>
+              <w:spacing w:after="0" w:line="259" w:lineRule="auto"/>
+              <w:ind w:left="0" w:firstLine="0"/>
+              <w:rPr>
+                <w:lang w:val="es-CO"/>
+              </w:rPr>
+            </w:pPr>
+            <w:r>
+              <w:rPr>
+                <w:sz w:val="18"/>
+                <w:lang w:val="es-CO"/>
+              </w:rPr>
+              <w:t xml:space="preserve">Los resultados del motor, uno por actividad: inicio y fin tempranos y tardíos, duración en minutos, holgura total y libre en minutos laborables de su calendario, crítica. Aparte de las entradas, para que un recálculo los escriba en cualquier estado del presupuesto y con cualquier rol que pueda leer, sin pasar por los guardianes de las entradas.</w:t>
             </w:r>
           </w:p>
         </w:tc>
@@ -10855,7 +10914,66 @@
                 <w:sz w:val="18"/>
                 <w:lang w:val="es-CO"/>
               </w:rPr>
-              <w:t xml:space="preserve">Varias por cronograma. La foto: actividades y las dos curvas (facturación y costo) por periodo.</w:t>
+              <w:t xml:space="preserve">Varias por cronograma. La foto: actividades y las dos curvas (facturación y costo) por día; la semana y el mes se arman al leer, así un cambio del día de inicio de semana no las descuadra.</w:t>
+            </w:r>
+          </w:p>
+        </w:tc>
+      </w:tr>
+      <w:tr>
+        <w:trPr>
+          <w:trHeight w:val="614"/>
+        </w:trPr>
+        <w:tc>
+          <w:tcPr>
+            <w:tcW w:w="3011" w:type="dxa"/>
+            <w:tcBorders>
+              <w:top w:val="single" w:sz="2" w:space="0" w:color="E4E8EC"/>
+              <w:left w:val="nil"/>
+              <w:bottom w:val="single" w:sz="2" w:space="0" w:color="E4E8EC"/>
+              <w:right w:val="nil"/>
+            </w:tcBorders>
+          </w:tcPr>
+          <w:p>
+            <w:pPr>
+              <w:spacing w:after="0" w:line="259" w:lineRule="auto"/>
+              <w:ind w:left="112" w:firstLine="0"/>
+              <w:rPr>
+                <w:lang w:val="es-CO"/>
+              </w:rPr>
+            </w:pPr>
+            <w:r>
+              <w:rPr>
+                <w:sz w:val="18"/>
+                <w:lang w:val="es-CO"/>
+              </w:rPr>
+              <w:t xml:space="preserve">presupuesto.revision</w:t>
+            </w:r>
+          </w:p>
+        </w:tc>
+        <w:tc>
+          <w:tcPr>
+            <w:tcW w:w="6348" w:type="dxa"/>
+            <w:tcBorders>
+              <w:top w:val="single" w:sz="2" w:space="0" w:color="E4E8EC"/>
+              <w:left w:val="nil"/>
+              <w:bottom w:val="single" w:sz="2" w:space="0" w:color="E4E8EC"/>
+              <w:right w:val="nil"/>
+            </w:tcBorders>
+          </w:tcPr>
+          <w:p>
+            <w:pPr>
+              <w:spacing w:after="0" w:line="259" w:lineRule="auto"/>
+              <w:ind w:left="0" w:firstLine="0"/>
+              <w:rPr>
+                <w:lang w:val="es-CO"/>
+              </w:rPr>
+            </w:pPr>
+            <w:r>
+              <w:rPr>
+                <w:sz w:val="18"/>
+                <w:lang w:val="es-CO"/>
+              </w:rPr>
+              <w:t xml:space="preserve">Un contador que suben los mismos disparadores que hoy mueven la fecha de modificación. Si no coincide con calculado_revision, el cronograma está desactualizado. No agrega ninguna sentencia a la edición de una cantidad.</w:t>
             </w:r>
           </w:p>
         </w:tc>
@@ -11406,7 +11524,7 @@
                 <w:sz w:val="18"/>
                 <w:lang w:val="es-CO"/>
               </w:rPr>
-              <w:t xml:space="preserve">D-89 El cálculo corre en la API y los resultados se guardan en la base.</w:t>
+              <w:t xml:space="preserve">D-89 El cálculo corre en la API y los resultados se guardan en la base; el reparto del dinero de las curvas lo hace la base.</w:t>
             </w:r>
           </w:p>
         </w:tc>
@@ -11434,7 +11552,7 @@
                 <w:sz w:val="18"/>
                 <w:lang w:val="es-CO"/>
               </w:rPr>
-              <w:t xml:space="preserve">Recorrer el grafo y hacer aritmética de calendario con todas las restricciones de P6 es más fácil de escribir y probar en la API que en PL/pgSQL.</w:t>
+              <w:t xml:space="preserve">Recorrer el grafo y hacer aritmética de calendario con todas las restricciones de P6 es más fácil de escribir y probar en la API que en PL/pgSQL. El dinero no se calcula en TypeScript (04, regla 3): el motor entrega los minutos laborables de cada actividad por día y la función app.fn_curvas reparte los pesos, con el mismo cálculo del pie financiero, para que la suma sea el total exacto.</w:t>
             </w:r>
           </w:p>
         </w:tc>
@@ -12192,6 +12310,299 @@
           <w:lang w:val="es-CO"/>
         </w:rPr>
         <w:t xml:space="preserve"> el formato del archivo con el que una empresa carga su propia lista de festivos.</w:t>
+      </w:r>
+    </w:p>
+    <w:p>
+      <w:pPr>
+        <w:numPr>
+          <w:ilvl w:val="0"/>
+          <w:numId w:val="2"/>
+        </w:numPr>
+        <w:ind w:hanging="270"/>
+      </w:pPr>
+      <w:r>
+        <w:rPr>
+          <w:b/>
+          <w:bCs/>
+          <w:lang w:val="es-CO"/>
+        </w:rPr>
+        <w:t xml:space="preserve">Decisiones del 20 de octubre de 2026 (revisión del motor por la API):</w:t>
+      </w:r>
+    </w:p>
+    <w:p>
+      <w:pPr>
+        <w:numPr>
+          <w:ilvl w:val="0"/>
+          <w:numId w:val="2"/>
+        </w:numPr>
+        <w:ind w:hanging="270"/>
+      </w:pPr>
+      <w:r>
+        <w:rPr>
+          <w:b/>
+          <w:bCs/>
+          <w:lang w:val="es-CO"/>
+        </w:rPr>
+        <w:t xml:space="preserve">Calendario corrido:</w:t>
+      </w:r>
+      <w:r>
+        <w:rPr>
+          <w:lang w:val="es-CO"/>
+        </w:rPr>
+        <w:t xml:space="preserve"> 1 día = 24 h; una espera de 7 días son 7 días reales.</w:t>
+      </w:r>
+    </w:p>
+    <w:p>
+      <w:pPr>
+        <w:numPr>
+          <w:ilvl w:val="0"/>
+          <w:numId w:val="2"/>
+        </w:numPr>
+        <w:ind w:hanging="270"/>
+      </w:pPr>
+      <w:r>
+        <w:rPr>
+          <w:b/>
+          <w:bCs/>
+          <w:lang w:val="es-CO"/>
+        </w:rPr>
+        <w:t xml:space="preserve">Duración manual:</w:t>
+      </w:r>
+      <w:r>
+        <w:rPr>
+          <w:lang w:val="es-CO"/>
+        </w:rPr>
+        <w:t xml:space="preserve"> se escribe en días y se guarda en horas, como P6. Si después cambia el factor del calendario, se conservan las horas.</w:t>
+      </w:r>
+    </w:p>
+    <w:p>
+      <w:pPr>
+        <w:numPr>
+          <w:ilvl w:val="0"/>
+          <w:numId w:val="2"/>
+        </w:numPr>
+        <w:ind w:hanging="270"/>
+      </w:pPr>
+      <w:r>
+        <w:rPr>
+          <w:b/>
+          <w:bCs/>
+          <w:lang w:val="es-CO"/>
+        </w:rPr>
+        <w:t xml:space="preserve">Redondeo:</w:t>
+      </w:r>
+      <w:r>
+        <w:rPr>
+          <w:lang w:val="es-CO"/>
+        </w:rPr>
+        <w:t xml:space="preserve"> la duración calculada se redondea al minuto hacia arriba; las fechas nunca.</w:t>
+      </w:r>
+    </w:p>
+    <w:p>
+      <w:pPr>
+        <w:numPr>
+          <w:ilvl w:val="0"/>
+          <w:numId w:val="2"/>
+        </w:numPr>
+        <w:ind w:hanging="270"/>
+      </w:pPr>
+      <w:r>
+        <w:rPr>
+          <w:b/>
+          <w:bCs/>
+          <w:lang w:val="es-CO"/>
+        </w:rPr>
+        <w:t xml:space="preserve">Restricción en día no laborable:</w:t>
+      </w:r>
+      <w:r>
+        <w:rPr>
+          <w:lang w:val="es-CO"/>
+        </w:rPr>
+        <w:t xml:space="preserve"> la de inicio pasa al siguiente momento laborable; la de fin queda al cierre del último día laborable anterior, como P6.</w:t>
+      </w:r>
+    </w:p>
+    <w:p>
+      <w:pPr>
+        <w:numPr>
+          <w:ilvl w:val="0"/>
+          <w:numId w:val="2"/>
+        </w:numPr>
+        <w:ind w:hanging="270"/>
+      </w:pPr>
+      <w:r>
+        <w:rPr>
+          <w:b/>
+          <w:bCs/>
+          <w:lang w:val="es-CO"/>
+        </w:rPr>
+        <w:t xml:space="preserve">Tres reglas de P6:</w:t>
+      </w:r>
+      <w:r>
+        <w:rPr>
+          <w:lang w:val="es-CO"/>
+        </w:rPr>
+        <w:t xml:space="preserve"> ninguna actividad empieza antes de la fecha de inicio del cronograma, aunque un desfase negativo la empuje; las actividades sin sucesora se miden contra el fin del proyecto; el plazo del contrato es una restricción del hito de fin.</w:t>
+      </w:r>
+    </w:p>
+    <w:p>
+      <w:pPr>
+        <w:numPr>
+          <w:ilvl w:val="0"/>
+          <w:numId w:val="2"/>
+        </w:numPr>
+        <w:ind w:hanging="270"/>
+      </w:pPr>
+      <w:r>
+        <w:rPr>
+          <w:b/>
+          <w:bCs/>
+          <w:lang w:val="es-CO"/>
+        </w:rPr>
+        <w:t xml:space="preserve">Relaciones circulares:</w:t>
+      </w:r>
+      <w:r>
+        <w:rPr>
+          <w:lang w:val="es-CO"/>
+        </w:rPr>
+        <w:t xml:space="preserve"> se rechazan al crearlas, como en Project, con las actividades que forman el círculo. Un ciclo nunca queda guardado.</w:t>
+      </w:r>
+    </w:p>
+    <w:p>
+      <w:pPr>
+        <w:numPr>
+          <w:ilvl w:val="0"/>
+          <w:numId w:val="2"/>
+        </w:numPr>
+        <w:ind w:hanging="270"/>
+      </w:pPr>
+      <w:r>
+        <w:rPr>
+          <w:b/>
+          <w:bCs/>
+          <w:lang w:val="es-CO"/>
+        </w:rPr>
+        <w:t xml:space="preserve">«Sin programar»:</w:t>
+      </w:r>
+      <w:r>
+        <w:rPr>
+          <w:lang w:val="es-CO"/>
+        </w:rPr>
+        <w:t xml:space="preserve"> no es una marca aparte; una actividad deja de estarlo con su primera relación. La lista de revisión muestra el estado actual, y la franja dice «el presupuesto cambió desde el último cálculo».</w:t>
+      </w:r>
+    </w:p>
+    <w:p>
+      <w:pPr>
+        <w:numPr>
+          <w:ilvl w:val="0"/>
+          <w:numId w:val="2"/>
+        </w:numPr>
+        <w:ind w:hanging="270"/>
+      </w:pPr>
+      <w:r>
+        <w:rPr>
+          <w:b/>
+          <w:bCs/>
+          <w:lang w:val="es-CO"/>
+        </w:rPr>
+        <w:t xml:space="preserve">XML de Project:</w:t>
+      </w:r>
+      <w:r>
+        <w:rPr>
+          <w:lang w:val="es-CO"/>
+        </w:rPr>
+        <w:t xml:space="preserve"> una sola restricción por actividad; la secundaria solo se conserva si es «fin en o antes de», como fecha límite; la administración sale como tarea normal. La pantalla avisa qué se pierde. En el XER, la fecha de datos es la fecha de inicio del cronograma.</w:t>
+      </w:r>
+    </w:p>
+    <w:p>
+      <w:pPr>
+        <w:numPr>
+          <w:ilvl w:val="0"/>
+          <w:numId w:val="2"/>
+        </w:numPr>
+        <w:ind w:hanging="270"/>
+      </w:pPr>
+      <w:r>
+        <w:rPr>
+          <w:b/>
+          <w:bCs/>
+          <w:lang w:val="es-CO"/>
+        </w:rPr>
+        <w:t xml:space="preserve">Duración cero con costo:</w:t>
+      </w:r>
+      <w:r>
+        <w:rPr>
+          <w:lang w:val="es-CO"/>
+        </w:rPr>
+        <w:t xml:space="preserve"> todo el costo cae el día en que cae la actividad.</w:t>
+      </w:r>
+    </w:p>
+    <w:p>
+      <w:pPr>
+        <w:numPr>
+          <w:ilvl w:val="0"/>
+          <w:numId w:val="2"/>
+        </w:numPr>
+        <w:ind w:hanging="270"/>
+      </w:pPr>
+      <w:r>
+        <w:rPr>
+          <w:b/>
+          <w:bCs/>
+          <w:lang w:val="es-CO"/>
+        </w:rPr>
+        <w:t xml:space="preserve">Administración:</w:t>
+      </w:r>
+      <w:r>
+        <w:rPr>
+          <w:lang w:val="es-CO"/>
+        </w:rPr>
+        <w:t xml:space="preserve"> sin holgura, nunca crítica, con el calendario del proyecto. Al exportar a P6 sale como Level of Effort, relacionada con la actividad que empieza primero y con la que termina de última.</w:t>
+      </w:r>
+    </w:p>
+    <w:p>
+      <w:pPr>
+        <w:numPr>
+          <w:ilvl w:val="0"/>
+          <w:numId w:val="2"/>
+        </w:numPr>
+        <w:ind w:hanging="270"/>
+      </w:pPr>
+      <w:r>
+        <w:rPr>
+          <w:b/>
+          <w:bCs/>
+          <w:lang w:val="es-CO"/>
+        </w:rPr>
+        <w:t xml:space="preserve">Ediciones simultáneas:</w:t>
+      </w:r>
+      <w:r>
+        <w:rPr>
+          <w:lang w:val="es-CO"/>
+        </w:rPr>
+        <w:t xml:space="preserve"> la pantalla muestra el cambio rechazado junto a la versión nueva para que se vuelva a aplicar; mientras recalcula, dice «recalculando».</w:t>
+      </w:r>
+    </w:p>
+    <w:p>
+      <w:pPr>
+        <w:numPr>
+          <w:ilvl w:val="0"/>
+          <w:numId w:val="2"/>
+        </w:numPr>
+        <w:ind w:hanging="270"/>
+      </w:pPr>
+      <w:r>
+        <w:rPr>
+          <w:b/>
+          <w:bCs/>
+          <w:lang w:val="es-CO"/>
+        </w:rPr>
+        <w:t xml:space="preserve">Para probar la exportación:</w:t>
+      </w:r>
+      <w:r>
+        <w:rPr>
+          <w:lang w:val="es-CO"/>
+        </w:rPr>
+        <w:t xml:space="preserve"> el dueño consigue un XER pequeño de cada versión de P6 que se vaya a soportar.</w:t>
       </w:r>
     </w:p>
     <w:sectPr>

</xml_diff>

<commit_message>
docs: bitácora, la migración 0005 queda en el árbol; el 07 con las decisiones del 20 y el 00 con las cifras de la 0005
Co-Authored-By: Claude Opus 5.5 <noreply@anthropic.com>
Claude-Session: https://claude.ai/code/session_01QkUecTxXWHcSEBT7CByXQu
</commit_message>
<xml_diff>
--- a/docs/07 - Alcance despues del MVP.docx
+++ b/docs/07 - Alcance despues del MVP.docx
@@ -6104,13 +6104,13 @@
           <w:b/>
           <w:lang w:val="es-CO"/>
         </w:rPr>
-        <w:t xml:space="preserve">Estado: requisitos definidos (19 de octubre de 2026).</w:t>
-      </w:r>
-      <w:r>
-        <w:rPr>
-          <w:lang w:val="es-CO"/>
-        </w:rPr>
-        <w:t xml:space="preserve"> Todo lo que sigue salió de preguntas y respuestas con el dueño del producto. Las cuatro dudas que seguían abiertas se resolvieron el 16 de octubre, y la revisión y los vacíos encontrados el 19 de octubre quedaron incorporados. Lo que falta confirmar está en la sección 6.9.</w:t>
+        <w:t xml:space="preserve">Estado: en construcción (20 de octubre de 2026).</w:t>
+      </w:r>
+      <w:r>
+        <w:rPr>
+          <w:lang w:val="es-CO"/>
+        </w:rPr>
+        <w:t xml:space="preserve"> Todo lo que sigue salió de preguntas y respuestas con el dueño del producto: las dudas se resolvieron el 16, el 19 y el 20 de octubre (sección 6.9). La base está escrita en las migraciones 0004 y 0005; siguen el contrato de la API, la API y la pantalla.</w:t>
       </w:r>
     </w:p>
     <w:p>
@@ -10139,7 +10139,7 @@
         <w:t xml:space="preserve">Toda tabla lleva tenant_id con RLS forzada y entra por migración. </w:t>
       </w:r>
       <w:r>
-        <w:t xml:space="preserve">Los nombres son provisionales hasta escribir la migración.</w:t>
+        <w:t xml:space="preserve">Los nombres son los de las migraciones 0004 (calendarios y festivos) y 0005 (el cronograma).</w:t>
       </w:r>
     </w:p>
     <w:tbl>
@@ -10504,7 +10504,7 @@
                 <w:sz w:val="18"/>
                 <w:lang w:val="es-CO"/>
               </w:rPr>
-              <w:t xml:space="preserve">Calendarios de la empresa, la copia de cada proyecto y su calendario corrido (24 h todos los días, 1 día = 24 h); tramos por día de la semana, varios por día; excepciones con la misma forma. El calendario guarda de qué lista salieron sus festivos y hasta qué año llegan.</w:t>
+              <w:t xml:space="preserve">Calendarios de la empresa, la copia de cada proyecto y su calendario corrido (24 h todos los días, 1 día = 24 h); tramos por día de la semana, varios por día; excepciones con la misma forma. El calendario guarda de qué lista salieron sus festivos y hasta qué año llegan, y su tipo: de la empresa, de la obra o corrido; los dos últimos, con el cronograma al que pertenecen.</w:t>
             </w:r>
           </w:p>
         </w:tc>
@@ -10621,7 +10621,7 @@
                 <w:sz w:val="18"/>
                 <w:lang w:val="es-CO"/>
               </w:rPr>
-              <w:t xml:space="preserve">Uno por presupuesto: fecha de inicio, calendario del proyecto, calendario corrido. version sube con cada guardado y decide el rechazo por edición simultánea; calculado_version y calculado_revision dicen con qué entradas y con qué revisión del presupuesto se hizo el último cálculo. Escribir resultados no sube version.</w:t>
+              <w:t xml:space="preserve">Uno por presupuesto: fecha de inicio y sus dos calendarios, el de la obra y el corrido, que cuelgan de él. version sube con cada guardado y decide el rechazo por edición simultánea; calculado_version y calculado_revision dicen con qué entradas y con qué revisión del presupuesto se hizo el último cálculo. Escribir resultados no sube version.</w:t>
             </w:r>
           </w:p>
         </w:tc>
@@ -10679,7 +10679,7 @@
                 <w:sz w:val="18"/>
                 <w:lang w:val="es-CO"/>
               </w:rPr>
-              <w:t xml:space="preserve">Subgrupos de «Hitos y trámites».</w:t>
+              <w:t xml:space="preserve">Subgrupos de «Hitos y trámites», de un solo nivel.</w:t>
             </w:r>
           </w:p>
         </w:tc>
@@ -10738,7 +10738,7 @@
                 <w:sz w:val="18"/>
                 <w:lang w:val="es-CO"/>
               </w:rPr>
-              <w:t xml:space="preserve">Ítem, hito de inicio, hito de fin, actividad sin costo o administración; ítem del presupuesto (se anula solo esa columna si el ítem se borra: así se sabe que «ya no está en el presupuesto»), nombre, código y orden, subgrupo, calendario (solo esperas), cuadrillas, duración manual en horas, restricción principal y secundaria (tipo y fecha). Son solo las entradas.</w:t>
+              <w:t xml:space="preserve">Ítem, hito de inicio, hito de fin, actividad sin costo o administración; ítem del presupuesto (se anula solo esa columna si el ítem se borra: así se sabe que «ya no está en el presupuesto»), nombre, código y orden, subgrupo, si usa el corrido (solo esperas), cuadrillas, duración manual en horas, restricción principal y secundaria (tipo y fecha). Son solo las entradas.</w:t>
             </w:r>
           </w:p>
         </w:tc>
@@ -12194,7 +12194,7 @@
         <w:rPr>
           <w:lang w:val="es-CO"/>
         </w:rPr>
-        <w:t xml:space="preserve"> quedan registrados crear el cronograma, guardar o reemplazar una línea base, cambiar de calendario y cambiar la fecha de inicio.</w:t>
+        <w:t xml:space="preserve"> quedan registrados crear el cronograma, guardar, reemplazar o eliminar una línea base, cambiar de calendario y cambiar la fecha de inicio.</w:t>
       </w:r>
     </w:p>
     <w:p>
@@ -12603,6 +12603,230 @@
           <w:lang w:val="es-CO"/>
         </w:rPr>
         <w:t xml:space="preserve"> el dueño consigue un XER pequeño de cada versión de P6 que se vaya a soportar.</w:t>
+      </w:r>
+    </w:p>
+    <w:p>
+      <w:pPr>
+        <w:numPr>
+          <w:ilvl w:val="0"/>
+          <w:numId w:val="2"/>
+        </w:numPr>
+        <w:ind w:hanging="270"/>
+      </w:pPr>
+      <w:r>
+        <w:rPr>
+          <w:b/>
+          <w:bCs/>
+          <w:lang w:val="es-CO"/>
+        </w:rPr>
+        <w:t xml:space="preserve">Decisiones del 20 de octubre de 2026 (al escribir la migración 0005):</w:t>
+      </w:r>
+    </w:p>
+    <w:p>
+      <w:pPr>
+        <w:numPr>
+          <w:ilvl w:val="0"/>
+          <w:numId w:val="2"/>
+        </w:numPr>
+        <w:ind w:hanging="270"/>
+      </w:pPr>
+      <w:r>
+        <w:rPr>
+          <w:b/>
+          <w:bCs/>
+          <w:lang w:val="es-CO"/>
+        </w:rPr>
+        <w:t xml:space="preserve">Ítem que sale del presupuesto:</w:t>
+      </w:r>
+      <w:r>
+        <w:rPr>
+          <w:lang w:val="es-CO"/>
+        </w:rPr>
+        <w:t xml:space="preserve"> su actividad queda con el código antepuesto de «X-» (X-1.3; si ya hay una, X-1.3-2), para que el ítem que tome su número no choque: P6 exige códigos únicos.</w:t>
+      </w:r>
+    </w:p>
+    <w:p>
+      <w:pPr>
+        <w:numPr>
+          <w:ilvl w:val="0"/>
+          <w:numId w:val="2"/>
+        </w:numPr>
+        <w:ind w:hanging="270"/>
+      </w:pPr>
+      <w:r>
+        <w:rPr>
+          <w:b/>
+          <w:bCs/>
+          <w:lang w:val="es-CO"/>
+        </w:rPr>
+        <w:t xml:space="preserve">Códigos:</w:t>
+      </w:r>
+      <w:r>
+        <w:rPr>
+          <w:lang w:val="es-CO"/>
+        </w:rPr>
+        <w:t xml:space="preserve"> los de hitos, trámites y administración llevan letras; un código solo de cifras y puntos es el de un ítem del presupuesto. El código y el nombre de una actividad del presupuesto son los de su ítem y no se escriben a mano.</w:t>
+      </w:r>
+    </w:p>
+    <w:p>
+      <w:pPr>
+        <w:numPr>
+          <w:ilvl w:val="0"/>
+          <w:numId w:val="2"/>
+        </w:numPr>
+        <w:ind w:hanging="270"/>
+      </w:pPr>
+      <w:r>
+        <w:rPr>
+          <w:b/>
+          <w:bCs/>
+          <w:lang w:val="es-CO"/>
+        </w:rPr>
+        <w:t xml:space="preserve">Subgrupos de «Hitos y trámites»:</w:t>
+      </w:r>
+      <w:r>
+        <w:rPr>
+          <w:lang w:val="es-CO"/>
+        </w:rPr>
+        <w:t xml:space="preserve"> de un solo nivel. Un subgrupo con actividades no se elimina: se vacía antes.</w:t>
+      </w:r>
+    </w:p>
+    <w:p>
+      <w:pPr>
+        <w:numPr>
+          <w:ilvl w:val="0"/>
+          <w:numId w:val="2"/>
+        </w:numPr>
+        <w:ind w:hanging="270"/>
+      </w:pPr>
+      <w:r>
+        <w:rPr>
+          <w:b/>
+          <w:bCs/>
+          <w:lang w:val="es-CO"/>
+        </w:rPr>
+        <w:t xml:space="preserve">Hitos de inicio y fin del proyecto:</w:t>
+      </w:r>
+      <w:r>
+        <w:rPr>
+          <w:lang w:val="es-CO"/>
+        </w:rPr>
+        <w:t xml:space="preserve"> hitos como cualquier otro: se renombran, se mueven y se eliminan.</w:t>
+      </w:r>
+    </w:p>
+    <w:p>
+      <w:pPr>
+        <w:numPr>
+          <w:ilvl w:val="0"/>
+          <w:numId w:val="2"/>
+        </w:numPr>
+        <w:ind w:hanging="270"/>
+      </w:pPr>
+      <w:r>
+        <w:rPr>
+          <w:b/>
+          <w:bCs/>
+          <w:lang w:val="es-CO"/>
+        </w:rPr>
+        <w:t xml:space="preserve">Tarea de administración:</w:t>
+      </w:r>
+      <w:r>
+        <w:rPr>
+          <w:lang w:val="es-CO"/>
+        </w:rPr>
+        <w:t xml:space="preserve"> nace con el código ADM, que se puede cambiar. No se elimina y no lleva restricciones ni relaciones.</w:t>
+      </w:r>
+    </w:p>
+    <w:p>
+      <w:pPr>
+        <w:numPr>
+          <w:ilvl w:val="0"/>
+          <w:numId w:val="2"/>
+        </w:numPr>
+        <w:ind w:hanging="270"/>
+      </w:pPr>
+      <w:r>
+        <w:rPr>
+          <w:b/>
+          <w:bCs/>
+          <w:lang w:val="es-CO"/>
+        </w:rPr>
+        <w:t xml:space="preserve">Líneas base:</w:t>
+      </w:r>
+      <w:r>
+        <w:rPr>
+          <w:lang w:val="es-CO"/>
+        </w:rPr>
+        <w:t xml:space="preserve"> se eliminan solo con el presupuesto Activo, como se guardan, con confirmación; queda en el historial.</w:t>
+      </w:r>
+    </w:p>
+    <w:p>
+      <w:pPr>
+        <w:numPr>
+          <w:ilvl w:val="0"/>
+          <w:numId w:val="2"/>
+        </w:numPr>
+        <w:ind w:hanging="270"/>
+      </w:pPr>
+      <w:r>
+        <w:rPr>
+          <w:b/>
+          <w:bCs/>
+          <w:lang w:val="es-CO"/>
+        </w:rPr>
+        <w:t xml:space="preserve">Duplicar:</w:t>
+      </w:r>
+      <w:r>
+        <w:rPr>
+          <w:lang w:val="es-CO"/>
+        </w:rPr>
+        <w:t xml:space="preserve"> las actividades que ya no están en el presupuesto pasan a la copia tal cual, con sus relaciones.</w:t>
+      </w:r>
+    </w:p>
+    <w:p>
+      <w:pPr>
+        <w:numPr>
+          <w:ilvl w:val="0"/>
+          <w:numId w:val="2"/>
+        </w:numPr>
+        <w:ind w:hanging="270"/>
+      </w:pPr>
+      <w:r>
+        <w:rPr>
+          <w:b/>
+          <w:bCs/>
+          <w:lang w:val="es-CO"/>
+        </w:rPr>
+        <w:t xml:space="preserve">Cambio de estado del presupuesto:</w:t>
+      </w:r>
+      <w:r>
+        <w:rPr>
+          <w:lang w:val="es-CO"/>
+        </w:rPr>
+        <w:t xml:space="preserve"> activar, cerrar o reabrir mientras alguien edita el cronograma le da el mismo rechazo de «otra persona cambió el cronograma», con la versión nueva.</w:t>
+      </w:r>
+    </w:p>
+    <w:p>
+      <w:pPr>
+        <w:numPr>
+          <w:ilvl w:val="0"/>
+          <w:numId w:val="2"/>
+        </w:numPr>
+        <w:ind w:hanging="270"/>
+      </w:pPr>
+      <w:r>
+        <w:rPr>
+          <w:b/>
+          <w:bCs/>
+          <w:lang w:val="es-CO"/>
+        </w:rPr>
+        <w:t xml:space="preserve">Presupuesto Cerrado con el cronograma desactualizado:</w:t>
+      </w:r>
+      <w:r>
+        <w:rPr>
+          <w:lang w:val="es-CO"/>
+        </w:rPr>
+        <w:t xml:space="preserve"> el recálculo igual crea la actividad de un ítem que faltaba y refresca número, nombre y orden desde el presupuesto. Eso es ponerse al día, no editar; todo lo demás sigue de solo lectura (RN-34).</w:t>
       </w:r>
     </w:p>
     <w:sectPr>

</xml_diff>

<commit_message>
docs: CONTRATO §19, programación de obra; bitácora con la 0006 en el árbol; el 07 con la D-93
Co-Authored-By: Claude Opus 5.5 <noreply@anthropic.com>
Claude-Session: https://claude.ai/code/session_01QkUecTxXWHcSEBT7CByXQu
</commit_message>
<xml_diff>
--- a/docs/07 - Alcance despues del MVP.docx
+++ b/docs/07 - Alcance despues del MVP.docx
@@ -6204,7 +6204,7 @@
           <w:sz w:val="20"/>
           <w:lang w:val="es-CO"/>
         </w:rPr>
-        <w:t xml:space="preserve"> Lee cantidades, rendimientos y costos y nunca escribe en ellos: si la obra se alarga y la administración debería subir, lo avisa, y el ingeniero decide.</w:t>
+        <w:t xml:space="preserve"> Lee cantidades, rendimientos y costos y nunca escribe en ellos: si la obra se alarga más que la línea base que se está mirando y la administración debería subir, lo avisa, y el ingeniero decide.</w:t>
       </w:r>
     </w:p>
     <w:p>
@@ -10621,7 +10621,7 @@
                 <w:sz w:val="18"/>
                 <w:lang w:val="es-CO"/>
               </w:rPr>
-              <w:t xml:space="preserve">Uno por presupuesto: fecha de inicio y sus dos calendarios, el de la obra y el corrido, que cuelgan de él. version sube con cada guardado y decide el rechazo por edición simultánea; calculado_version y calculado_revision dicen con qué entradas y con qué revisión del presupuesto se hizo el último cálculo. Escribir resultados no sube version.</w:t>
+              <w:t xml:space="preserve">Uno por presupuesto: fecha de inicio y sus dos calendarios, el de la obra y el corrido, que cuelgan de él. version sube con cada guardado y decide el rechazo por edición simultánea; calculado_version y calculado_revision dicen con qué entradas y con qué revisión del presupuesto se hizo el último cálculo. Escribir resultados no sube version. aviso_presupuesto guarda qué cambió en el presupuesto hasta que alguien cierra la franja (D-93).</w:t>
             </w:r>
           </w:p>
         </w:tc>
@@ -11736,6 +11736,65 @@
           </w:p>
         </w:tc>
       </w:tr>
+      <w:tr>
+        <w:trPr>
+          <w:trHeight w:val="836"/>
+        </w:trPr>
+        <w:tc>
+          <w:tcPr>
+            <w:tcW w:w="5011" w:type="dxa"/>
+            <w:tcBorders>
+              <w:top w:val="single" w:sz="2" w:space="0" w:color="E4E8EC"/>
+              <w:left w:val="nil"/>
+              <w:bottom w:val="single" w:sz="2" w:space="0" w:color="E4E8EC"/>
+              <w:right w:val="nil"/>
+            </w:tcBorders>
+          </w:tcPr>
+          <w:p>
+            <w:pPr>
+              <w:spacing w:after="0" w:line="259" w:lineRule="auto"/>
+              <w:ind w:left="1111" w:right="106" w:hanging="999"/>
+              <w:rPr>
+                <w:lang w:val="es-CO"/>
+              </w:rPr>
+            </w:pPr>
+            <w:r>
+              <w:rPr>
+                <w:sz w:val="18"/>
+                <w:lang w:val="es-CO"/>
+              </w:rPr>
+              <w:t xml:space="preserve">D-93 El aviso de que el presupuesto cambió se guarda en el cronograma, con lo que cambió.</w:t>
+            </w:r>
+          </w:p>
+        </w:tc>
+        <w:tc>
+          <w:tcPr>
+            <w:tcW w:w="4348" w:type="dxa"/>
+            <w:tcBorders>
+              <w:top w:val="single" w:sz="2" w:space="0" w:color="E4E8EC"/>
+              <w:left w:val="nil"/>
+              <w:bottom w:val="single" w:sz="2" w:space="0" w:color="E4E8EC"/>
+              <w:right w:val="nil"/>
+            </w:tcBorders>
+          </w:tcPr>
+          <w:p>
+            <w:pPr>
+              <w:spacing w:after="0" w:line="259" w:lineRule="auto"/>
+              <w:ind w:left="0" w:firstLine="0"/>
+              <w:rPr>
+                <w:lang w:val="es-CO"/>
+              </w:rPr>
+            </w:pPr>
+            <w:r>
+              <w:rPr>
+                <w:sz w:val="18"/>
+                <w:lang w:val="es-CO"/>
+              </w:rPr>
+              <w:t xml:space="preserve">El cronograma se recalcula al abrirlo (D-91): sin guardar el aviso, solo lo vería quien lo abrió primero. Lo que cambió no se puede reconstruir después, porque la base no guarda las duraciones de antes.</w:t>
+            </w:r>
+          </w:p>
+        </w:tc>
+      </w:tr>
     </w:tbl>
     <w:p>
       <w:pPr>
@@ -12303,13 +12362,13 @@
           <w:bCs/>
           <w:lang w:val="es-CO"/>
         </w:rPr>
-        <w:t xml:space="preserve">Por definir al construir:</w:t>
-      </w:r>
-      <w:r>
-        <w:rPr>
-          <w:lang w:val="es-CO"/>
-        </w:rPr>
-        <w:t xml:space="preserve"> el formato del archivo con el que una empresa carga su propia lista de festivos.</w:t>
+        <w:t xml:space="preserve">Festivos propios:</w:t>
+      </w:r>
+      <w:r>
+        <w:rPr>
+          <w:lang w:val="es-CO"/>
+        </w:rPr>
+        <w:t xml:space="preserve"> resuelto el 20 de octubre de 2026 (ver abajo).</w:t>
       </w:r>
     </w:p>
     <w:p>
@@ -12827,6 +12886,92 @@
           <w:lang w:val="es-CO"/>
         </w:rPr>
         <w:t xml:space="preserve"> el recálculo igual crea la actividad de un ítem que faltaba y refresca número, nombre y orden desde el presupuesto. Eso es ponerse al día, no editar; todo lo demás sigue de solo lectura (RN-34).</w:t>
+      </w:r>
+    </w:p>
+    <w:p>
+      <w:pPr>
+        <w:numPr>
+          <w:ilvl w:val="0"/>
+          <w:numId w:val="2"/>
+        </w:numPr>
+        <w:ind w:hanging="270"/>
+      </w:pPr>
+      <w:r>
+        <w:rPr>
+          <w:b/>
+          <w:bCs/>
+          <w:lang w:val="es-CO"/>
+        </w:rPr>
+        <w:t xml:space="preserve">Decisiones del 20 de octubre de 2026 (al escribir el contrato de la API):</w:t>
+      </w:r>
+    </w:p>
+    <w:p>
+      <w:pPr>
+        <w:numPr>
+          <w:ilvl w:val="0"/>
+          <w:numId w:val="2"/>
+        </w:numPr>
+        <w:ind w:hanging="270"/>
+      </w:pPr>
+      <w:r>
+        <w:rPr>
+          <w:b/>
+          <w:bCs/>
+          <w:lang w:val="es-CO"/>
+        </w:rPr>
+        <w:t xml:space="preserve">La franja «el presupuesto cambió»:</w:t>
+      </w:r>
+      <w:r>
+        <w:rPr>
+          <w:lang w:val="es-CO"/>
+        </w:rPr>
+        <w:t xml:space="preserve"> la ven todos los que abren el cronograma hasta que alguien con permiso de editar la cierra o guarda un cambio en el cronograma. Dice qué cambió: actividades que entraron o salieron, duraciones que se movieron y el fin del proyecto antes y después (D-93).</w:t>
+      </w:r>
+    </w:p>
+    <w:p>
+      <w:pPr>
+        <w:numPr>
+          <w:ilvl w:val="0"/>
+          <w:numId w:val="2"/>
+        </w:numPr>
+        <w:ind w:hanging="270"/>
+      </w:pPr>
+      <w:r>
+        <w:rPr>
+          <w:b/>
+          <w:bCs/>
+          <w:lang w:val="es-CO"/>
+        </w:rPr>
+        <w:t xml:space="preserve">Aviso de la administración:</w:t>
+      </w:r>
+      <w:r>
+        <w:rPr>
+          <w:lang w:val="es-CO"/>
+        </w:rPr>
+        <w:t xml:space="preserve"> compara el fin del proyecto con el de la línea base que se está mirando y dice cuántos días de más lleva la obra; la administración del presupuesto no cambia sola. Sin línea base a la vista, no hay aviso.</w:t>
+      </w:r>
+    </w:p>
+    <w:p>
+      <w:pPr>
+        <w:numPr>
+          <w:ilvl w:val="0"/>
+          <w:numId w:val="2"/>
+        </w:numPr>
+        <w:ind w:hanging="270"/>
+      </w:pPr>
+      <w:r>
+        <w:rPr>
+          <w:b/>
+          <w:bCs/>
+          <w:lang w:val="es-CO"/>
+        </w:rPr>
+        <w:t xml:space="preserve">Festivos propios:</w:t>
+      </w:r>
+      <w:r>
+        <w:rPr>
+          <w:lang w:val="es-CO"/>
+        </w:rPr>
+        <w:t xml:space="preserve"> una empresa carga su lista con una plantilla de Excel de dos columnas, fecha y nombre, como la importación de APU, y además la edita a mano.</w:t>
       </w:r>
     </w:p>
     <w:sectPr>

</xml_diff>